<commit_message>
docs: clarify PostgreSQL pgvector requirement and cost context
</commit_message>
<xml_diff>
--- a/SEQUOR_REPORT.docx
+++ b/SEQUOR_REPORT.docx
@@ -5624,6 +5624,32 @@
     </w:p>
     <w:p>
       <w:pPr>
+        <w:spacing w:after="0" w:before="0"/>
+      </w:pPr>
+      <w:r>
+        <w:rPr>
+          <w:rFonts w:ascii="Times New Roman" w:hAnsi="Times New Roman"/>
+          <w:b/>
+          <w:sz w:val="24"/>
+        </w:rPr>
+        <w:t>Why PostgreSQL + pgvector is required:</w:t>
+      </w:r>
+      <w:r>
+        <w:rPr>
+          <w:rFonts w:ascii="Times New Roman" w:hAnsi="Times New Roman"/>
+          <w:b w:val="0"/>
+          <w:sz w:val="24"/>
+        </w:rPr>
+        <w:t xml:space="preserve"> SQLite cannot be used because it has no vector search capability. The AI pipeline uses hybrid retrieval — 70% pgvector cosine similarity + 30% BM25 keyword scoring — to find the most relevant document passages. This requires pgvector. Managed PostgreSQL with pgvector is available from Supabase, Neon, or Render from ~SGD 5/month for typical small-business usage. This cost is separate from Sequor licensing.</w:t>
+      </w:r>
+    </w:p>
+    <w:p>
+      <w:pPr>
+        <w:spacing w:after="0" w:before="0"/>
+      </w:pPr>
+    </w:p>
+    <w:p>
+      <w:pPr>
         <w:pStyle w:val="Heading2"/>
         <w:spacing w:after="80" w:before="80"/>
       </w:pPr>
@@ -5702,7 +5728,7 @@
                 <w:b/>
                 <w:sz w:val="24"/>
               </w:rPr>
-              <w:t>Free Tier?</w:t>
+              <w:t>Cost</w:t>
             </w:r>
           </w:p>
         </w:tc>
@@ -5755,7 +5781,7 @@
                 <w:rFonts w:ascii="Times New Roman" w:hAnsi="Times New Roman"/>
                 <w:sz w:val="24"/>
               </w:rPr>
-              <w:t>Yes (self-hosted or Supabase)</w:t>
+              <w:t>~SGD 5–15/month (managed)</w:t>
             </w:r>
           </w:p>
         </w:tc>

</xml_diff>

<commit_message>
docs: add honest weakpoints section, formal conclusion, and next steps
</commit_message>
<xml_diff>
--- a/SEQUOR_REPORT.docx
+++ b/SEQUOR_REPORT.docx
@@ -8151,7 +8151,305 @@
           <w:rFonts w:ascii="Times New Roman" w:hAnsi="Times New Roman"/>
           <w:color w:val="000000"/>
         </w:rPr>
-        <w:t>7. Known Gaps — Acceptable with Mitigations</w:t>
+        <w:t>7. Honest Assessment — Product Weak Points</w:t>
+      </w:r>
+    </w:p>
+    <w:p>
+      <w:pPr>
+        <w:spacing w:after="0" w:before="0"/>
+      </w:pPr>
+    </w:p>
+    <w:p>
+      <w:pPr>
+        <w:spacing w:after="0" w:before="0"/>
+      </w:pPr>
+      <w:r>
+        <w:rPr>
+          <w:rFonts w:ascii="Times New Roman" w:hAnsi="Times New Roman"/>
+          <w:b w:val="0"/>
+          <w:sz w:val="24"/>
+        </w:rPr>
+        <w:t>Every product has honest weak points. Listing them builds credibility. Silence on weaknesses destroys it when users discover them.</w:t>
+      </w:r>
+    </w:p>
+    <w:p>
+      <w:pPr>
+        <w:spacing w:after="0" w:before="0"/>
+      </w:pPr>
+    </w:p>
+    <w:p>
+      <w:pPr>
+        <w:pStyle w:val="Heading2"/>
+        <w:spacing w:after="80" w:before="80"/>
+      </w:pPr>
+      <w:r>
+        <w:rPr>
+          <w:rFonts w:ascii="Times New Roman" w:hAnsi="Times New Roman"/>
+          <w:color w:val="000000"/>
+        </w:rPr>
+        <w:t>Learning Loop Cold Start</w:t>
+      </w:r>
+    </w:p>
+    <w:p>
+      <w:pPr>
+        <w:spacing w:after="0" w:before="0"/>
+      </w:pPr>
+    </w:p>
+    <w:p>
+      <w:pPr>
+        <w:spacing w:after="0" w:before="0"/>
+      </w:pPr>
+      <w:r>
+        <w:rPr>
+          <w:rFonts w:ascii="Times New Roman" w:hAnsi="Times New Roman"/>
+          <w:b w:val="0"/>
+          <w:sz w:val="24"/>
+        </w:rPr>
+        <w:t>The learning loop improves auto-replies by capturing human answers from escalation resolutions. New tenants have zero escalation history — the learning loop has nothing to learn from for the first weeks of operation. During this period, auto-reply quality depends entirely on the quality and coverage of uploaded documents. **Mitigation:** Upload comprehensive documents before going live. Add more documents over time as new query types arrive.</w:t>
+      </w:r>
+    </w:p>
+    <w:p>
+      <w:pPr>
+        <w:spacing w:after="0" w:before="0"/>
+      </w:pPr>
+    </w:p>
+    <w:p>
+      <w:pPr>
+        <w:pStyle w:val="Heading2"/>
+        <w:spacing w:after="80" w:before="80"/>
+      </w:pPr>
+      <w:r>
+        <w:rPr>
+          <w:rFonts w:ascii="Times New Roman" w:hAnsi="Times New Roman"/>
+          <w:color w:val="000000"/>
+        </w:rPr>
+        <w:t>WhatsApp Template Approval Delay</w:t>
+      </w:r>
+    </w:p>
+    <w:p>
+      <w:pPr>
+        <w:spacing w:after="0" w:before="0"/>
+      </w:pPr>
+    </w:p>
+    <w:p>
+      <w:pPr>
+        <w:spacing w:after="0" w:before="0"/>
+      </w:pPr>
+      <w:r>
+        <w:rPr>
+          <w:rFonts w:ascii="Times New Roman" w:hAnsi="Times New Roman"/>
+          <w:b w:val="0"/>
+          <w:sz w:val="24"/>
+        </w:rPr>
+        <w:t>Meta's WhatsApp Cloud API requires pre-approved template messages for any outbound message sent outside the 24-hour session window. Template approval by Meta typically takes **24–72 hours** but can take longer. During this window, auto-replies via WhatsApp are blocked for contacts who have not messaged within the past 24 hours. **Mitigation:** Initiate the WhatsApp Business account verification and template submission early in the onboarding process, before launch.</w:t>
+      </w:r>
+    </w:p>
+    <w:p>
+      <w:pPr>
+        <w:spacing w:after="0" w:before="0"/>
+      </w:pPr>
+    </w:p>
+    <w:p>
+      <w:pPr>
+        <w:pStyle w:val="Heading2"/>
+        <w:spacing w:after="80" w:before="80"/>
+      </w:pPr>
+      <w:r>
+        <w:rPr>
+          <w:rFonts w:ascii="Times New Roman" w:hAnsi="Times New Roman"/>
+          <w:color w:val="000000"/>
+        </w:rPr>
+        <w:t>OpenAI Embedding Costs at Scale</w:t>
+      </w:r>
+    </w:p>
+    <w:p>
+      <w:pPr>
+        <w:spacing w:after="0" w:before="0"/>
+      </w:pPr>
+    </w:p>
+    <w:p>
+      <w:pPr>
+        <w:spacing w:after="0" w:before="0"/>
+      </w:pPr>
+      <w:r>
+        <w:rPr>
+          <w:rFonts w:ascii="Times New Roman" w:hAnsi="Times New Roman"/>
+          <w:b w:val="0"/>
+          <w:sz w:val="24"/>
+        </w:rPr>
+        <w:t>When `OPENAI_API_KEY` is set, document ingestion and every inbound query generates embedding calls to OpenAI. At `text-embedding-3-small` pricing (approximately USD $0.02 per 1M tokens), costs are low for small document volumes. At 1,000 documents × 10 chunks × 256 tokens per chunk = approximately 2.5M tokens per ingestion. Real-time query embedding adds ongoing per-query cost. **Mitigation:** Monitor OpenAI usage via the OpenAI dashboard. Consider BM25-only mode (without OpenAI key) for cost-sensitive deployments.</w:t>
+      </w:r>
+    </w:p>
+    <w:p>
+      <w:pPr>
+        <w:spacing w:after="0" w:before="0"/>
+      </w:pPr>
+    </w:p>
+    <w:p>
+      <w:pPr>
+        <w:pStyle w:val="Heading2"/>
+        <w:spacing w:after="80" w:before="80"/>
+      </w:pPr>
+      <w:r>
+        <w:rPr>
+          <w:rFonts w:ascii="Times New Roman" w:hAnsi="Times New Roman"/>
+          <w:color w:val="000000"/>
+        </w:rPr>
+        <w:t>No Uptime SLA on Free and Starter Plans</w:t>
+      </w:r>
+    </w:p>
+    <w:p>
+      <w:pPr>
+        <w:spacing w:after="0" w:before="0"/>
+      </w:pPr>
+    </w:p>
+    <w:p>
+      <w:pPr>
+        <w:spacing w:after="0" w:before="0"/>
+      </w:pPr>
+      <w:r>
+        <w:rPr>
+          <w:rFonts w:ascii="Times New Roman" w:hAnsi="Times New Roman"/>
+          <w:b w:val="0"/>
+          <w:sz w:val="24"/>
+        </w:rPr>
+        <w:t>Sequor does not offer an uptime guarantee on the Free or Starter plans. There is no status page or incident notification system. If the application experiences downtime, users are not proactively notified. **Mitigation:** Use a self-hosted Docker deployment with your own monitoring for production workloads requiring uptime guarantees.</w:t>
+      </w:r>
+    </w:p>
+    <w:p>
+      <w:pPr>
+        <w:spacing w:after="0" w:before="0"/>
+      </w:pPr>
+    </w:p>
+    <w:p>
+      <w:pPr>
+        <w:pStyle w:val="Heading2"/>
+        <w:spacing w:after="80" w:before="80"/>
+      </w:pPr>
+      <w:r>
+        <w:rPr>
+          <w:rFonts w:ascii="Times New Roman" w:hAnsi="Times New Roman"/>
+          <w:color w:val="000000"/>
+        </w:rPr>
+        <w:t>No Escalation Delivery Confirmation</w:t>
+      </w:r>
+    </w:p>
+    <w:p>
+      <w:pPr>
+        <w:spacing w:after="0" w:before="0"/>
+      </w:pPr>
+    </w:p>
+    <w:p>
+      <w:pPr>
+        <w:spacing w:after="0" w:before="0"/>
+      </w:pPr>
+      <w:r>
+        <w:rPr>
+          <w:rFonts w:ascii="Times New Roman" w:hAnsi="Times New Roman"/>
+          <w:b w:val="0"/>
+          <w:sz w:val="24"/>
+        </w:rPr>
+        <w:t>When an escalation is created, the backup contact receives an email. There is no read receipt, delivery confirmation, or escalation if the email is silently blocked by a spam filter or rejected by the mail server. **Mitigation:** Ensure the escalation contact's email domain has proper SPF/DKIM/DMARC records configured. Add a secondary escalation contact as a fallback.</w:t>
+      </w:r>
+    </w:p>
+    <w:p>
+      <w:pPr>
+        <w:spacing w:after="0" w:before="0"/>
+      </w:pPr>
+    </w:p>
+    <w:p>
+      <w:pPr>
+        <w:pStyle w:val="Heading2"/>
+        <w:spacing w:after="80" w:before="80"/>
+      </w:pPr>
+      <w:r>
+        <w:rPr>
+          <w:rFonts w:ascii="Times New Roman" w:hAnsi="Times New Roman"/>
+          <w:color w:val="000000"/>
+        </w:rPr>
+        <w:t>Large File Processing on Vercel Free Tier</w:t>
+      </w:r>
+    </w:p>
+    <w:p>
+      <w:pPr>
+        <w:spacing w:after="0" w:before="0"/>
+      </w:pPr>
+    </w:p>
+    <w:p>
+      <w:pPr>
+        <w:spacing w:after="0" w:before="0"/>
+      </w:pPr>
+      <w:r>
+        <w:rPr>
+          <w:rFonts w:ascii="Times New Roman" w:hAnsi="Times New Roman"/>
+          <w:b w:val="0"/>
+          <w:sz w:val="24"/>
+        </w:rPr>
+        <w:t>Vercel's serverless function timeout on the free tier is **10 seconds**. Large document uploads (near the 25MB limit, or documents with thousands of pages) may time out during parsing and embedding. **Mitigation:** For large document volumes, use self-hosting with the Docker image where no serverless timeout applies. Keep individual documents under 10MB for Vercel deployments.</w:t>
+      </w:r>
+    </w:p>
+    <w:p>
+      <w:pPr>
+        <w:spacing w:after="0" w:before="0"/>
+      </w:pPr>
+    </w:p>
+    <w:p>
+      <w:pPr>
+        <w:pStyle w:val="Heading2"/>
+        <w:spacing w:after="80" w:before="80"/>
+      </w:pPr>
+      <w:r>
+        <w:rPr>
+          <w:rFonts w:ascii="Times New Roman" w:hAnsi="Times New Roman"/>
+          <w:color w:val="000000"/>
+        </w:rPr>
+        <w:t>Document Quality Is the Ceiling</w:t>
+      </w:r>
+    </w:p>
+    <w:p>
+      <w:pPr>
+        <w:spacing w:after="0" w:before="0"/>
+      </w:pPr>
+    </w:p>
+    <w:p>
+      <w:pPr>
+        <w:spacing w:after="0" w:before="0"/>
+      </w:pPr>
+      <w:r>
+        <w:rPr>
+          <w:rFonts w:ascii="Times New Roman" w:hAnsi="Times New Roman"/>
+          <w:b w:val="0"/>
+          <w:sz w:val="24"/>
+        </w:rPr>
+        <w:t>Sequor's auto-reply quality is bounded by the quality, coverage, and freshness of the uploaded documents. If documents are incomplete, outdated, or poorly structured, the AI will produce incomplete or inaccurate replies. The learning loop can填补 some gaps over time, but only for escalation resolutions. **Mitigation:** Invest time in uploading high-quality, well-structured documents before going live. Review and update documents regularly. Assign accurate document types (FAQ, Policy, Price List) to aid retrieval.</w:t>
+      </w:r>
+    </w:p>
+    <w:p>
+      <w:pPr>
+        <w:spacing w:after="0" w:before="0"/>
+      </w:pPr>
+    </w:p>
+    <w:p>
+      <w:pPr>
+        <w:spacing w:after="120" w:before="120"/>
+      </w:pPr>
+    </w:p>
+    <w:p>
+      <w:pPr>
+        <w:spacing w:after="0" w:before="0"/>
+      </w:pPr>
+    </w:p>
+    <w:p>
+      <w:pPr>
+        <w:pStyle w:val="Heading1"/>
+        <w:spacing w:after="120" w:before="120"/>
+      </w:pPr>
+      <w:r>
+        <w:rPr>
+          <w:rFonts w:ascii="Times New Roman" w:hAnsi="Times New Roman"/>
+          <w:color w:val="000000"/>
+        </w:rPr>
+        <w:t>8. Known Gaps — Acceptable with Mitigations</w:t>
       </w:r>
     </w:p>
     <w:p>
@@ -8492,6 +8790,222 @@
         </w:tc>
       </w:tr>
     </w:tbl>
+    <w:p>
+      <w:pPr>
+        <w:spacing w:after="0" w:before="0"/>
+      </w:pPr>
+    </w:p>
+    <w:p>
+      <w:pPr>
+        <w:spacing w:after="120" w:before="120"/>
+      </w:pPr>
+    </w:p>
+    <w:p>
+      <w:pPr>
+        <w:spacing w:after="0" w:before="0"/>
+      </w:pPr>
+    </w:p>
+    <w:p>
+      <w:pPr>
+        <w:pStyle w:val="Heading1"/>
+        <w:spacing w:after="120" w:before="120"/>
+      </w:pPr>
+      <w:r>
+        <w:rPr>
+          <w:rFonts w:ascii="Times New Roman" w:hAnsi="Times New Roman"/>
+          <w:color w:val="000000"/>
+        </w:rPr>
+        <w:t>9. Conclusion</w:t>
+      </w:r>
+    </w:p>
+    <w:p>
+      <w:pPr>
+        <w:spacing w:after="0" w:before="0"/>
+      </w:pPr>
+    </w:p>
+    <w:p>
+      <w:pPr>
+        <w:spacing w:after="0" w:before="0"/>
+      </w:pPr>
+      <w:r>
+        <w:rPr>
+          <w:rFonts w:ascii="Times New Roman" w:hAnsi="Times New Roman"/>
+          <w:b w:val="0"/>
+          <w:sz w:val="24"/>
+        </w:rPr>
+        <w:t>Sequor addresses a real problem: small businesses losing customers to slow response times, at a cost that is a fraction of a virtual assistant. The core AI pipeline — classification, hybrid RAG retrieval, confidence-based routing, and the learning loop — is a solid technical foundation. The product handles both email and WhatsApp with a coherent escalation workflow that actually reduces operator burden rather than adding noise.</w:t>
+      </w:r>
+    </w:p>
+    <w:p>
+      <w:pPr>
+        <w:spacing w:after="0" w:before="0"/>
+      </w:pPr>
+    </w:p>
+    <w:p>
+      <w:pPr>
+        <w:spacing w:after="0" w:before="0"/>
+      </w:pPr>
+      <w:r>
+        <w:rPr>
+          <w:rFonts w:ascii="Times New Roman" w:hAnsi="Times New Roman"/>
+          <w:b w:val="0"/>
+          <w:sz w:val="24"/>
+        </w:rPr>
+        <w:t>The pre-launch checklist identifies 15 gaps that must be resolved before production traffic. Four are critical: the SLA scheduler not running, the JWT dev-secret fallback, incomplete PDPA erasure, and unenforced plan limits. None of these require architectural changes — they are wiring and boundary fixes. The codebase audit confirmed that the core AI logic is implemented, not stubbed.</w:t>
+      </w:r>
+    </w:p>
+    <w:p>
+      <w:pPr>
+        <w:spacing w:after="0" w:before="0"/>
+      </w:pPr>
+    </w:p>
+    <w:p>
+      <w:pPr>
+        <w:spacing w:after="0" w:before="0"/>
+      </w:pPr>
+      <w:r>
+        <w:rPr>
+          <w:rFonts w:ascii="Times New Roman" w:hAnsi="Times New Roman"/>
+          <w:b w:val="0"/>
+          <w:sz w:val="24"/>
+        </w:rPr>
+        <w:t>The product is honest about its limitations. The learning loop needs time. Document quality sets the ceiling. WhatsApp template approval takes days. These are not hidden failures — they are documented realities that set correct expectations for operators and stakeholders.</w:t>
+      </w:r>
+    </w:p>
+    <w:p>
+      <w:pPr>
+        <w:spacing w:after="0" w:before="0"/>
+      </w:pPr>
+    </w:p>
+    <w:p>
+      <w:pPr>
+        <w:spacing w:after="0" w:before="0"/>
+      </w:pPr>
+      <w:r>
+        <w:rPr>
+          <w:rFonts w:ascii="Times New Roman" w:hAnsi="Times New Roman"/>
+          <w:b w:val="0"/>
+          <w:sz w:val="24"/>
+        </w:rPr>
+        <w:t>Sequor is ready for a controlled pilot with a single early-adopter customer. It is not ready for mass market without resolving the four critical pre-launch items and at minimum the five high-priority items.</w:t>
+      </w:r>
+    </w:p>
+    <w:p>
+      <w:pPr>
+        <w:spacing w:after="0" w:before="0"/>
+      </w:pPr>
+    </w:p>
+    <w:p>
+      <w:pPr>
+        <w:spacing w:after="0" w:before="0"/>
+      </w:pPr>
+      <w:r>
+        <w:rPr>
+          <w:rFonts w:ascii="Times New Roman" w:hAnsi="Times New Roman"/>
+          <w:b/>
+          <w:sz w:val="24"/>
+        </w:rPr>
+        <w:t>Next steps:</w:t>
+      </w:r>
+    </w:p>
+    <w:p>
+      <w:pPr>
+        <w:spacing w:after="0" w:before="0"/>
+      </w:pPr>
+    </w:p>
+    <w:p>
+      <w:pPr>
+        <w:spacing w:after="0" w:before="0"/>
+      </w:pPr>
+      <w:r>
+        <w:rPr>
+          <w:rFonts w:ascii="Times New Roman" w:hAnsi="Times New Roman"/>
+          <w:b w:val="0"/>
+          <w:sz w:val="24"/>
+        </w:rPr>
+        <w:t>1. Resolve the 4 critical pre-launch items (Section 6).</w:t>
+      </w:r>
+    </w:p>
+    <w:p>
+      <w:pPr>
+        <w:spacing w:after="0" w:before="0"/>
+      </w:pPr>
+      <w:r>
+        <w:rPr>
+          <w:rFonts w:ascii="Times New Roman" w:hAnsi="Times New Roman"/>
+          <w:b w:val="0"/>
+          <w:sz w:val="24"/>
+        </w:rPr>
+        <w:t>2. Conduct a pilot with 1–3 willing early-adopter customers on the free plan.</w:t>
+      </w:r>
+    </w:p>
+    <w:p>
+      <w:pPr>
+        <w:spacing w:after="0" w:before="0"/>
+      </w:pPr>
+      <w:r>
+        <w:rPr>
+          <w:rFonts w:ascii="Times New Roman" w:hAnsi="Times New Roman"/>
+          <w:b w:val="0"/>
+          <w:sz w:val="24"/>
+        </w:rPr>
+        <w:t>3. Based on pilot feedback, resolve the 5 high-priority items.</w:t>
+      </w:r>
+    </w:p>
+    <w:p>
+      <w:pPr>
+        <w:spacing w:after="0" w:before="0"/>
+      </w:pPr>
+      <w:r>
+        <w:rPr>
+          <w:rFonts w:ascii="Times New Roman" w:hAnsi="Times New Roman"/>
+          <w:b w:val="0"/>
+          <w:sz w:val="24"/>
+        </w:rPr>
+        <w:t>4. Define and announce the Starter plan pricing and Stripe integration.</w:t>
+      </w:r>
+    </w:p>
+    <w:p>
+      <w:pPr>
+        <w:spacing w:after="0" w:before="0"/>
+      </w:pPr>
+      <w:r>
+        <w:rPr>
+          <w:rFonts w:ascii="Times New Roman" w:hAnsi="Times New Roman"/>
+          <w:b w:val="0"/>
+          <w:sz w:val="24"/>
+        </w:rPr>
+        <w:t>5. Publish a public roadmap to build confidence in continued development.</w:t>
+      </w:r>
+    </w:p>
+    <w:p>
+      <w:pPr>
+        <w:spacing w:after="0" w:before="0"/>
+      </w:pPr>
+    </w:p>
+    <w:p>
+      <w:pPr>
+        <w:spacing w:after="120" w:before="120"/>
+      </w:pPr>
+    </w:p>
+    <w:p>
+      <w:pPr>
+        <w:spacing w:after="0" w:before="0"/>
+      </w:pPr>
+    </w:p>
+    <w:p>
+      <w:pPr>
+        <w:spacing w:after="0" w:before="0"/>
+      </w:pPr>
+      <w:r>
+        <w:rPr>
+          <w:rFonts w:ascii="Times New Roman" w:hAnsi="Times New Roman"/>
+          <w:b w:val="0"/>
+          <w:sz w:val="24"/>
+        </w:rPr>
+        <w:t>_This report was last updated: May 2026. For the latest codebase and deployment status, see https://github.com/aliciapls/Sequor._</w:t>
+      </w:r>
+    </w:p>
     <w:p>
       <w:pPr>
         <w:spacing w:after="0" w:before="0"/>

</xml_diff>

<commit_message>
docs: restore pandoc-style header in Sequor product report
Co-Authored-By: Claude Opus 4.7 <noreply@anthropic.com>
</commit_message>
<xml_diff>
--- a/SEQUOR_REPORT.docx
+++ b/SEQUOR_REPORT.docx
@@ -4,7 +4,8 @@
   <w:body>
     <w:p>
       <w:pPr>
-        <w:jc w:val="left"/>
+        <w:pStyle w:val="Title"/>
+        <w:spacing w:before="120" w:after="120"/>
       </w:pPr>
       <w:r>
         <w:rPr>
@@ -12,10 +13,45 @@
           <w:b/>
           <w:sz w:val="28"/>
         </w:rPr>
-        <w:t>1. Executive Summary</w:t>
+        <w:t>Sequor — AI Communication Coverage Platform</w:t>
       </w:r>
     </w:p>
     <w:p>
+      <w:pPr>
+        <w:spacing w:before="0" w:after="0"/>
+      </w:pPr>
+    </w:p>
+    <w:p>
+      <w:pPr>
+        <w:spacing w:before="0" w:after="0"/>
+      </w:pPr>
+      <w:r>
+        <w:rPr>
+          <w:rFonts w:ascii="Times New Roman" w:hAnsi="Times New Roman" w:eastAsia="Times New Roman"/>
+          <w:b/>
+          <w:sz w:val="24"/>
+        </w:rPr>
+        <w:t xml:space="preserve">Repository: </w:t>
+      </w:r>
+      <w:r>
+        <w:rPr>
+          <w:rFonts w:ascii="Times New Roman" w:hAnsi="Times New Roman" w:eastAsia="Times New Roman"/>
+          <w:b w:val="0"/>
+          <w:sz w:val="24"/>
+        </w:rPr>
+        <w:t>https://github.com/aliciapls/Sequor</w:t>
+      </w:r>
+    </w:p>
+    <w:p/>
+    <w:p>
+      <w:pPr>
+        <w:spacing w:before="120" w:after="120"/>
+      </w:pPr>
+    </w:p>
+    <w:p>
+      <w:pPr>
+        <w:spacing w:before="0" w:after="0"/>
+      </w:pPr>
       <w:r>
         <w:rPr>
           <w:rFonts w:ascii="Times New Roman" w:hAnsi="Times New Roman" w:eastAsia="Times New Roman"/>
@@ -26,16 +62,22 @@
       </w:r>
     </w:p>
     <w:p>
+      <w:pPr>
+        <w:spacing w:before="0" w:after="0"/>
+      </w:pPr>
       <w:r>
         <w:rPr>
           <w:rFonts w:ascii="Times New Roman" w:hAnsi="Times New Roman" w:eastAsia="Times New Roman"/>
           <w:b w:val="0"/>
           <w:sz w:val="24"/>
         </w:rPr>
-        <w:t>How it works: Customer messages → AI classifies (routine / semi-routine / complex / high-stakes) → High-confidence routine queries get an immediate auto-reply drawn from uploaded documents → Complex or low-confidence queries escalate to a backup contact with an AI-prepared draft → Every human resolution improves future auto-replies.</w:t>
+        <w:t>How it works: Customer messages → AI classifies (routine / semi-routine / complex / high-stakes) → High-confidence routine queries get an immediate auto-reply drawn from uploaded documents → Complex or low-confidence queries escalate to a backup contact with an AI-prepared draft ready for review → Every human resolution improves future auto-replies.</w:t>
       </w:r>
     </w:p>
     <w:p>
+      <w:pPr>
+        <w:spacing w:before="0" w:after="0"/>
+      </w:pPr>
       <w:r>
         <w:rPr>
           <w:rFonts w:ascii="Times New Roman" w:hAnsi="Times New Roman" w:eastAsia="Times New Roman"/>
@@ -46,6 +88,9 @@
       </w:r>
     </w:p>
     <w:p>
+      <w:pPr>
+        <w:spacing w:before="0" w:after="0"/>
+      </w:pPr>
       <w:r>
         <w:rPr>
           <w:rFonts w:ascii="Times New Roman" w:hAnsi="Times New Roman" w:eastAsia="Times New Roman"/>
@@ -56,6 +101,9 @@
       </w:r>
     </w:p>
     <w:p>
+      <w:pPr>
+        <w:spacing w:before="0" w:after="0"/>
+      </w:pPr>
       <w:r>
         <w:rPr>
           <w:rFonts w:ascii="Times New Roman" w:hAnsi="Times New Roman" w:eastAsia="Times New Roman"/>
@@ -66,6 +114,9 @@
       </w:r>
     </w:p>
     <w:p>
+      <w:pPr>
+        <w:spacing w:before="0" w:after="0"/>
+      </w:pPr>
       <w:r>
         <w:rPr>
           <w:rFonts w:ascii="Times New Roman" w:hAnsi="Times New Roman" w:eastAsia="Times New Roman"/>
@@ -77,31 +128,24 @@
     </w:p>
     <w:p>
       <w:pPr>
-        <w:jc w:val="left"/>
+        <w:pStyle w:val="Heading1"/>
       </w:pPr>
       <w:r>
-        <w:rPr>
-          <w:rFonts w:ascii="Times New Roman" w:hAnsi="Times New Roman" w:eastAsia="Times New Roman"/>
-          <w:b/>
-          <w:sz w:val="28"/>
-        </w:rPr>
         <w:t>2. Business Case</w:t>
       </w:r>
     </w:p>
     <w:p>
       <w:pPr>
-        <w:jc w:val="left"/>
+        <w:pStyle w:val="Heading2"/>
       </w:pPr>
       <w:r>
-        <w:rPr>
-          <w:rFonts w:ascii="Times New Roman" w:hAnsi="Times New Roman" w:eastAsia="Times New Roman"/>
-          <w:b/>
-          <w:sz w:val="24"/>
-        </w:rPr>
         <w:t>The Problem</w:t>
       </w:r>
     </w:p>
     <w:p>
+      <w:pPr>
+        <w:spacing w:before="0" w:after="0"/>
+      </w:pPr>
       <w:r>
         <w:rPr>
           <w:rFonts w:ascii="Times New Roman" w:hAnsi="Times New Roman" w:eastAsia="Times New Roman"/>
@@ -113,14 +157,9 @@
     </w:p>
     <w:p>
       <w:pPr>
-        <w:jc w:val="left"/>
+        <w:pStyle w:val="Heading2"/>
       </w:pPr>
       <w:r>
-        <w:rPr>
-          <w:rFonts w:ascii="Times New Roman" w:hAnsi="Times New Roman" w:eastAsia="Times New Roman"/>
-          <w:b/>
-          <w:sz w:val="24"/>
-        </w:rPr>
         <w:t>Competitive Comparison</w:t>
       </w:r>
     </w:p>
@@ -147,7 +186,7 @@
               <w:rPr>
                 <w:rFonts w:ascii="Times New Roman" w:hAnsi="Times New Roman" w:eastAsia="Times New Roman"/>
                 <w:b/>
-                <w:sz w:val="24"/>
+                <w:sz w:val="22"/>
               </w:rPr>
             </w:r>
           </w:p>
@@ -161,7 +200,7 @@
               <w:rPr>
                 <w:rFonts w:ascii="Times New Roman" w:hAnsi="Times New Roman" w:eastAsia="Times New Roman"/>
                 <w:b/>
-                <w:sz w:val="24"/>
+                <w:sz w:val="22"/>
               </w:rPr>
               <w:t>Sequor</w:t>
             </w:r>
@@ -176,7 +215,7 @@
               <w:rPr>
                 <w:rFonts w:ascii="Times New Roman" w:hAnsi="Times New Roman" w:eastAsia="Times New Roman"/>
                 <w:b/>
-                <w:sz w:val="24"/>
+                <w:sz w:val="22"/>
               </w:rPr>
               <w:t>Virtual Assistant</w:t>
             </w:r>
@@ -191,7 +230,7 @@
               <w:rPr>
                 <w:rFonts w:ascii="Times New Roman" w:hAnsi="Times New Roman" w:eastAsia="Times New Roman"/>
                 <w:b/>
-                <w:sz w:val="24"/>
+                <w:sz w:val="22"/>
               </w:rPr>
               <w:t>Intercom AI</w:t>
             </w:r>
@@ -206,7 +245,7 @@
               <w:rPr>
                 <w:rFonts w:ascii="Times New Roman" w:hAnsi="Times New Roman" w:eastAsia="Times New Roman"/>
                 <w:b/>
-                <w:sz w:val="24"/>
+                <w:sz w:val="22"/>
               </w:rPr>
               <w:t>DIY GPT API</w:t>
             </w:r>
@@ -223,7 +262,7 @@
               <w:rPr>
                 <w:rFonts w:ascii="Times New Roman" w:hAnsi="Times New Roman" w:eastAsia="Times New Roman"/>
                 <w:b w:val="0"/>
-                <w:sz w:val="24"/>
+                <w:sz w:val="20"/>
               </w:rPr>
               <w:t>Monthly cost</w:t>
             </w:r>
@@ -238,7 +277,7 @@
               <w:rPr>
                 <w:rFonts w:ascii="Times New Roman" w:hAnsi="Times New Roman" w:eastAsia="Times New Roman"/>
                 <w:b w:val="0"/>
-                <w:sz w:val="24"/>
+                <w:sz w:val="20"/>
               </w:rPr>
               <w:t>From free</w:t>
             </w:r>
@@ -253,7 +292,7 @@
               <w:rPr>
                 <w:rFonts w:ascii="Times New Roman" w:hAnsi="Times New Roman" w:eastAsia="Times New Roman"/>
                 <w:b w:val="0"/>
-                <w:sz w:val="24"/>
+                <w:sz w:val="20"/>
               </w:rPr>
               <w:t>SGD 1,500–3,000</w:t>
             </w:r>
@@ -268,7 +307,7 @@
               <w:rPr>
                 <w:rFonts w:ascii="Times New Roman" w:hAnsi="Times New Roman" w:eastAsia="Times New Roman"/>
                 <w:b w:val="0"/>
-                <w:sz w:val="24"/>
+                <w:sz w:val="20"/>
               </w:rPr>
               <w:t>SGD 80–500+</w:t>
             </w:r>
@@ -283,9 +322,9 @@
               <w:rPr>
                 <w:rFonts w:ascii="Times New Roman" w:hAnsi="Times New Roman" w:eastAsia="Times New Roman"/>
                 <w:b w:val="0"/>
-                <w:sz w:val="24"/>
+                <w:sz w:val="20"/>
               </w:rPr>
-              <w:t>SGD 50–500+</w:t>
+              <w:t>SGD 50–500+ (API)</w:t>
             </w:r>
           </w:p>
         </w:tc>
@@ -300,7 +339,7 @@
               <w:rPr>
                 <w:rFonts w:ascii="Times New Roman" w:hAnsi="Times New Roman" w:eastAsia="Times New Roman"/>
                 <w:b w:val="0"/>
-                <w:sz w:val="24"/>
+                <w:sz w:val="20"/>
               </w:rPr>
               <w:t>Setup time</w:t>
             </w:r>
@@ -315,7 +354,7 @@
               <w:rPr>
                 <w:rFonts w:ascii="Times New Roman" w:hAnsi="Times New Roman" w:eastAsia="Times New Roman"/>
                 <w:b w:val="0"/>
-                <w:sz w:val="24"/>
+                <w:sz w:val="20"/>
               </w:rPr>
               <w:t>Hours</w:t>
             </w:r>
@@ -330,7 +369,7 @@
               <w:rPr>
                 <w:rFonts w:ascii="Times New Roman" w:hAnsi="Times New Roman" w:eastAsia="Times New Roman"/>
                 <w:b w:val="0"/>
-                <w:sz w:val="24"/>
+                <w:sz w:val="20"/>
               </w:rPr>
               <w:t>Days to weeks</w:t>
             </w:r>
@@ -345,7 +384,7 @@
               <w:rPr>
                 <w:rFonts w:ascii="Times New Roman" w:hAnsi="Times New Roman" w:eastAsia="Times New Roman"/>
                 <w:b w:val="0"/>
-                <w:sz w:val="24"/>
+                <w:sz w:val="20"/>
               </w:rPr>
               <w:t>Days</w:t>
             </w:r>
@@ -360,7 +399,7 @@
               <w:rPr>
                 <w:rFonts w:ascii="Times New Roman" w:hAnsi="Times New Roman" w:eastAsia="Times New Roman"/>
                 <w:b w:val="0"/>
-                <w:sz w:val="24"/>
+                <w:sz w:val="20"/>
               </w:rPr>
               <w:t>Days</w:t>
             </w:r>
@@ -377,9 +416,9 @@
               <w:rPr>
                 <w:rFonts w:ascii="Times New Roman" w:hAnsi="Times New Roman" w:eastAsia="Times New Roman"/>
                 <w:b w:val="0"/>
-                <w:sz w:val="24"/>
+                <w:sz w:val="20"/>
               </w:rPr>
-              <w:t>Escalation with AI draft</w:t>
+              <w:t>Escalation + AI draft</w:t>
             </w:r>
           </w:p>
         </w:tc>
@@ -392,7 +431,7 @@
               <w:rPr>
                 <w:rFonts w:ascii="Times New Roman" w:hAnsi="Times New Roman" w:eastAsia="Times New Roman"/>
                 <w:b w:val="0"/>
-                <w:sz w:val="24"/>
+                <w:sz w:val="20"/>
               </w:rPr>
               <w:t>Yes</w:t>
             </w:r>
@@ -407,7 +446,7 @@
               <w:rPr>
                 <w:rFonts w:ascii="Times New Roman" w:hAnsi="Times New Roman" w:eastAsia="Times New Roman"/>
                 <w:b w:val="0"/>
-                <w:sz w:val="24"/>
+                <w:sz w:val="20"/>
               </w:rPr>
               <w:t>N/A</w:t>
             </w:r>
@@ -422,7 +461,7 @@
               <w:rPr>
                 <w:rFonts w:ascii="Times New Roman" w:hAnsi="Times New Roman" w:eastAsia="Times New Roman"/>
                 <w:b w:val="0"/>
-                <w:sz w:val="24"/>
+                <w:sz w:val="20"/>
               </w:rPr>
               <w:t>Partial</w:t>
             </w:r>
@@ -437,7 +476,7 @@
               <w:rPr>
                 <w:rFonts w:ascii="Times New Roman" w:hAnsi="Times New Roman" w:eastAsia="Times New Roman"/>
                 <w:b w:val="0"/>
-                <w:sz w:val="24"/>
+                <w:sz w:val="20"/>
               </w:rPr>
               <w:t>No</w:t>
             </w:r>
@@ -454,9 +493,9 @@
               <w:rPr>
                 <w:rFonts w:ascii="Times New Roman" w:hAnsi="Times New Roman" w:eastAsia="Times New Roman"/>
                 <w:b w:val="0"/>
-                <w:sz w:val="24"/>
+                <w:sz w:val="20"/>
               </w:rPr>
-              <w:t>PDPA compliance built-in</w:t>
+              <w:t>PDPA built-in</w:t>
             </w:r>
           </w:p>
         </w:tc>
@@ -469,7 +508,7 @@
               <w:rPr>
                 <w:rFonts w:ascii="Times New Roman" w:hAnsi="Times New Roman" w:eastAsia="Times New Roman"/>
                 <w:b w:val="0"/>
-                <w:sz w:val="24"/>
+                <w:sz w:val="20"/>
               </w:rPr>
               <w:t>Yes</w:t>
             </w:r>
@@ -484,7 +523,7 @@
               <w:rPr>
                 <w:rFonts w:ascii="Times New Roman" w:hAnsi="Times New Roman" w:eastAsia="Times New Roman"/>
                 <w:b w:val="0"/>
-                <w:sz w:val="24"/>
+                <w:sz w:val="20"/>
               </w:rPr>
               <w:t>No</w:t>
             </w:r>
@@ -499,7 +538,7 @@
               <w:rPr>
                 <w:rFonts w:ascii="Times New Roman" w:hAnsi="Times New Roman" w:eastAsia="Times New Roman"/>
                 <w:b w:val="0"/>
-                <w:sz w:val="24"/>
+                <w:sz w:val="20"/>
               </w:rPr>
               <w:t>Partial</w:t>
             </w:r>
@@ -514,7 +553,7 @@
               <w:rPr>
                 <w:rFonts w:ascii="Times New Roman" w:hAnsi="Times New Roman" w:eastAsia="Times New Roman"/>
                 <w:b w:val="0"/>
-                <w:sz w:val="24"/>
+                <w:sz w:val="20"/>
               </w:rPr>
               <w:t>No</w:t>
             </w:r>
@@ -524,20 +563,16 @@
     </w:tbl>
     <w:p>
       <w:pPr>
-        <w:jc w:val="left"/>
+        <w:pStyle w:val="Heading2"/>
       </w:pPr>
       <w:r>
-        <w:rPr>
-          <w:rFonts w:ascii="Times New Roman" w:hAnsi="Times New Roman" w:eastAsia="Times New Roman"/>
-          <w:b/>
-          <w:sz w:val="24"/>
-        </w:rPr>
         <w:t>What Is Needed to Go Live</w:t>
       </w:r>
     </w:p>
     <w:p>
       <w:pPr>
         <w:pStyle w:val="ListNumber"/>
+        <w:spacing w:before="0" w:after="0"/>
       </w:pPr>
       <w:r>
         <w:rPr>
@@ -545,12 +580,13 @@
           <w:b w:val="0"/>
           <w:sz w:val="24"/>
         </w:rPr>
-        <w:t>DNS verification — Add MX/TXT records for your email domain. Sequor generates the records. Takes 5–30 minutes.</w:t>
+        <w:t>DNS verification — MX/TXT records generated by Sequor. Takes 5–30 minutes.</w:t>
       </w:r>
     </w:p>
     <w:p>
       <w:pPr>
         <w:pStyle w:val="ListNumber"/>
+        <w:spacing w:before="0" w:after="0"/>
       </w:pPr>
       <w:r>
         <w:rPr>
@@ -558,12 +594,13 @@
           <w:b w:val="0"/>
           <w:sz w:val="24"/>
         </w:rPr>
-        <w:t>WhatsApp Business Account (if using WhatsApp) — Create Meta Business Account, verify phone number, approve Cloud API app. Takes 1–2 hours.</w:t>
+        <w:t>WhatsApp Business Account (if using WhatsApp) — Meta Business Account, verify phone number, approve Cloud API app. Takes 1–2 hours.</w:t>
       </w:r>
     </w:p>
     <w:p>
       <w:pPr>
         <w:pStyle w:val="ListNumber"/>
+        <w:spacing w:before="0" w:after="0"/>
       </w:pPr>
       <w:r>
         <w:rPr>
@@ -571,12 +608,13 @@
           <w:b w:val="0"/>
           <w:sz w:val="24"/>
         </w:rPr>
-        <w:t>SendGrid account (if using email) — Free tier sufficient for most small businesses.</w:t>
+        <w:t>SendGrid account (if using email) — Free tier sufficient for most.</w:t>
       </w:r>
     </w:p>
     <w:p>
       <w:pPr>
         <w:pStyle w:val="ListNumber"/>
+        <w:spacing w:before="0" w:after="0"/>
       </w:pPr>
       <w:r>
         <w:rPr>
@@ -590,6 +628,7 @@
     <w:p>
       <w:pPr>
         <w:pStyle w:val="ListNumber"/>
+        <w:spacing w:before="0" w:after="0"/>
       </w:pPr>
       <w:r>
         <w:rPr>
@@ -603,6 +642,7 @@
     <w:p>
       <w:pPr>
         <w:pStyle w:val="ListNumber"/>
+        <w:spacing w:before="0" w:after="0"/>
       </w:pPr>
       <w:r>
         <w:rPr>
@@ -614,98 +654,86 @@
       </w:r>
     </w:p>
     <w:p>
+      <w:pPr>
+        <w:spacing w:before="0" w:after="0"/>
+      </w:pPr>
       <w:r>
         <w:rPr>
           <w:rFonts w:ascii="Times New Roman" w:hAnsi="Times New Roman" w:eastAsia="Times New Roman"/>
           <w:b w:val="0"/>
           <w:sz w:val="24"/>
         </w:rPr>
-        <w:t>Total setup time: 2–4 hours for a non-technical owner.</w:t>
+        <w:t>Total setup time for a non-technical owner: 2–4 hours.</w:t>
       </w:r>
     </w:p>
     <w:p>
       <w:pPr>
-        <w:jc w:val="left"/>
+        <w:pStyle w:val="Heading2"/>
       </w:pPr>
       <w:r>
-        <w:rPr>
-          <w:rFonts w:ascii="Times New Roman" w:hAnsi="Times New Roman" w:eastAsia="Times New Roman"/>
-          <w:b/>
-          <w:sz w:val="24"/>
-        </w:rPr>
         <w:t>Data Continuity</w:t>
       </w:r>
     </w:p>
     <w:p>
+      <w:pPr>
+        <w:spacing w:before="0" w:after="0"/>
+      </w:pPr>
       <w:r>
         <w:rPr>
           <w:rFonts w:ascii="Times New Roman" w:hAnsi="Times New Roman" w:eastAsia="Times New Roman"/>
           <w:b w:val="0"/>
           <w:sz w:val="24"/>
         </w:rPr>
-        <w:t>If Sequor ceases operation: all data exported in CSV/JSON on request; database can be self-hosted via Docker image; no proprietary lock-in.</w:t>
+        <w:t>If Sequor ceases operation: all data exported in CSV/JSON on request; database self-hosted via Docker image; no proprietary lock-in.</w:t>
       </w:r>
     </w:p>
     <w:p>
       <w:pPr>
-        <w:jc w:val="left"/>
+        <w:pStyle w:val="Heading1"/>
       </w:pPr>
       <w:r>
-        <w:rPr>
-          <w:rFonts w:ascii="Times New Roman" w:hAnsi="Times New Roman" w:eastAsia="Times New Roman"/>
-          <w:b/>
-          <w:sz w:val="28"/>
-        </w:rPr>
         <w:t>3. User Guide — Day-to-Day Operations</w:t>
       </w:r>
     </w:p>
     <w:p>
       <w:pPr>
-        <w:jc w:val="left"/>
+        <w:pStyle w:val="Heading2"/>
       </w:pPr>
       <w:r>
-        <w:rPr>
-          <w:rFonts w:ascii="Times New Roman" w:hAnsi="Times New Roman" w:eastAsia="Times New Roman"/>
-          <w:b/>
-          <w:sz w:val="24"/>
-        </w:rPr>
         <w:t>What You Will Receive as a Backup Contact</w:t>
       </w:r>
     </w:p>
     <w:p>
+      <w:pPr>
+        <w:spacing w:before="0" w:after="0"/>
+      </w:pPr>
       <w:r>
         <w:rPr>
           <w:rFonts w:ascii="Times New Roman" w:hAnsi="Times New Roman" w:eastAsia="Times New Roman"/>
           <w:b w:val="0"/>
           <w:sz w:val="24"/>
         </w:rPr>
-        <w:t>When an escalation is created, you receive an email:</w:t>
+        <w:t>When an escalation is created, you receive this email:</w:t>
       </w:r>
     </w:p>
     <w:p>
       <w:pPr>
-        <w:ind w:left="432"/>
+        <w:ind w:left="360"/>
+        <w:spacing w:before="0" w:after="0"/>
       </w:pPr>
       <w:r>
         <w:rPr>
           <w:rFonts w:ascii="Courier New" w:hAnsi="Courier New"/>
-          <w:sz w:val="20"/>
+          <w:sz w:val="18"/>
         </w:rPr>
         <w:t>Subject: [UNRESOLVED] Question about bulk order pricing (Ref: a1b2c3d4)</w:t>
         <w:br/>
-        <w:br/>
-        <w:t>Client: Sarah Tan (WhatsApp)</w:t>
-        <w:br/>
-        <w:t>Received: 14 May 2026, 9:42 AM</w:t>
+        <w:t>Client: Sarah Tan (WhatsApp) · Received: 14 May 2026, 9:42 AM</w:t>
         <w:br/>
         <w:t>Confidence: Moderate (67%) — semi_routine</w:t>
         <w:br/>
         <w:br/>
-        <w:t>---</w:t>
-        <w:br/>
         <w:t>Hi, do you offer discounts for bulk orders of 500+ units?</w:t>
-        <w:br/>
-        <w:t>---</w:t>
         <w:br/>
         <w:br/>
         <w:t>→ Reply to this email to send your response to the client.</w:t>
@@ -721,52 +749,17 @@
       </w:r>
     </w:p>
     <w:p>
+      <w:pPr>
+        <w:pStyle w:val="Heading2"/>
+      </w:pPr>
       <w:r>
-        <w:rPr>
-          <w:rFonts w:ascii="Times New Roman" w:hAnsi="Times New Roman" w:eastAsia="Times New Roman"/>
-          <w:b w:val="0"/>
-          <w:sz w:val="24"/>
-        </w:rPr>
-        <w:t>Your options: Reply directly to send, edit the AI draft, or compose your own. The draft is a starting point, not a constraint.</w:t>
+        <w:t>HUMAN Override</w:t>
       </w:r>
     </w:p>
     <w:p>
       <w:pPr>
-        <w:jc w:val="left"/>
+        <w:spacing w:before="0" w:after="0"/>
       </w:pPr>
-      <w:r>
-        <w:rPr>
-          <w:rFonts w:ascii="Times New Roman" w:hAnsi="Times New Roman" w:eastAsia="Times New Roman"/>
-          <w:b/>
-          <w:sz w:val="24"/>
-        </w:rPr>
-        <w:t>How to Know If Auto-Replies Are Working</w:t>
-      </w:r>
-    </w:p>
-    <w:p>
-      <w:r>
-        <w:rPr>
-          <w:rFonts w:ascii="Times New Roman" w:hAnsi="Times New Roman" w:eastAsia="Times New Roman"/>
-          <w:b w:val="0"/>
-          <w:sz w:val="24"/>
-        </w:rPr>
-        <w:t>Check the Dashboard: messages received vs. auto-replies sent vs. open escalations. If auto-replies ÷ messages received is above 70%, the AI is handling most volume. If escalations rise week-over-week, add more documents or key phrases.</w:t>
-      </w:r>
-    </w:p>
-    <w:p>
-      <w:pPr>
-        <w:jc w:val="left"/>
-      </w:pPr>
-      <w:r>
-        <w:rPr>
-          <w:rFonts w:ascii="Times New Roman" w:hAnsi="Times New Roman" w:eastAsia="Times New Roman"/>
-          <w:b/>
-          <w:sz w:val="24"/>
-        </w:rPr>
-        <w:t>HUMAN Override</w:t>
-      </w:r>
-    </w:p>
-    <w:p>
       <w:r>
         <w:rPr>
           <w:rFonts w:ascii="Times New Roman" w:hAnsi="Times New Roman" w:eastAsia="Times New Roman"/>
@@ -778,20 +771,16 @@
     </w:p>
     <w:p>
       <w:pPr>
-        <w:jc w:val="left"/>
+        <w:pStyle w:val="Heading2"/>
       </w:pPr>
       <w:r>
-        <w:rPr>
-          <w:rFonts w:ascii="Times New Roman" w:hAnsi="Times New Roman" w:eastAsia="Times New Roman"/>
-          <w:b/>
-          <w:sz w:val="24"/>
-        </w:rPr>
         <w:t>Common Tasks</w:t>
       </w:r>
     </w:p>
     <w:p>
       <w:pPr>
         <w:pStyle w:val="ListBullet"/>
+        <w:spacing w:before="0" w:after="0"/>
       </w:pPr>
       <w:r>
         <w:rPr>
@@ -799,12 +788,13 @@
           <w:b w:val="0"/>
           <w:sz w:val="24"/>
         </w:rPr>
-        <w:t>Upload a document: Documents → Upload → PDF, DOCX, or TXT (max 25MB) → assign type → wait for Ready status.</w:t>
+        <w:t>Upload a document: Documents → Upload → PDF/DOCX/TXT (max 25MB) → assign type → wait for Ready status.</w:t>
       </w:r>
     </w:p>
     <w:p>
       <w:pPr>
         <w:pStyle w:val="ListBullet"/>
+        <w:spacing w:before="0" w:after="0"/>
       </w:pPr>
       <w:r>
         <w:rPr>
@@ -812,12 +802,13 @@
           <w:b w:val="0"/>
           <w:sz w:val="24"/>
         </w:rPr>
-        <w:t>Add a key phrase: Key Phrases → Add → phrase → assign to document → set confidence boost. Use Suggest for AI-proposed phrases.</w:t>
+        <w:t>Add a key phrase: Key Phrases → Add → phrase → assign to document → set confidence boost.</w:t>
       </w:r>
     </w:p>
     <w:p>
       <w:pPr>
         <w:pStyle w:val="ListBullet"/>
+        <w:spacing w:before="0" w:after="0"/>
       </w:pPr>
       <w:r>
         <w:rPr>
@@ -825,12 +816,13 @@
           <w:b w:val="0"/>
           <w:sz w:val="24"/>
         </w:rPr>
-        <w:t>Handle a PDPA erasure request: Settings → Compliance → Erase Contact Data → enter email. All personal data deleted within 30 days.</w:t>
+        <w:t>Handle a PDPA erasure request: Settings → Compliance → Erase Contact Data → enter email.</w:t>
       </w:r>
     </w:p>
     <w:p>
       <w:pPr>
         <w:pStyle w:val="ListBullet"/>
+        <w:spacing w:before="0" w:after="0"/>
       </w:pPr>
       <w:r>
         <w:rPr>
@@ -838,19 +830,14 @@
           <w:b w:val="0"/>
           <w:sz w:val="24"/>
         </w:rPr>
-        <w:t>SLA breach: Each account has a configurable SLA (default: 4 hours). Unresolved escalations automatically escalate to second-tier contact.</w:t>
+        <w:t>SLA breach: Configurable SLA (default: 4 hours). Unresolved escalations automatically escalate to second-tier contact.</w:t>
       </w:r>
     </w:p>
     <w:p>
       <w:pPr>
-        <w:jc w:val="left"/>
+        <w:pStyle w:val="Heading2"/>
       </w:pPr>
       <w:r>
-        <w:rPr>
-          <w:rFonts w:ascii="Times New Roman" w:hAnsi="Times New Roman" w:eastAsia="Times New Roman"/>
-          <w:b/>
-          <w:sz w:val="24"/>
-        </w:rPr>
         <w:t>Troubleshooting</w:t>
       </w:r>
     </w:p>
@@ -875,7 +862,7 @@
               <w:rPr>
                 <w:rFonts w:ascii="Times New Roman" w:hAnsi="Times New Roman" w:eastAsia="Times New Roman"/>
                 <w:b/>
-                <w:sz w:val="24"/>
+                <w:sz w:val="22"/>
               </w:rPr>
               <w:t>Situation</w:t>
             </w:r>
@@ -890,7 +877,7 @@
               <w:rPr>
                 <w:rFonts w:ascii="Times New Roman" w:hAnsi="Times New Roman" w:eastAsia="Times New Roman"/>
                 <w:b/>
-                <w:sz w:val="24"/>
+                <w:sz w:val="22"/>
               </w:rPr>
               <w:t>Likely Cause</w:t>
             </w:r>
@@ -905,7 +892,7 @@
               <w:rPr>
                 <w:rFonts w:ascii="Times New Roman" w:hAnsi="Times New Roman" w:eastAsia="Times New Roman"/>
                 <w:b/>
-                <w:sz w:val="24"/>
+                <w:sz w:val="22"/>
               </w:rPr>
               <w:t>Action</w:t>
             </w:r>
@@ -922,9 +909,9 @@
               <w:rPr>
                 <w:rFonts w:ascii="Times New Roman" w:hAnsi="Times New Roman" w:eastAsia="Times New Roman"/>
                 <w:b w:val="0"/>
-                <w:sz w:val="24"/>
+                <w:sz w:val="20"/>
               </w:rPr>
-              <w:t>Customer says they replied; you didn't receive</w:t>
+              <w:t>Customer replied; you didn't receive</w:t>
             </w:r>
           </w:p>
         </w:tc>
@@ -937,7 +924,7 @@
               <w:rPr>
                 <w:rFonts w:ascii="Times New Roman" w:hAnsi="Times New Roman" w:eastAsia="Times New Roman"/>
                 <w:b w:val="0"/>
-                <w:sz w:val="24"/>
+                <w:sz w:val="20"/>
               </w:rPr>
               <w:t>Message escalated</w:t>
             </w:r>
@@ -952,7 +939,7 @@
               <w:rPr>
                 <w:rFonts w:ascii="Times New Roman" w:hAnsi="Times New Roman" w:eastAsia="Times New Roman"/>
                 <w:b w:val="0"/>
-                <w:sz w:val="24"/>
+                <w:sz w:val="20"/>
               </w:rPr>
               <w:t>Check Escalations list</w:t>
             </w:r>
@@ -969,7 +956,7 @@
               <w:rPr>
                 <w:rFonts w:ascii="Times New Roman" w:hAnsi="Times New Roman" w:eastAsia="Times New Roman"/>
                 <w:b w:val="0"/>
-                <w:sz w:val="24"/>
+                <w:sz w:val="20"/>
               </w:rPr>
               <w:t>Auto-reply sounds wrong</w:t>
             </w:r>
@@ -984,7 +971,7 @@
               <w:rPr>
                 <w:rFonts w:ascii="Times New Roman" w:hAnsi="Times New Roman" w:eastAsia="Times New Roman"/>
                 <w:b w:val="0"/>
-                <w:sz w:val="24"/>
+                <w:sz w:val="20"/>
               </w:rPr>
               <w:t>Document outdated or wrong type</w:t>
             </w:r>
@@ -999,9 +986,9 @@
               <w:rPr>
                 <w:rFonts w:ascii="Times New Roman" w:hAnsi="Times New Roman" w:eastAsia="Times New Roman"/>
                 <w:b w:val="0"/>
-                <w:sz w:val="24"/>
+                <w:sz w:val="20"/>
               </w:rPr>
-              <w:t>Re-upload document, check type</w:t>
+              <w:t>Re-upload document</w:t>
             </w:r>
           </w:p>
         </w:tc>
@@ -1016,7 +1003,7 @@
               <w:rPr>
                 <w:rFonts w:ascii="Times New Roman" w:hAnsi="Times New Roman" w:eastAsia="Times New Roman"/>
                 <w:b w:val="0"/>
-                <w:sz w:val="24"/>
+                <w:sz w:val="20"/>
               </w:rPr>
               <w:t>Escalation email not received</w:t>
             </w:r>
@@ -1031,7 +1018,7 @@
               <w:rPr>
                 <w:rFonts w:ascii="Times New Roman" w:hAnsi="Times New Roman" w:eastAsia="Times New Roman"/>
                 <w:b w:val="0"/>
-                <w:sz w:val="24"/>
+                <w:sz w:val="20"/>
               </w:rPr>
               <w:t>Backup email wrong or spam</w:t>
             </w:r>
@@ -1046,7 +1033,7 @@
               <w:rPr>
                 <w:rFonts w:ascii="Times New Roman" w:hAnsi="Times New Roman" w:eastAsia="Times New Roman"/>
                 <w:b w:val="0"/>
-                <w:sz w:val="24"/>
+                <w:sz w:val="20"/>
               </w:rPr>
               <w:t>Check Contacts → backup email</w:t>
             </w:r>
@@ -1063,9 +1050,9 @@
               <w:rPr>
                 <w:rFonts w:ascii="Times New Roman" w:hAnsi="Times New Roman" w:eastAsia="Times New Roman"/>
                 <w:b w:val="0"/>
-                <w:sz w:val="24"/>
+                <w:sz w:val="20"/>
               </w:rPr>
-              <w:t>WhatsApp got template instead of free-form reply</w:t>
+              <w:t>WhatsApp got template reply</w:t>
             </w:r>
           </w:p>
         </w:tc>
@@ -1078,7 +1065,7 @@
               <w:rPr>
                 <w:rFonts w:ascii="Times New Roman" w:hAnsi="Times New Roman" w:eastAsia="Times New Roman"/>
                 <w:b w:val="0"/>
-                <w:sz w:val="24"/>
+                <w:sz w:val="20"/>
               </w:rPr>
               <w:t>24-hour session expired</w:t>
             </w:r>
@@ -1093,9 +1080,9 @@
               <w:rPr>
                 <w:rFonts w:ascii="Times New Roman" w:hAnsi="Times New Roman" w:eastAsia="Times New Roman"/>
                 <w:b w:val="0"/>
-                <w:sz w:val="24"/>
+                <w:sz w:val="20"/>
               </w:rPr>
-              <w:t>No action needed; working as designed</w:t>
+              <w:t>Working as designed</w:t>
             </w:r>
           </w:p>
         </w:tc>
@@ -1110,7 +1097,7 @@
               <w:rPr>
                 <w:rFonts w:ascii="Times New Roman" w:hAnsi="Times New Roman" w:eastAsia="Times New Roman"/>
                 <w:b w:val="0"/>
-                <w:sz w:val="24"/>
+                <w:sz w:val="20"/>
               </w:rPr>
               <w:t>Document stuck at Indexing</w:t>
             </w:r>
@@ -1125,7 +1112,7 @@
               <w:rPr>
                 <w:rFonts w:ascii="Times New Roman" w:hAnsi="Times New Roman" w:eastAsia="Times New Roman"/>
                 <w:b w:val="0"/>
-                <w:sz w:val="24"/>
+                <w:sz w:val="20"/>
               </w:rPr>
               <w:t>Restart mid-processing</w:t>
             </w:r>
@@ -1140,9 +1127,9 @@
               <w:rPr>
                 <w:rFonts w:ascii="Times New Roman" w:hAnsi="Times New Roman" w:eastAsia="Times New Roman"/>
                 <w:b w:val="0"/>
-                <w:sz w:val="24"/>
+                <w:sz w:val="20"/>
               </w:rPr>
-              <w:t>Corrects on next startup; or update DB manually</w:t>
+              <w:t>Corrects on next startup</w:t>
             </w:r>
           </w:p>
         </w:tc>
@@ -1150,80 +1137,46 @@
     </w:tbl>
     <w:p>
       <w:pPr>
-        <w:jc w:val="left"/>
+        <w:pStyle w:val="Heading1"/>
       </w:pPr>
       <w:r>
-        <w:rPr>
-          <w:rFonts w:ascii="Times New Roman" w:hAnsi="Times New Roman" w:eastAsia="Times New Roman"/>
-          <w:b/>
-          <w:sz w:val="28"/>
-        </w:rPr>
         <w:t>4. Technical Overview</w:t>
       </w:r>
     </w:p>
     <w:p>
       <w:pPr>
-        <w:jc w:val="left"/>
+        <w:pStyle w:val="Heading2"/>
       </w:pPr>
       <w:r>
-        <w:rPr>
-          <w:rFonts w:ascii="Times New Roman" w:hAnsi="Times New Roman" w:eastAsia="Times New Roman"/>
-          <w:b/>
-          <w:sz w:val="24"/>
-        </w:rPr>
         <w:t>Architecture</w:t>
       </w:r>
     </w:p>
     <w:p>
       <w:pPr>
-        <w:ind w:left="432"/>
+        <w:ind w:left="360"/>
+        <w:spacing w:before="0" w:after="0"/>
       </w:pPr>
       <w:r>
         <w:rPr>
           <w:rFonts w:ascii="Courier New" w:hAnsi="Courier New"/>
-          <w:sz w:val="20"/>
+          <w:sz w:val="18"/>
         </w:rPr>
         <w:t>Customer (Email/WhatsApp) → SendGrid / Meta Webhooks → FastAPI on Vercel</w:t>
         <w:br/>
         <w:t xml:space="preserve">  |-- InboundEmailProcessor / InboundWhatsAppProcessor</w:t>
         <w:br/>
-        <w:t xml:space="preserve">  |-- AutoReplyService</w:t>
+        <w:t xml:space="preserve">  |-- AutoReplyService | MessageClassifier | RAGPipeline | LearningLoop</w:t>
         <w:br/>
-        <w:t xml:space="preserve">  |     |-- MessageClassifier (LLM — Ollama or OpenAI)</w:t>
-        <w:br/>
-        <w:t xml:space="preserve">  |     |-- RAGPipeline (pgvector similarity + BM25 keyword)</w:t>
-        <w:br/>
-        <w:t xml:space="preserve">  |     |-- ResponseGenerator</w:t>
-        <w:br/>
-        <w:t xml:space="preserve">  |     |-- LearningLoop</w:t>
-        <w:br/>
-        <w:t xml:space="preserve">  |-- EscalationService</w:t>
-        <w:br/>
-        <w:t xml:space="preserve">  |-- BillingService (Stripe)</w:t>
+        <w:t xml:space="preserve">  |-- EscalationService | BillingService (Stripe)</w:t>
         <w:br/>
         <w:t xml:space="preserve">         |-- PostgreSQL + pgvector</w:t>
       </w:r>
     </w:p>
     <w:p>
-      <w:r>
-        <w:rPr>
-          <w:rFonts w:ascii="Times New Roman" w:hAnsi="Times New Roman" w:eastAsia="Times New Roman"/>
-          <w:b w:val="0"/>
-          <w:sz w:val="24"/>
-        </w:rPr>
-        <w:t>AI: Ollama llama3.1 + nomic-embed-text locally; OpenAI text-embedding-3-small as fallback. Without embeddings, BM25 keyword search handles retrieval. OpenAI costs ~USD $0.02 per 1M tokens.</w:t>
-      </w:r>
-    </w:p>
-    <w:p>
       <w:pPr>
-        <w:jc w:val="left"/>
+        <w:pStyle w:val="Heading2"/>
       </w:pPr>
       <w:r>
-        <w:rPr>
-          <w:rFonts w:ascii="Times New Roman" w:hAnsi="Times New Roman" w:eastAsia="Times New Roman"/>
-          <w:b/>
-          <w:sz w:val="24"/>
-        </w:rPr>
         <w:t>Response Routing</w:t>
       </w:r>
     </w:p>
@@ -1248,7 +1201,7 @@
               <w:rPr>
                 <w:rFonts w:ascii="Times New Roman" w:hAnsi="Times New Roman" w:eastAsia="Times New Roman"/>
                 <w:b/>
-                <w:sz w:val="24"/>
+                <w:sz w:val="22"/>
               </w:rPr>
               <w:t>Confidence</w:t>
             </w:r>
@@ -1263,7 +1216,7 @@
               <w:rPr>
                 <w:rFonts w:ascii="Times New Roman" w:hAnsi="Times New Roman" w:eastAsia="Times New Roman"/>
                 <w:b/>
-                <w:sz w:val="24"/>
+                <w:sz w:val="22"/>
               </w:rPr>
               <w:t>Category</w:t>
             </w:r>
@@ -1278,7 +1231,7 @@
               <w:rPr>
                 <w:rFonts w:ascii="Times New Roman" w:hAnsi="Times New Roman" w:eastAsia="Times New Roman"/>
                 <w:b/>
-                <w:sz w:val="24"/>
+                <w:sz w:val="22"/>
               </w:rPr>
               <w:t>Action</w:t>
             </w:r>
@@ -1295,7 +1248,7 @@
               <w:rPr>
                 <w:rFonts w:ascii="Times New Roman" w:hAnsi="Times New Roman" w:eastAsia="Times New Roman"/>
                 <w:b w:val="0"/>
-                <w:sz w:val="24"/>
+                <w:sz w:val="20"/>
               </w:rPr>
               <w:t>&gt;= 90%</w:t>
             </w:r>
@@ -1310,7 +1263,7 @@
               <w:rPr>
                 <w:rFonts w:ascii="Times New Roman" w:hAnsi="Times New Roman" w:eastAsia="Times New Roman"/>
                 <w:b w:val="0"/>
-                <w:sz w:val="24"/>
+                <w:sz w:val="20"/>
               </w:rPr>
               <w:t>routine/semi_routine</w:t>
             </w:r>
@@ -1325,7 +1278,7 @@
               <w:rPr>
                 <w:rFonts w:ascii="Times New Roman" w:hAnsi="Times New Roman" w:eastAsia="Times New Roman"/>
                 <w:b w:val="0"/>
-                <w:sz w:val="24"/>
+                <w:sz w:val="20"/>
               </w:rPr>
               <w:t>Auto-reply sent</w:t>
             </w:r>
@@ -1342,7 +1295,7 @@
               <w:rPr>
                 <w:rFonts w:ascii="Times New Roman" w:hAnsi="Times New Roman" w:eastAsia="Times New Roman"/>
                 <w:b w:val="0"/>
-                <w:sz w:val="24"/>
+                <w:sz w:val="20"/>
               </w:rPr>
               <w:t>60–90%</w:t>
             </w:r>
@@ -1357,7 +1310,7 @@
               <w:rPr>
                 <w:rFonts w:ascii="Times New Roman" w:hAnsi="Times New Roman" w:eastAsia="Times New Roman"/>
                 <w:b w:val="0"/>
-                <w:sz w:val="24"/>
+                <w:sz w:val="20"/>
               </w:rPr>
               <w:t>routine/semi_routine</w:t>
             </w:r>
@@ -1372,7 +1325,7 @@
               <w:rPr>
                 <w:rFonts w:ascii="Times New Roman" w:hAnsi="Times New Roman" w:eastAsia="Times New Roman"/>
                 <w:b w:val="0"/>
-                <w:sz w:val="24"/>
+                <w:sz w:val="20"/>
               </w:rPr>
               <w:t>Escalate with AI draft</w:t>
             </w:r>
@@ -1389,7 +1342,7 @@
               <w:rPr>
                 <w:rFonts w:ascii="Times New Roman" w:hAnsi="Times New Roman" w:eastAsia="Times New Roman"/>
                 <w:b w:val="0"/>
-                <w:sz w:val="24"/>
+                <w:sz w:val="20"/>
               </w:rPr>
               <w:t>&lt; 60%</w:t>
             </w:r>
@@ -1404,7 +1357,7 @@
               <w:rPr>
                 <w:rFonts w:ascii="Times New Roman" w:hAnsi="Times New Roman" w:eastAsia="Times New Roman"/>
                 <w:b w:val="0"/>
-                <w:sz w:val="24"/>
+                <w:sz w:val="20"/>
               </w:rPr>
               <w:t>any</w:t>
             </w:r>
@@ -1419,7 +1372,7 @@
               <w:rPr>
                 <w:rFonts w:ascii="Times New Roman" w:hAnsi="Times New Roman" w:eastAsia="Times New Roman"/>
                 <w:b w:val="0"/>
-                <w:sz w:val="24"/>
+                <w:sz w:val="20"/>
               </w:rPr>
               <w:t>Escalate without draft</w:t>
             </w:r>
@@ -1436,7 +1389,7 @@
               <w:rPr>
                 <w:rFonts w:ascii="Times New Roman" w:hAnsi="Times New Roman" w:eastAsia="Times New Roman"/>
                 <w:b w:val="0"/>
-                <w:sz w:val="24"/>
+                <w:sz w:val="20"/>
               </w:rPr>
               <w:t>any</w:t>
             </w:r>
@@ -1451,7 +1404,7 @@
               <w:rPr>
                 <w:rFonts w:ascii="Times New Roman" w:hAnsi="Times New Roman" w:eastAsia="Times New Roman"/>
                 <w:b w:val="0"/>
-                <w:sz w:val="24"/>
+                <w:sz w:val="20"/>
               </w:rPr>
               <w:t>high_stakes or critical</w:t>
             </w:r>
@@ -1466,7 +1419,7 @@
               <w:rPr>
                 <w:rFonts w:ascii="Times New Roman" w:hAnsi="Times New Roman" w:eastAsia="Times New Roman"/>
                 <w:b w:val="0"/>
-                <w:sz w:val="24"/>
+                <w:sz w:val="20"/>
               </w:rPr>
               <w:t>Immediate escalation</w:t>
             </w:r>
@@ -1475,25 +1428,10 @@
       </w:tr>
     </w:tbl>
     <w:p>
-      <w:r>
-        <w:rPr>
-          <w:rFonts w:ascii="Times New Roman" w:hAnsi="Times New Roman" w:eastAsia="Times New Roman"/>
-          <w:b w:val="0"/>
-          <w:sz w:val="24"/>
-        </w:rPr>
-        <w:t>Learning loop: Human escalation resolutions captured as Q&amp;A pairs and embedded. Future queries search this learned set alongside documents.</w:t>
-      </w:r>
-    </w:p>
-    <w:p>
       <w:pPr>
-        <w:jc w:val="left"/>
+        <w:pStyle w:val="Heading2"/>
       </w:pPr>
       <w:r>
-        <w:rPr>
-          <w:rFonts w:ascii="Times New Roman" w:hAnsi="Times New Roman" w:eastAsia="Times New Roman"/>
-          <w:b/>
-          <w:sz w:val="24"/>
-        </w:rPr>
         <w:t>Key API Endpoints</w:t>
       </w:r>
     </w:p>
@@ -1519,7 +1457,7 @@
               <w:rPr>
                 <w:rFonts w:ascii="Times New Roman" w:hAnsi="Times New Roman" w:eastAsia="Times New Roman"/>
                 <w:b/>
-                <w:sz w:val="24"/>
+                <w:sz w:val="22"/>
               </w:rPr>
               <w:t>Endpoint</w:t>
             </w:r>
@@ -1534,7 +1472,7 @@
               <w:rPr>
                 <w:rFonts w:ascii="Times New Roman" w:hAnsi="Times New Roman" w:eastAsia="Times New Roman"/>
                 <w:b/>
-                <w:sz w:val="24"/>
+                <w:sz w:val="22"/>
               </w:rPr>
               <w:t>Method</w:t>
             </w:r>
@@ -1549,7 +1487,7 @@
               <w:rPr>
                 <w:rFonts w:ascii="Times New Roman" w:hAnsi="Times New Roman" w:eastAsia="Times New Roman"/>
                 <w:b/>
-                <w:sz w:val="24"/>
+                <w:sz w:val="22"/>
               </w:rPr>
               <w:t>Auth</w:t>
             </w:r>
@@ -1564,7 +1502,7 @@
               <w:rPr>
                 <w:rFonts w:ascii="Times New Roman" w:hAnsi="Times New Roman" w:eastAsia="Times New Roman"/>
                 <w:b/>
-                <w:sz w:val="24"/>
+                <w:sz w:val="22"/>
               </w:rPr>
               <w:t>Description</w:t>
             </w:r>
@@ -1581,7 +1519,7 @@
               <w:rPr>
                 <w:rFonts w:ascii="Times New Roman" w:hAnsi="Times New Roman" w:eastAsia="Times New Roman"/>
                 <w:b w:val="0"/>
-                <w:sz w:val="24"/>
+                <w:sz w:val="20"/>
               </w:rPr>
               <w:t>/api/v1/onboarding</w:t>
             </w:r>
@@ -1596,7 +1534,7 @@
               <w:rPr>
                 <w:rFonts w:ascii="Times New Roman" w:hAnsi="Times New Roman" w:eastAsia="Times New Roman"/>
                 <w:b w:val="0"/>
-                <w:sz w:val="24"/>
+                <w:sz w:val="20"/>
               </w:rPr>
               <w:t>POST</w:t>
             </w:r>
@@ -1611,7 +1549,7 @@
               <w:rPr>
                 <w:rFonts w:ascii="Times New Roman" w:hAnsi="Times New Roman" w:eastAsia="Times New Roman"/>
                 <w:b w:val="0"/>
-                <w:sz w:val="24"/>
+                <w:sz w:val="20"/>
               </w:rPr>
               <w:t>No</w:t>
             </w:r>
@@ -1626,7 +1564,7 @@
               <w:rPr>
                 <w:rFonts w:ascii="Times New Roman" w:hAnsi="Times New Roman" w:eastAsia="Times New Roman"/>
                 <w:b w:val="0"/>
-                <w:sz w:val="24"/>
+                <w:sz w:val="20"/>
               </w:rPr>
               <w:t>Create tenant, account, backup contact</w:t>
             </w:r>
@@ -1643,7 +1581,7 @@
               <w:rPr>
                 <w:rFonts w:ascii="Times New Roman" w:hAnsi="Times New Roman" w:eastAsia="Times New Roman"/>
                 <w:b w:val="0"/>
-                <w:sz w:val="24"/>
+                <w:sz w:val="20"/>
               </w:rPr>
               <w:t>/api/v1/auth/login</w:t>
             </w:r>
@@ -1658,7 +1596,7 @@
               <w:rPr>
                 <w:rFonts w:ascii="Times New Roman" w:hAnsi="Times New Roman" w:eastAsia="Times New Roman"/>
                 <w:b w:val="0"/>
-                <w:sz w:val="24"/>
+                <w:sz w:val="20"/>
               </w:rPr>
               <w:t>POST</w:t>
             </w:r>
@@ -1673,7 +1611,7 @@
               <w:rPr>
                 <w:rFonts w:ascii="Times New Roman" w:hAnsi="Times New Roman" w:eastAsia="Times New Roman"/>
                 <w:b w:val="0"/>
-                <w:sz w:val="24"/>
+                <w:sz w:val="20"/>
               </w:rPr>
               <w:t>No</w:t>
             </w:r>
@@ -1688,7 +1626,7 @@
               <w:rPr>
                 <w:rFonts w:ascii="Times New Roman" w:hAnsi="Times New Roman" w:eastAsia="Times New Roman"/>
                 <w:b w:val="0"/>
-                <w:sz w:val="24"/>
+                <w:sz w:val="20"/>
               </w:rPr>
               <w:t>Login → JWT cookie</w:t>
             </w:r>
@@ -1705,7 +1643,7 @@
               <w:rPr>
                 <w:rFonts w:ascii="Times New Roman" w:hAnsi="Times New Roman" w:eastAsia="Times New Roman"/>
                 <w:b w:val="0"/>
-                <w:sz w:val="24"/>
+                <w:sz w:val="20"/>
               </w:rPr>
               <w:t>/api/v1/portal/documents/upload</w:t>
             </w:r>
@@ -1720,7 +1658,7 @@
               <w:rPr>
                 <w:rFonts w:ascii="Times New Roman" w:hAnsi="Times New Roman" w:eastAsia="Times New Roman"/>
                 <w:b w:val="0"/>
-                <w:sz w:val="24"/>
+                <w:sz w:val="20"/>
               </w:rPr>
               <w:t>POST</w:t>
             </w:r>
@@ -1735,7 +1673,7 @@
               <w:rPr>
                 <w:rFonts w:ascii="Times New Roman" w:hAnsi="Times New Roman" w:eastAsia="Times New Roman"/>
                 <w:b w:val="0"/>
-                <w:sz w:val="24"/>
+                <w:sz w:val="20"/>
               </w:rPr>
               <w:t>Yes</w:t>
             </w:r>
@@ -1750,7 +1688,7 @@
               <w:rPr>
                 <w:rFonts w:ascii="Times New Roman" w:hAnsi="Times New Roman" w:eastAsia="Times New Roman"/>
                 <w:b w:val="0"/>
-                <w:sz w:val="24"/>
+                <w:sz w:val="20"/>
               </w:rPr>
               <w:t>Upload document</w:t>
             </w:r>
@@ -1767,7 +1705,7 @@
               <w:rPr>
                 <w:rFonts w:ascii="Times New Roman" w:hAnsi="Times New Roman" w:eastAsia="Times New Roman"/>
                 <w:b w:val="0"/>
-                <w:sz w:val="24"/>
+                <w:sz w:val="20"/>
               </w:rPr>
               <w:t>/api/v1/portal/documents/{id}</w:t>
             </w:r>
@@ -1782,7 +1720,7 @@
               <w:rPr>
                 <w:rFonts w:ascii="Times New Roman" w:hAnsi="Times New Roman" w:eastAsia="Times New Roman"/>
                 <w:b w:val="0"/>
-                <w:sz w:val="24"/>
+                <w:sz w:val="20"/>
               </w:rPr>
               <w:t>DELETE</w:t>
             </w:r>
@@ -1797,7 +1735,7 @@
               <w:rPr>
                 <w:rFonts w:ascii="Times New Roman" w:hAnsi="Times New Roman" w:eastAsia="Times New Roman"/>
                 <w:b w:val="0"/>
-                <w:sz w:val="24"/>
+                <w:sz w:val="20"/>
               </w:rPr>
               <w:t>Yes</w:t>
             </w:r>
@@ -1812,7 +1750,7 @@
               <w:rPr>
                 <w:rFonts w:ascii="Times New Roman" w:hAnsi="Times New Roman" w:eastAsia="Times New Roman"/>
                 <w:b w:val="0"/>
-                <w:sz w:val="24"/>
+                <w:sz w:val="20"/>
               </w:rPr>
               <w:t>Delete document</w:t>
             </w:r>
@@ -1829,7 +1767,7 @@
               <w:rPr>
                 <w:rFonts w:ascii="Times New Roman" w:hAnsi="Times New Roman" w:eastAsia="Times New Roman"/>
                 <w:b w:val="0"/>
-                <w:sz w:val="24"/>
+                <w:sz w:val="20"/>
               </w:rPr>
               <w:t>/api/v1/portal/escalations</w:t>
             </w:r>
@@ -1844,7 +1782,7 @@
               <w:rPr>
                 <w:rFonts w:ascii="Times New Roman" w:hAnsi="Times New Roman" w:eastAsia="Times New Roman"/>
                 <w:b w:val="0"/>
-                <w:sz w:val="24"/>
+                <w:sz w:val="20"/>
               </w:rPr>
               <w:t>GET</w:t>
             </w:r>
@@ -1859,7 +1797,7 @@
               <w:rPr>
                 <w:rFonts w:ascii="Times New Roman" w:hAnsi="Times New Roman" w:eastAsia="Times New Roman"/>
                 <w:b w:val="0"/>
-                <w:sz w:val="24"/>
+                <w:sz w:val="20"/>
               </w:rPr>
               <w:t>Yes</w:t>
             </w:r>
@@ -1874,7 +1812,7 @@
               <w:rPr>
                 <w:rFonts w:ascii="Times New Roman" w:hAnsi="Times New Roman" w:eastAsia="Times New Roman"/>
                 <w:b w:val="0"/>
-                <w:sz w:val="24"/>
+                <w:sz w:val="20"/>
               </w:rPr>
               <w:t>List escalations</w:t>
             </w:r>
@@ -1891,7 +1829,7 @@
               <w:rPr>
                 <w:rFonts w:ascii="Times New Roman" w:hAnsi="Times New Roman" w:eastAsia="Times New Roman"/>
                 <w:b w:val="0"/>
-                <w:sz w:val="24"/>
+                <w:sz w:val="20"/>
               </w:rPr>
               <w:t>/api/v1/portal/escalations/{id}/resolve</w:t>
             </w:r>
@@ -1906,7 +1844,7 @@
               <w:rPr>
                 <w:rFonts w:ascii="Times New Roman" w:hAnsi="Times New Roman" w:eastAsia="Times New Roman"/>
                 <w:b w:val="0"/>
-                <w:sz w:val="24"/>
+                <w:sz w:val="20"/>
               </w:rPr>
               <w:t>POST</w:t>
             </w:r>
@@ -1921,7 +1859,7 @@
               <w:rPr>
                 <w:rFonts w:ascii="Times New Roman" w:hAnsi="Times New Roman" w:eastAsia="Times New Roman"/>
                 <w:b w:val="0"/>
-                <w:sz w:val="24"/>
+                <w:sz w:val="20"/>
               </w:rPr>
               <w:t>Yes</w:t>
             </w:r>
@@ -1936,7 +1874,7 @@
               <w:rPr>
                 <w:rFonts w:ascii="Times New Roman" w:hAnsi="Times New Roman" w:eastAsia="Times New Roman"/>
                 <w:b w:val="0"/>
-                <w:sz w:val="24"/>
+                <w:sz w:val="20"/>
               </w:rPr>
               <w:t>Resolve escalation</w:t>
             </w:r>
@@ -1953,7 +1891,7 @@
               <w:rPr>
                 <w:rFonts w:ascii="Times New Roman" w:hAnsi="Times New Roman" w:eastAsia="Times New Roman"/>
                 <w:b w:val="0"/>
-                <w:sz w:val="24"/>
+                <w:sz w:val="20"/>
               </w:rPr>
               <w:t>/api/v1/email/inbound</w:t>
             </w:r>
@@ -1968,7 +1906,7 @@
               <w:rPr>
                 <w:rFonts w:ascii="Times New Roman" w:hAnsi="Times New Roman" w:eastAsia="Times New Roman"/>
                 <w:b w:val="0"/>
-                <w:sz w:val="24"/>
+                <w:sz w:val="20"/>
               </w:rPr>
               <w:t>POST</w:t>
             </w:r>
@@ -1983,7 +1921,7 @@
               <w:rPr>
                 <w:rFonts w:ascii="Times New Roman" w:hAnsi="Times New Roman" w:eastAsia="Times New Roman"/>
                 <w:b w:val="0"/>
-                <w:sz w:val="24"/>
+                <w:sz w:val="20"/>
               </w:rPr>
               <w:t>No</w:t>
             </w:r>
@@ -1998,7 +1936,7 @@
               <w:rPr>
                 <w:rFonts w:ascii="Times New Roman" w:hAnsi="Times New Roman" w:eastAsia="Times New Roman"/>
                 <w:b w:val="0"/>
-                <w:sz w:val="24"/>
+                <w:sz w:val="20"/>
               </w:rPr>
               <w:t>SendGrid webhook</w:t>
             </w:r>
@@ -2015,7 +1953,7 @@
               <w:rPr>
                 <w:rFonts w:ascii="Times New Roman" w:hAnsi="Times New Roman" w:eastAsia="Times New Roman"/>
                 <w:b w:val="0"/>
-                <w:sz w:val="24"/>
+                <w:sz w:val="20"/>
               </w:rPr>
               <w:t>/api/v1/whatsapp/inbound</w:t>
             </w:r>
@@ -2030,7 +1968,7 @@
               <w:rPr>
                 <w:rFonts w:ascii="Times New Roman" w:hAnsi="Times New Roman" w:eastAsia="Times New Roman"/>
                 <w:b w:val="0"/>
-                <w:sz w:val="24"/>
+                <w:sz w:val="20"/>
               </w:rPr>
               <w:t>POST</w:t>
             </w:r>
@@ -2045,7 +1983,7 @@
               <w:rPr>
                 <w:rFonts w:ascii="Times New Roman" w:hAnsi="Times New Roman" w:eastAsia="Times New Roman"/>
                 <w:b w:val="0"/>
-                <w:sz w:val="24"/>
+                <w:sz w:val="20"/>
               </w:rPr>
               <w:t>No</w:t>
             </w:r>
@@ -2060,7 +1998,7 @@
               <w:rPr>
                 <w:rFonts w:ascii="Times New Roman" w:hAnsi="Times New Roman" w:eastAsia="Times New Roman"/>
                 <w:b w:val="0"/>
-                <w:sz w:val="24"/>
+                <w:sz w:val="20"/>
               </w:rPr>
               <w:t>Meta webhook</w:t>
             </w:r>
@@ -2077,7 +2015,7 @@
               <w:rPr>
                 <w:rFonts w:ascii="Times New Roman" w:hAnsi="Times New Roman" w:eastAsia="Times New Roman"/>
                 <w:b w:val="0"/>
-                <w:sz w:val="24"/>
+                <w:sz w:val="20"/>
               </w:rPr>
               <w:t>/api/v1/billing/webhook</w:t>
             </w:r>
@@ -2092,7 +2030,7 @@
               <w:rPr>
                 <w:rFonts w:ascii="Times New Roman" w:hAnsi="Times New Roman" w:eastAsia="Times New Roman"/>
                 <w:b w:val="0"/>
-                <w:sz w:val="24"/>
+                <w:sz w:val="20"/>
               </w:rPr>
               <w:t>POST</w:t>
             </w:r>
@@ -2107,7 +2045,7 @@
               <w:rPr>
                 <w:rFonts w:ascii="Times New Roman" w:hAnsi="Times New Roman" w:eastAsia="Times New Roman"/>
                 <w:b w:val="0"/>
-                <w:sz w:val="24"/>
+                <w:sz w:val="20"/>
               </w:rPr>
               <w:t>No</w:t>
             </w:r>
@@ -2122,7 +2060,7 @@
               <w:rPr>
                 <w:rFonts w:ascii="Times New Roman" w:hAnsi="Times New Roman" w:eastAsia="Times New Roman"/>
                 <w:b w:val="0"/>
-                <w:sz w:val="24"/>
+                <w:sz w:val="20"/>
               </w:rPr>
               <w:t>Stripe webhook</w:t>
             </w:r>
@@ -2139,7 +2077,7 @@
               <w:rPr>
                 <w:rFonts w:ascii="Times New Roman" w:hAnsi="Times New Roman" w:eastAsia="Times New Roman"/>
                 <w:b w:val="0"/>
-                <w:sz w:val="24"/>
+                <w:sz w:val="20"/>
               </w:rPr>
               <w:t>/api/v1/portal/upgrade</w:t>
             </w:r>
@@ -2154,7 +2092,7 @@
               <w:rPr>
                 <w:rFonts w:ascii="Times New Roman" w:hAnsi="Times New Roman" w:eastAsia="Times New Roman"/>
                 <w:b w:val="0"/>
-                <w:sz w:val="24"/>
+                <w:sz w:val="20"/>
               </w:rPr>
               <w:t>POST</w:t>
             </w:r>
@@ -2169,7 +2107,7 @@
               <w:rPr>
                 <w:rFonts w:ascii="Times New Roman" w:hAnsi="Times New Roman" w:eastAsia="Times New Roman"/>
                 <w:b w:val="0"/>
-                <w:sz w:val="24"/>
+                <w:sz w:val="20"/>
               </w:rPr>
               <w:t>Yes</w:t>
             </w:r>
@@ -2184,7 +2122,7 @@
               <w:rPr>
                 <w:rFonts w:ascii="Times New Roman" w:hAnsi="Times New Roman" w:eastAsia="Times New Roman"/>
                 <w:b w:val="0"/>
-                <w:sz w:val="24"/>
+                <w:sz w:val="20"/>
               </w:rPr>
               <w:t>Stripe checkout</w:t>
             </w:r>
@@ -2194,15 +2132,10 @@
     </w:tbl>
     <w:p>
       <w:pPr>
-        <w:jc w:val="left"/>
+        <w:pStyle w:val="Heading2"/>
       </w:pPr>
       <w:r>
-        <w:rPr>
-          <w:rFonts w:ascii="Times New Roman" w:hAnsi="Times New Roman" w:eastAsia="Times New Roman"/>
-          <w:b/>
-          <w:sz w:val="24"/>
-        </w:rPr>
-        <w:t>Environment Variables (Required)</w:t>
+        <w:t>Required Environment Variables</w:t>
       </w:r>
     </w:p>
     <w:tbl>
@@ -2225,7 +2158,7 @@
               <w:rPr>
                 <w:rFonts w:ascii="Times New Roman" w:hAnsi="Times New Roman" w:eastAsia="Times New Roman"/>
                 <w:b/>
-                <w:sz w:val="24"/>
+                <w:sz w:val="22"/>
               </w:rPr>
               <w:t>Variable</w:t>
             </w:r>
@@ -2240,7 +2173,7 @@
               <w:rPr>
                 <w:rFonts w:ascii="Times New Roman" w:hAnsi="Times New Roman" w:eastAsia="Times New Roman"/>
                 <w:b/>
-                <w:sz w:val="24"/>
+                <w:sz w:val="22"/>
               </w:rPr>
               <w:t>Description</w:t>
             </w:r>
@@ -2257,7 +2190,7 @@
               <w:rPr>
                 <w:rFonts w:ascii="Times New Roman" w:hAnsi="Times New Roman" w:eastAsia="Times New Roman"/>
                 <w:b w:val="0"/>
-                <w:sz w:val="24"/>
+                <w:sz w:val="20"/>
               </w:rPr>
               <w:t>DATABASE_URL</w:t>
             </w:r>
@@ -2272,7 +2205,7 @@
               <w:rPr>
                 <w:rFonts w:ascii="Times New Roman" w:hAnsi="Times New Roman" w:eastAsia="Times New Roman"/>
                 <w:b w:val="0"/>
-                <w:sz w:val="24"/>
+                <w:sz w:val="20"/>
               </w:rPr>
               <w:t>PostgreSQL connection string</w:t>
             </w:r>
@@ -2289,7 +2222,7 @@
               <w:rPr>
                 <w:rFonts w:ascii="Times New Roman" w:hAnsi="Times New Roman" w:eastAsia="Times New Roman"/>
                 <w:b w:val="0"/>
-                <w:sz w:val="24"/>
+                <w:sz w:val="20"/>
               </w:rPr>
               <w:t>JWT_SECRET</w:t>
             </w:r>
@@ -2304,7 +2237,7 @@
               <w:rPr>
                 <w:rFonts w:ascii="Times New Roman" w:hAnsi="Times New Roman" w:eastAsia="Times New Roman"/>
                 <w:b w:val="0"/>
-                <w:sz w:val="24"/>
+                <w:sz w:val="20"/>
               </w:rPr>
               <w:t>JWT signing secret (min 32 chars)</w:t>
             </w:r>
@@ -2321,7 +2254,7 @@
               <w:rPr>
                 <w:rFonts w:ascii="Times New Roman" w:hAnsi="Times New Roman" w:eastAsia="Times New Roman"/>
                 <w:b w:val="0"/>
-                <w:sz w:val="24"/>
+                <w:sz w:val="20"/>
               </w:rPr>
               <w:t>ENCRYPTION_MASTER_KEY</w:t>
             </w:r>
@@ -2336,7 +2269,7 @@
               <w:rPr>
                 <w:rFonts w:ascii="Times New Roman" w:hAnsi="Times New Roman" w:eastAsia="Times New Roman"/>
                 <w:b w:val="0"/>
-                <w:sz w:val="24"/>
+                <w:sz w:val="20"/>
               </w:rPr>
               <w:t>Base64 32-byte key for PII encryption</w:t>
             </w:r>
@@ -2353,7 +2286,7 @@
               <w:rPr>
                 <w:rFonts w:ascii="Times New Roman" w:hAnsi="Times New Roman" w:eastAsia="Times New Roman"/>
                 <w:b w:val="0"/>
-                <w:sz w:val="24"/>
+                <w:sz w:val="20"/>
               </w:rPr>
               <w:t>APP_ENV</w:t>
             </w:r>
@@ -2368,7 +2301,7 @@
               <w:rPr>
                 <w:rFonts w:ascii="Times New Roman" w:hAnsi="Times New Roman" w:eastAsia="Times New Roman"/>
                 <w:b w:val="0"/>
-                <w:sz w:val="24"/>
+                <w:sz w:val="20"/>
               </w:rPr>
               <w:t>production on Vercel</w:t>
             </w:r>
@@ -2385,7 +2318,7 @@
               <w:rPr>
                 <w:rFonts w:ascii="Times New Roman" w:hAnsi="Times New Roman" w:eastAsia="Times New Roman"/>
                 <w:b w:val="0"/>
-                <w:sz w:val="24"/>
+                <w:sz w:val="20"/>
               </w:rPr>
               <w:t>OPENAI_API_KEY</w:t>
             </w:r>
@@ -2400,7 +2333,7 @@
               <w:rPr>
                 <w:rFonts w:ascii="Times New Roman" w:hAnsi="Times New Roman" w:eastAsia="Times New Roman"/>
                 <w:b w:val="0"/>
-                <w:sz w:val="24"/>
+                <w:sz w:val="20"/>
               </w:rPr>
               <w:t>Enables semantic embeddings (optional; costs apply)</w:t>
             </w:r>
@@ -2417,7 +2350,7 @@
               <w:rPr>
                 <w:rFonts w:ascii="Times New Roman" w:hAnsi="Times New Roman" w:eastAsia="Times New Roman"/>
                 <w:b w:val="0"/>
-                <w:sz w:val="24"/>
+                <w:sz w:val="20"/>
               </w:rPr>
               <w:t>SENDGRID_API_KEY</w:t>
             </w:r>
@@ -2432,7 +2365,7 @@
               <w:rPr>
                 <w:rFonts w:ascii="Times New Roman" w:hAnsi="Times New Roman" w:eastAsia="Times New Roman"/>
                 <w:b w:val="0"/>
-                <w:sz w:val="24"/>
+                <w:sz w:val="20"/>
               </w:rPr>
               <w:t>For email</w:t>
             </w:r>
@@ -2449,7 +2382,7 @@
               <w:rPr>
                 <w:rFonts w:ascii="Times New Roman" w:hAnsi="Times New Roman" w:eastAsia="Times New Roman"/>
                 <w:b w:val="0"/>
-                <w:sz w:val="24"/>
+                <w:sz w:val="20"/>
               </w:rPr>
               <w:t>STRIPE_API_KEY</w:t>
             </w:r>
@@ -2464,7 +2397,7 @@
               <w:rPr>
                 <w:rFonts w:ascii="Times New Roman" w:hAnsi="Times New Roman" w:eastAsia="Times New Roman"/>
                 <w:b w:val="0"/>
-                <w:sz w:val="24"/>
+                <w:sz w:val="20"/>
               </w:rPr>
               <w:t>For billing</w:t>
             </w:r>
@@ -2481,7 +2414,7 @@
               <w:rPr>
                 <w:rFonts w:ascii="Times New Roman" w:hAnsi="Times New Roman" w:eastAsia="Times New Roman"/>
                 <w:b w:val="0"/>
-                <w:sz w:val="24"/>
+                <w:sz w:val="20"/>
               </w:rPr>
               <w:t>WHATSAPP_ACCESS_TOKEN</w:t>
             </w:r>
@@ -2496,7 +2429,7 @@
               <w:rPr>
                 <w:rFonts w:ascii="Times New Roman" w:hAnsi="Times New Roman" w:eastAsia="Times New Roman"/>
                 <w:b w:val="0"/>
-                <w:sz w:val="24"/>
+                <w:sz w:val="20"/>
               </w:rPr>
               <w:t>For WhatsApp</w:t>
             </w:r>
@@ -2505,29 +2438,30 @@
       </w:tr>
     </w:tbl>
     <w:p>
+      <w:pPr>
+        <w:spacing w:before="0" w:after="0"/>
+      </w:pPr>
       <w:r>
         <w:rPr>
           <w:rFonts w:ascii="Times New Roman" w:hAnsi="Times New Roman" w:eastAsia="Times New Roman"/>
           <w:b w:val="0"/>
           <w:sz w:val="24"/>
         </w:rPr>
-        <w:t>PostgreSQL + pgvector is required. SQLite cannot be used — hybrid RAG (70% vector + 30% BM25) requires pgvector. Managed instances available from Supabase, Neon, or Render from ~SGD 5/month.</w:t>
+        <w:t>PostgreSQL + pgvector is required — managed instances from ~SGD 5/month. SQLite cannot support hybrid RAG (70% vector + 30% BM25).</w:t>
       </w:r>
     </w:p>
     <w:p>
       <w:pPr>
-        <w:jc w:val="left"/>
+        <w:pStyle w:val="Heading2"/>
       </w:pPr>
       <w:r>
-        <w:rPr>
-          <w:rFonts w:ascii="Times New Roman" w:hAnsi="Times New Roman" w:eastAsia="Times New Roman"/>
-          <w:b/>
-          <w:sz w:val="24"/>
-        </w:rPr>
         <w:t>WhatsApp Constraints</w:t>
       </w:r>
     </w:p>
     <w:p>
+      <w:pPr>
+        <w:spacing w:before="0" w:after="0"/>
+      </w:pPr>
       <w:r>
         <w:rPr>
           <w:rFonts w:ascii="Times New Roman" w:hAnsi="Times New Roman" w:eastAsia="Times New Roman"/>
@@ -2539,33 +2473,24 @@
     </w:p>
     <w:p>
       <w:pPr>
-        <w:jc w:val="left"/>
+        <w:pStyle w:val="Heading1"/>
       </w:pPr>
       <w:r>
-        <w:rPr>
-          <w:rFonts w:ascii="Times New Roman" w:hAnsi="Times New Roman" w:eastAsia="Times New Roman"/>
-          <w:b/>
-          <w:sz w:val="28"/>
-        </w:rPr>
         <w:t>5. Developer Guide</w:t>
       </w:r>
     </w:p>
     <w:p>
       <w:pPr>
-        <w:jc w:val="left"/>
+        <w:pStyle w:val="Heading2"/>
       </w:pPr>
       <w:r>
-        <w:rPr>
-          <w:rFonts w:ascii="Times New Roman" w:hAnsi="Times New Roman" w:eastAsia="Times New Roman"/>
-          <w:b/>
-          <w:sz w:val="24"/>
-        </w:rPr>
         <w:t>First-Read Files</w:t>
       </w:r>
     </w:p>
     <w:p>
       <w:pPr>
         <w:pStyle w:val="ListBullet"/>
+        <w:spacing w:before="0" w:after="0"/>
       </w:pPr>
       <w:r>
         <w:rPr>
@@ -2579,6 +2504,7 @@
     <w:p>
       <w:pPr>
         <w:pStyle w:val="ListBullet"/>
+        <w:spacing w:before="0" w:after="0"/>
       </w:pPr>
       <w:r>
         <w:rPr>
@@ -2592,6 +2518,7 @@
     <w:p>
       <w:pPr>
         <w:pStyle w:val="ListBullet"/>
+        <w:spacing w:before="0" w:after="0"/>
       </w:pPr>
       <w:r>
         <w:rPr>
@@ -2605,6 +2532,7 @@
     <w:p>
       <w:pPr>
         <w:pStyle w:val="ListBullet"/>
+        <w:spacing w:before="0" w:after="0"/>
       </w:pPr>
       <w:r>
         <w:rPr>
@@ -2618,6 +2546,7 @@
     <w:p>
       <w:pPr>
         <w:pStyle w:val="ListBullet"/>
+        <w:spacing w:before="0" w:after="0"/>
       </w:pPr>
       <w:r>
         <w:rPr>
@@ -2630,25 +2559,21 @@
     </w:p>
     <w:p>
       <w:pPr>
-        <w:jc w:val="left"/>
+        <w:pStyle w:val="Heading2"/>
       </w:pPr>
       <w:r>
-        <w:rPr>
-          <w:rFonts w:ascii="Times New Roman" w:hAnsi="Times New Roman" w:eastAsia="Times New Roman"/>
-          <w:b/>
-          <w:sz w:val="24"/>
-        </w:rPr>
         <w:t>Local Setup</w:t>
       </w:r>
     </w:p>
     <w:p>
       <w:pPr>
-        <w:ind w:left="432"/>
+        <w:ind w:left="360"/>
+        <w:spacing w:before="0" w:after="0"/>
       </w:pPr>
       <w:r>
         <w:rPr>
           <w:rFonts w:ascii="Courier New" w:hAnsi="Courier New"/>
-          <w:sz w:val="20"/>
+          <w:sz w:val="18"/>
         </w:rPr>
         <w:t>uv venv &amp;&amp; uv sync</w:t>
         <w:br/>
@@ -2661,25 +2586,21 @@
     </w:p>
     <w:p>
       <w:pPr>
-        <w:jc w:val="left"/>
+        <w:pStyle w:val="Heading2"/>
       </w:pPr>
       <w:r>
-        <w:rPr>
-          <w:rFonts w:ascii="Times New Roman" w:hAnsi="Times New Roman" w:eastAsia="Times New Roman"/>
-          <w:b/>
-          <w:sz w:val="24"/>
-        </w:rPr>
         <w:t>Docker (Self-Hosting)</w:t>
       </w:r>
     </w:p>
     <w:p>
       <w:pPr>
-        <w:ind w:left="432"/>
+        <w:ind w:left="360"/>
+        <w:spacing w:before="0" w:after="0"/>
       </w:pPr>
       <w:r>
         <w:rPr>
           <w:rFonts w:ascii="Courier New" w:hAnsi="Courier New"/>
-          <w:sz w:val="20"/>
+          <w:sz w:val="18"/>
         </w:rPr>
         <w:t>docker build -t sequor .</w:t>
         <w:br/>
@@ -2704,76 +2625,9 @@
     </w:p>
     <w:p>
       <w:pPr>
-        <w:jc w:val="left"/>
+        <w:pStyle w:val="Heading2"/>
       </w:pPr>
       <w:r>
-        <w:rPr>
-          <w:rFonts w:ascii="Times New Roman" w:hAnsi="Times New Roman" w:eastAsia="Times New Roman"/>
-          <w:b/>
-          <w:sz w:val="24"/>
-        </w:rPr>
-        <w:t>CI/CD — Add to .github/workflows/deploy.yml</w:t>
-      </w:r>
-    </w:p>
-    <w:p>
-      <w:pPr>
-        <w:ind w:left="432"/>
-      </w:pPr>
-      <w:r>
-        <w:rPr>
-          <w:rFonts w:ascii="Courier New" w:hAnsi="Courier New"/>
-          <w:sz w:val="20"/>
-        </w:rPr>
-        <w:t>jobs:</w:t>
-        <w:br/>
-        <w:t xml:space="preserve">  test:</w:t>
-        <w:br/>
-        <w:t xml:space="preserve">    runs-on: ubuntu-latest</w:t>
-        <w:br/>
-        <w:t xml:space="preserve">    steps:</w:t>
-        <w:br/>
-        <w:t xml:space="preserve">      - uses: actions/checkout@v4</w:t>
-        <w:br/>
-        <w:t xml:space="preserve">      - uses: actions/setup-python@v5</w:t>
-        <w:br/>
-        <w:t xml:space="preserve">        with: python-version: '3.13'</w:t>
-        <w:br/>
-        <w:t xml:space="preserve">      - run: pip install uv &amp;&amp; uv sync &amp;&amp; uv run pytest tests/ -x</w:t>
-        <w:br/>
-        <w:br/>
-        <w:t xml:space="preserve">  deploy-vercel:</w:t>
-        <w:br/>
-        <w:t xml:space="preserve">    needs: test</w:t>
-        <w:br/>
-        <w:t xml:space="preserve">    runs-on: ubuntu-latest</w:t>
-        <w:br/>
-        <w:t xml:space="preserve">    steps:</w:t>
-        <w:br/>
-        <w:t xml:space="preserve">      - uses: actions/checkout@v4</w:t>
-        <w:br/>
-        <w:t xml:space="preserve">      - uses: amondnet/vercel-action@v25</w:t>
-        <w:br/>
-        <w:t xml:space="preserve">        with:</w:t>
-        <w:br/>
-        <w:t xml:space="preserve">          vercel-token: ${{ secrets.VERCEL_TOKEN }}</w:t>
-        <w:br/>
-        <w:t xml:space="preserve">          vercel-org-id: ${{ secrets.VERCEL_ORG_ID }}</w:t>
-        <w:br/>
-        <w:t xml:space="preserve">          vercel-project-id: ${{ secrets.VERCEL_PROJECT_ID }}</w:t>
-        <w:br/>
-        <w:t xml:space="preserve">          vercel-args: '--prod'</w:t>
-      </w:r>
-    </w:p>
-    <w:p>
-      <w:pPr>
-        <w:jc w:val="left"/>
-      </w:pPr>
-      <w:r>
-        <w:rPr>
-          <w:rFonts w:ascii="Times New Roman" w:hAnsi="Times New Roman" w:eastAsia="Times New Roman"/>
-          <w:b/>
-          <w:sz w:val="24"/>
-        </w:rPr>
         <w:t>Debugging</w:t>
       </w:r>
     </w:p>
@@ -2797,7 +2651,7 @@
               <w:rPr>
                 <w:rFonts w:ascii="Times New Roman" w:hAnsi="Times New Roman" w:eastAsia="Times New Roman"/>
                 <w:b/>
-                <w:sz w:val="24"/>
+                <w:sz w:val="22"/>
               </w:rPr>
               <w:t>Problem</w:t>
             </w:r>
@@ -2812,7 +2666,7 @@
               <w:rPr>
                 <w:rFonts w:ascii="Times New Roman" w:hAnsi="Times New Roman" w:eastAsia="Times New Roman"/>
                 <w:b/>
-                <w:sz w:val="24"/>
+                <w:sz w:val="22"/>
               </w:rPr>
               <w:t>Check</w:t>
             </w:r>
@@ -2829,7 +2683,7 @@
               <w:rPr>
                 <w:rFonts w:ascii="Times New Roman" w:hAnsi="Times New Roman" w:eastAsia="Times New Roman"/>
                 <w:b w:val="0"/>
-                <w:sz w:val="24"/>
+                <w:sz w:val="20"/>
               </w:rPr>
               <w:t>Documents stuck at Indexing</w:t>
             </w:r>
@@ -2844,7 +2698,7 @@
               <w:rPr>
                 <w:rFonts w:ascii="Times New Roman" w:hAnsi="Times New Roman" w:eastAsia="Times New Roman"/>
                 <w:b w:val="0"/>
-                <w:sz w:val="24"/>
+                <w:sz w:val="20"/>
               </w:rPr>
               <w:t>UPDATE documents SET status='ready' WHERE status='indexing';</w:t>
             </w:r>
@@ -2861,7 +2715,7 @@
               <w:rPr>
                 <w:rFonts w:ascii="Times New Roman" w:hAnsi="Times New Roman" w:eastAsia="Times New Roman"/>
                 <w:b w:val="0"/>
-                <w:sz w:val="24"/>
+                <w:sz w:val="20"/>
               </w:rPr>
               <w:t>Auto-replies not sending</w:t>
             </w:r>
@@ -2876,9 +2730,9 @@
               <w:rPr>
                 <w:rFonts w:ascii="Times New Roman" w:hAnsi="Times New Roman" w:eastAsia="Times New Roman"/>
                 <w:b w:val="0"/>
-                <w:sz w:val="24"/>
+                <w:sz w:val="20"/>
               </w:rPr>
-              <w:t>Ollama running (curl localhost:11434/api/tags); OPENAI_API_KEY set on Vercel</w:t>
+              <w:t>Ollama running (curl localhost:11434/api/tags); OPENAI_API_KEY set</w:t>
             </w:r>
           </w:p>
         </w:tc>
@@ -2893,7 +2747,7 @@
               <w:rPr>
                 <w:rFonts w:ascii="Times New Roman" w:hAnsi="Times New Roman" w:eastAsia="Times New Roman"/>
                 <w:b w:val="0"/>
-                <w:sz w:val="24"/>
+                <w:sz w:val="20"/>
               </w:rPr>
               <w:t>Escalations not arriving</w:t>
             </w:r>
@@ -2908,7 +2762,7 @@
               <w:rPr>
                 <w:rFonts w:ascii="Times New Roman" w:hAnsi="Times New Roman" w:eastAsia="Times New Roman"/>
                 <w:b w:val="0"/>
-                <w:sz w:val="24"/>
+                <w:sz w:val="20"/>
               </w:rPr>
               <w:t>Backup contact email valid; SLA scheduler running</w:t>
             </w:r>
@@ -2925,7 +2779,7 @@
               <w:rPr>
                 <w:rFonts w:ascii="Times New Roman" w:hAnsi="Times New Roman" w:eastAsia="Times New Roman"/>
                 <w:b w:val="0"/>
-                <w:sz w:val="24"/>
+                <w:sz w:val="20"/>
               </w:rPr>
               <w:t>Webhooks not reaching app</w:t>
             </w:r>
@@ -2940,9 +2794,9 @@
               <w:rPr>
                 <w:rFonts w:ascii="Times New Roman" w:hAnsi="Times New Roman" w:eastAsia="Times New Roman"/>
                 <w:b w:val="0"/>
-                <w:sz w:val="24"/>
+                <w:sz w:val="20"/>
               </w:rPr>
-              <w:t>SendGrid/Meta webhook URL points to https://your-domain/api/v1/{channel}/inbound</w:t>
+              <w:t>SendGrid/Meta webhook URL → https://your-domain/api/v1/{channel}/inbound</w:t>
             </w:r>
           </w:p>
         </w:tc>
@@ -2950,60 +2804,51 @@
     </w:tbl>
     <w:p>
       <w:pPr>
-        <w:jc w:val="left"/>
+        <w:pStyle w:val="Heading2"/>
       </w:pPr>
       <w:r>
-        <w:rPr>
-          <w:rFonts w:ascii="Times New Roman" w:hAnsi="Times New Roman" w:eastAsia="Times New Roman"/>
-          <w:b/>
-          <w:sz w:val="24"/>
-        </w:rPr>
         <w:t>Observability</w:t>
       </w:r>
     </w:p>
     <w:p>
+      <w:pPr>
+        <w:spacing w:before="0" w:after="0"/>
+      </w:pPr>
       <w:r>
         <w:rPr>
           <w:rFonts w:ascii="Times New Roman" w:hAnsi="Times New Roman" w:eastAsia="Times New Roman"/>
           <w:b w:val="0"/>
           <w:sz w:val="24"/>
         </w:rPr>
-        <w:t>Structured logs via structlog. Namespaces: ollama.*, email.*, whatsapp.*, escalation.*, rag.*. Set LOG_LEVEL=DEBUG for verbose output. For error reporting: add sentry-sdk to app.py lifespan.</w:t>
+        <w:t>Structured logs via structlog. Namespaces: ollama.*, email.*, whatsapp.*, escalation.*, rag.*. Set LOG_LEVEL=DEBUG for verbose output.</w:t>
       </w:r>
     </w:p>
     <w:p>
       <w:pPr>
-        <w:jc w:val="left"/>
+        <w:pStyle w:val="Heading1"/>
       </w:pPr>
       <w:r>
-        <w:rPr>
-          <w:rFonts w:ascii="Times New Roman" w:hAnsi="Times New Roman" w:eastAsia="Times New Roman"/>
-          <w:b/>
-          <w:sz w:val="28"/>
-        </w:rPr>
         <w:t>6. Pre-Launch Checklist</w:t>
       </w:r>
     </w:p>
     <w:p>
+      <w:pPr>
+        <w:spacing w:before="0" w:after="0"/>
+      </w:pPr>
       <w:r>
         <w:rPr>
           <w:rFonts w:ascii="Times New Roman" w:hAnsi="Times New Roman" w:eastAsia="Times New Roman"/>
           <w:b w:val="0"/>
           <w:sz w:val="24"/>
         </w:rPr>
-        <w:t>Items identified in a codebase audit. All critical and high items must be resolved before production traffic.</w:t>
+        <w:t>Items from codebase audit. Critical and high items must be resolved before production traffic.</w:t>
       </w:r>
     </w:p>
     <w:p>
       <w:pPr>
-        <w:jc w:val="left"/>
+        <w:pStyle w:val="Heading2"/>
       </w:pPr>
       <w:r>
-        <w:rPr>
-          <w:rFonts w:ascii="Times New Roman" w:hAnsi="Times New Roman" w:eastAsia="Times New Roman"/>
-          <w:b/>
-          <w:sz w:val="24"/>
-        </w:rPr>
         <w:t>Critical — Must Fix Before Any User Traffic</w:t>
       </w:r>
     </w:p>
@@ -3028,7 +2873,7 @@
               <w:rPr>
                 <w:rFonts w:ascii="Times New Roman" w:hAnsi="Times New Roman" w:eastAsia="Times New Roman"/>
                 <w:b/>
-                <w:sz w:val="24"/>
+                <w:sz w:val="22"/>
               </w:rPr>
               <w:t>#</w:t>
             </w:r>
@@ -3043,7 +2888,7 @@
               <w:rPr>
                 <w:rFonts w:ascii="Times New Roman" w:hAnsi="Times New Roman" w:eastAsia="Times New Roman"/>
                 <w:b/>
-                <w:sz w:val="24"/>
+                <w:sz w:val="22"/>
               </w:rPr>
               <w:t>Gap</w:t>
             </w:r>
@@ -3058,7 +2903,7 @@
               <w:rPr>
                 <w:rFonts w:ascii="Times New Roman" w:hAnsi="Times New Roman" w:eastAsia="Times New Roman"/>
                 <w:b/>
-                <w:sz w:val="24"/>
+                <w:sz w:val="22"/>
               </w:rPr>
               <w:t>Fix</w:t>
             </w:r>
@@ -3075,7 +2920,7 @@
               <w:rPr>
                 <w:rFonts w:ascii="Times New Roman" w:hAnsi="Times New Roman" w:eastAsia="Times New Roman"/>
                 <w:b w:val="0"/>
-                <w:sz w:val="24"/>
+                <w:sz w:val="20"/>
               </w:rPr>
               <w:t>1</w:t>
             </w:r>
@@ -3090,9 +2935,9 @@
               <w:rPr>
                 <w:rFonts w:ascii="Times New Roman" w:hAnsi="Times New Roman" w:eastAsia="Times New Roman"/>
                 <w:b w:val="0"/>
-                <w:sz w:val="24"/>
+                <w:sz w:val="20"/>
               </w:rPr>
-              <w:t>SLA scheduler never starts — create_scheduler() defined but never called. Breach detection and second-tier escalation never fire.</w:t>
+              <w:t>SLA scheduler never starts — create_scheduler() never called. Breach detection and second-tier escalation never fire.</w:t>
             </w:r>
           </w:p>
         </w:tc>
@@ -3105,7 +2950,7 @@
               <w:rPr>
                 <w:rFonts w:ascii="Times New Roman" w:hAnsi="Times New Roman" w:eastAsia="Times New Roman"/>
                 <w:b w:val="0"/>
-                <w:sz w:val="24"/>
+                <w:sz w:val="20"/>
               </w:rPr>
               <w:t>Add scheduler to FastAPI lifespan in onboarding/app.py</w:t>
             </w:r>
@@ -3122,7 +2967,7 @@
               <w:rPr>
                 <w:rFonts w:ascii="Times New Roman" w:hAnsi="Times New Roman" w:eastAsia="Times New Roman"/>
                 <w:b w:val="0"/>
-                <w:sz w:val="24"/>
+                <w:sz w:val="20"/>
               </w:rPr>
               <w:t>2</w:t>
             </w:r>
@@ -3137,9 +2982,9 @@
               <w:rPr>
                 <w:rFonts w:ascii="Times New Roman" w:hAnsi="Times New Roman" w:eastAsia="Times New Roman"/>
                 <w:b w:val="0"/>
-                <w:sz w:val="24"/>
+                <w:sz w:val="20"/>
               </w:rPr>
-              <w:t>JWT dev-secret fallback — if JWT_SECRET unset, falls back to 'dev-secret-change-in-production'. Tokens can be forged.</w:t>
+              <w:t>JWT dev-secret fallback — unset JWT_SECRET falls back to 'dev-secret'. Tokens can be forged.</w:t>
             </w:r>
           </w:p>
         </w:tc>
@@ -3152,7 +2997,7 @@
               <w:rPr>
                 <w:rFonts w:ascii="Times New Roman" w:hAnsi="Times New Roman" w:eastAsia="Times New Roman"/>
                 <w:b w:val="0"/>
-                <w:sz w:val="24"/>
+                <w:sz w:val="20"/>
               </w:rPr>
               <w:t>Remove fallback in auth.py:54-64; raise on startup</w:t>
             </w:r>
@@ -3169,7 +3014,7 @@
               <w:rPr>
                 <w:rFonts w:ascii="Times New Roman" w:hAnsi="Times New Roman" w:eastAsia="Times New Roman"/>
                 <w:b w:val="0"/>
-                <w:sz w:val="24"/>
+                <w:sz w:val="20"/>
               </w:rPr>
               <w:t>3</w:t>
             </w:r>
@@ -3184,7 +3029,7 @@
               <w:rPr>
                 <w:rFonts w:ascii="Times New Roman" w:hAnsi="Times New Roman" w:eastAsia="Times New Roman"/>
                 <w:b w:val="0"/>
-                <w:sz w:val="24"/>
+                <w:sz w:val="20"/>
               </w:rPr>
               <w:t>PDPA erasure leaves Message.body_text — customer message body remains after erasure request.</w:t>
             </w:r>
@@ -3199,7 +3044,7 @@
               <w:rPr>
                 <w:rFonts w:ascii="Times New Roman" w:hAnsi="Times New Roman" w:eastAsia="Times New Roman"/>
                 <w:b w:val="0"/>
-                <w:sz w:val="24"/>
+                <w:sz w:val="20"/>
               </w:rPr>
               <w:t>Add body_text nullification in compliance.py:133-140</w:t>
             </w:r>
@@ -3216,7 +3061,7 @@
               <w:rPr>
                 <w:rFonts w:ascii="Times New Roman" w:hAnsi="Times New Roman" w:eastAsia="Times New Roman"/>
                 <w:b w:val="0"/>
-                <w:sz w:val="24"/>
+                <w:sz w:val="20"/>
               </w:rPr>
               <w:t>4</w:t>
             </w:r>
@@ -3231,9 +3076,9 @@
               <w:rPr>
                 <w:rFonts w:ascii="Times New Roman" w:hAnsi="Times New Roman" w:eastAsia="Times New Roman"/>
                 <w:b w:val="0"/>
-                <w:sz w:val="24"/>
+                <w:sz w:val="20"/>
               </w:rPr>
-              <w:t>Plan limits not enforced — free tier 50-message limit is display-only. No rejection or upgrade prompt.</w:t>
+              <w:t>Plan limits not enforced — free tier 50-message limit is display-only.</w:t>
             </w:r>
           </w:p>
         </w:tc>
@@ -3246,7 +3091,7 @@
               <w:rPr>
                 <w:rFonts w:ascii="Times New Roman" w:hAnsi="Times New Roman" w:eastAsia="Times New Roman"/>
                 <w:b w:val="0"/>
-                <w:sz w:val="24"/>
+                <w:sz w:val="20"/>
               </w:rPr>
               <w:t>Add limit check in email/WhatsApp inbound handlers</w:t>
             </w:r>
@@ -3256,14 +3101,9 @@
     </w:tbl>
     <w:p>
       <w:pPr>
-        <w:jc w:val="left"/>
+        <w:pStyle w:val="Heading2"/>
       </w:pPr>
       <w:r>
-        <w:rPr>
-          <w:rFonts w:ascii="Times New Roman" w:hAnsi="Times New Roman" w:eastAsia="Times New Roman"/>
-          <w:b/>
-          <w:sz w:val="24"/>
-        </w:rPr>
         <w:t>High — Should Fix Before Launch</w:t>
       </w:r>
     </w:p>
@@ -3288,7 +3128,7 @@
               <w:rPr>
                 <w:rFonts w:ascii="Times New Roman" w:hAnsi="Times New Roman" w:eastAsia="Times New Roman"/>
                 <w:b/>
-                <w:sz w:val="24"/>
+                <w:sz w:val="22"/>
               </w:rPr>
               <w:t>#</w:t>
             </w:r>
@@ -3303,7 +3143,7 @@
               <w:rPr>
                 <w:rFonts w:ascii="Times New Roman" w:hAnsi="Times New Roman" w:eastAsia="Times New Roman"/>
                 <w:b/>
-                <w:sz w:val="24"/>
+                <w:sz w:val="22"/>
               </w:rPr>
               <w:t>Gap</w:t>
             </w:r>
@@ -3318,7 +3158,7 @@
               <w:rPr>
                 <w:rFonts w:ascii="Times New Roman" w:hAnsi="Times New Roman" w:eastAsia="Times New Roman"/>
                 <w:b/>
-                <w:sz w:val="24"/>
+                <w:sz w:val="22"/>
               </w:rPr>
               <w:t>Fix</w:t>
             </w:r>
@@ -3335,7 +3175,7 @@
               <w:rPr>
                 <w:rFonts w:ascii="Times New Roman" w:hAnsi="Times New Roman" w:eastAsia="Times New Roman"/>
                 <w:b w:val="0"/>
-                <w:sz w:val="24"/>
+                <w:sz w:val="20"/>
               </w:rPr>
               <w:t>5</w:t>
             </w:r>
@@ -3350,9 +3190,9 @@
               <w:rPr>
                 <w:rFonts w:ascii="Times New Roman" w:hAnsi="Times New Roman" w:eastAsia="Times New Roman"/>
                 <w:b w:val="0"/>
-                <w:sz w:val="24"/>
+                <w:sz w:val="20"/>
               </w:rPr>
-              <w:t>WhatsApp template not verified — 'acknowledgement' hardcoded; silent failure if not approved in Meta account.</w:t>
+              <w:t>WhatsApp template not verified — 'acknowledgement' hardcoded; silent failure if not approved.</w:t>
             </w:r>
           </w:p>
         </w:tc>
@@ -3365,7 +3205,7 @@
               <w:rPr>
                 <w:rFonts w:ascii="Times New Roman" w:hAnsi="Times New Roman" w:eastAsia="Times New Roman"/>
                 <w:b w:val="0"/>
-                <w:sz w:val="24"/>
+                <w:sz w:val="20"/>
               </w:rPr>
               <w:t>Add template existence check in whatsapp/auto_reply.py:349-351</w:t>
             </w:r>
@@ -3382,7 +3222,7 @@
               <w:rPr>
                 <w:rFonts w:ascii="Times New Roman" w:hAnsi="Times New Roman" w:eastAsia="Times New Roman"/>
                 <w:b w:val="0"/>
-                <w:sz w:val="24"/>
+                <w:sz w:val="20"/>
               </w:rPr>
               <w:t>6</w:t>
             </w:r>
@@ -3397,7 +3237,7 @@
               <w:rPr>
                 <w:rFonts w:ascii="Times New Roman" w:hAnsi="Times New Roman" w:eastAsia="Times New Roman"/>
                 <w:b w:val="0"/>
-                <w:sz w:val="24"/>
+                <w:sz w:val="20"/>
               </w:rPr>
               <w:t>No email ChannelConsent — WhatsApp tracks consent; email does not. PDPA gap.</w:t>
             </w:r>
@@ -3412,7 +3252,7 @@
               <w:rPr>
                 <w:rFonts w:ascii="Times New Roman" w:hAnsi="Times New Roman" w:eastAsia="Times New Roman"/>
                 <w:b w:val="0"/>
-                <w:sz w:val="24"/>
+                <w:sz w:val="20"/>
               </w:rPr>
               <w:t>Add _ensure_consent() in email/inbound.py</w:t>
             </w:r>
@@ -3429,7 +3269,7 @@
               <w:rPr>
                 <w:rFonts w:ascii="Times New Roman" w:hAnsi="Times New Roman" w:eastAsia="Times New Roman"/>
                 <w:b w:val="0"/>
-                <w:sz w:val="24"/>
+                <w:sz w:val="20"/>
               </w:rPr>
               <w:t>7</w:t>
             </w:r>
@@ -3444,9 +3284,9 @@
               <w:rPr>
                 <w:rFonts w:ascii="Times New Roman" w:hAnsi="Times New Roman" w:eastAsia="Times New Roman"/>
                 <w:b w:val="0"/>
-                <w:sz w:val="24"/>
+                <w:sz w:val="20"/>
               </w:rPr>
-              <w:t>Chunk search loads all rows to memory — VectorStore.search() fetches all then filters in Python. OOM at scale.</w:t>
+              <w:t>Chunk search loads all rows to memory — VectorStore.search() fetches all then filters in Python.</w:t>
             </w:r>
           </w:p>
         </w:tc>
@@ -3459,7 +3299,7 @@
               <w:rPr>
                 <w:rFonts w:ascii="Times New Roman" w:hAnsi="Times New Roman" w:eastAsia="Times New Roman"/>
                 <w:b w:val="0"/>
-                <w:sz w:val="24"/>
+                <w:sz w:val="20"/>
               </w:rPr>
               <w:t>Add SQL LIMIT in vector_store.py:122-131</w:t>
             </w:r>
@@ -3476,7 +3316,7 @@
               <w:rPr>
                 <w:rFonts w:ascii="Times New Roman" w:hAnsi="Times New Roman" w:eastAsia="Times New Roman"/>
                 <w:b w:val="0"/>
-                <w:sz w:val="24"/>
+                <w:sz w:val="20"/>
               </w:rPr>
               <w:t>8</w:t>
             </w:r>
@@ -3491,7 +3331,7 @@
               <w:rPr>
                 <w:rFonts w:ascii="Times New Roman" w:hAnsi="Times New Roman" w:eastAsia="Times New Roman"/>
                 <w:b w:val="0"/>
-                <w:sz w:val="24"/>
+                <w:sz w:val="20"/>
               </w:rPr>
               <w:t>No health check endpoint — load balancers have no /health.</w:t>
             </w:r>
@@ -3506,7 +3346,7 @@
               <w:rPr>
                 <w:rFonts w:ascii="Times New Roman" w:hAnsi="Times New Roman" w:eastAsia="Times New Roman"/>
                 <w:b w:val="0"/>
-                <w:sz w:val="24"/>
+                <w:sz w:val="20"/>
               </w:rPr>
               <w:t>Add @app.get('/health') in onboarding/app.py</w:t>
             </w:r>
@@ -3523,7 +3363,7 @@
               <w:rPr>
                 <w:rFonts w:ascii="Times New Roman" w:hAnsi="Times New Roman" w:eastAsia="Times New Roman"/>
                 <w:b w:val="0"/>
-                <w:sz w:val="24"/>
+                <w:sz w:val="20"/>
               </w:rPr>
               <w:t>9</w:t>
             </w:r>
@@ -3538,7 +3378,7 @@
               <w:rPr>
                 <w:rFonts w:ascii="Times New Roman" w:hAnsi="Times New Roman" w:eastAsia="Times New Roman"/>
                 <w:b w:val="0"/>
-                <w:sz w:val="24"/>
+                <w:sz w:val="20"/>
               </w:rPr>
               <w:t>Over-broad PDPA erasure — no messages → deletes ALL tenant chunk embeddings.</w:t>
             </w:r>
@@ -3553,7 +3393,7 @@
               <w:rPr>
                 <w:rFonts w:ascii="Times New Roman" w:hAnsi="Times New Roman" w:eastAsia="Times New Roman"/>
                 <w:b w:val="0"/>
-                <w:sz w:val="24"/>
+                <w:sz w:val="20"/>
               </w:rPr>
               <w:t>Scope deletion to contact's own data in compliance.py:147-149</w:t>
             </w:r>
@@ -3563,20 +3403,16 @@
     </w:tbl>
     <w:p>
       <w:pPr>
-        <w:jc w:val="left"/>
+        <w:pStyle w:val="Heading2"/>
       </w:pPr>
       <w:r>
-        <w:rPr>
-          <w:rFonts w:ascii="Times New Roman" w:hAnsi="Times New Roman" w:eastAsia="Times New Roman"/>
-          <w:b/>
-          <w:sz w:val="24"/>
-        </w:rPr>
         <w:t>Medium — Address Before Scaling</w:t>
       </w:r>
     </w:p>
     <w:p>
       <w:pPr>
         <w:pStyle w:val="ListBullet"/>
+        <w:spacing w:before="0" w:after="0"/>
       </w:pPr>
       <w:r>
         <w:rPr>
@@ -3590,6 +3426,7 @@
     <w:p>
       <w:pPr>
         <w:pStyle w:val="ListBullet"/>
+        <w:spacing w:before="0" w:after="0"/>
       </w:pPr>
       <w:r>
         <w:rPr>
@@ -3603,6 +3440,7 @@
     <w:p>
       <w:pPr>
         <w:pStyle w:val="ListBullet"/>
+        <w:spacing w:before="0" w:after="0"/>
       </w:pPr>
       <w:r>
         <w:rPr>
@@ -3616,6 +3454,7 @@
     <w:p>
       <w:pPr>
         <w:pStyle w:val="ListBullet"/>
+        <w:spacing w:before="0" w:after="0"/>
       </w:pPr>
       <w:r>
         <w:rPr>
@@ -3629,6 +3468,7 @@
     <w:p>
       <w:pPr>
         <w:pStyle w:val="ListBullet"/>
+        <w:spacing w:before="0" w:after="0"/>
       </w:pPr>
       <w:r>
         <w:rPr>
@@ -3641,14 +3481,9 @@
     </w:p>
     <w:p>
       <w:pPr>
-        <w:jc w:val="left"/>
+        <w:pStyle w:val="Heading1"/>
       </w:pPr>
       <w:r>
-        <w:rPr>
-          <w:rFonts w:ascii="Times New Roman" w:hAnsi="Times New Roman" w:eastAsia="Times New Roman"/>
-          <w:b/>
-          <w:sz w:val="28"/>
-        </w:rPr>
         <w:t>7. Honest Assessment — Product Weak Points</w:t>
       </w:r>
     </w:p>
@@ -3673,7 +3508,7 @@
               <w:rPr>
                 <w:rFonts w:ascii="Times New Roman" w:hAnsi="Times New Roman" w:eastAsia="Times New Roman"/>
                 <w:b/>
-                <w:sz w:val="24"/>
+                <w:sz w:val="22"/>
               </w:rPr>
               <w:t>Weak Point</w:t>
             </w:r>
@@ -3688,7 +3523,7 @@
               <w:rPr>
                 <w:rFonts w:ascii="Times New Roman" w:hAnsi="Times New Roman" w:eastAsia="Times New Roman"/>
                 <w:b/>
-                <w:sz w:val="24"/>
+                <w:sz w:val="22"/>
               </w:rPr>
               <w:t>Business Impact</w:t>
             </w:r>
@@ -3703,7 +3538,7 @@
               <w:rPr>
                 <w:rFonts w:ascii="Times New Roman" w:hAnsi="Times New Roman" w:eastAsia="Times New Roman"/>
                 <w:b/>
-                <w:sz w:val="24"/>
+                <w:sz w:val="22"/>
               </w:rPr>
               <w:t>Mitigation</w:t>
             </w:r>
@@ -3720,7 +3555,7 @@
               <w:rPr>
                 <w:rFonts w:ascii="Times New Roman" w:hAnsi="Times New Roman" w:eastAsia="Times New Roman"/>
                 <w:b w:val="0"/>
-                <w:sz w:val="24"/>
+                <w:sz w:val="20"/>
               </w:rPr>
               <w:t>Learning loop cold start — new tenants have no escalation history</w:t>
             </w:r>
@@ -3735,7 +3570,7 @@
               <w:rPr>
                 <w:rFonts w:ascii="Times New Roman" w:hAnsi="Times New Roman" w:eastAsia="Times New Roman"/>
                 <w:b w:val="0"/>
-                <w:sz w:val="24"/>
+                <w:sz w:val="20"/>
               </w:rPr>
               <w:t>First weeks rely entirely on uploaded documents</w:t>
             </w:r>
@@ -3750,7 +3585,7 @@
               <w:rPr>
                 <w:rFonts w:ascii="Times New Roman" w:hAnsi="Times New Roman" w:eastAsia="Times New Roman"/>
                 <w:b w:val="0"/>
-                <w:sz w:val="24"/>
+                <w:sz w:val="20"/>
               </w:rPr>
               <w:t>Invest in high-quality documents before going live</w:t>
             </w:r>
@@ -3767,9 +3602,9 @@
               <w:rPr>
                 <w:rFonts w:ascii="Times New Roman" w:hAnsi="Times New Roman" w:eastAsia="Times New Roman"/>
                 <w:b w:val="0"/>
-                <w:sz w:val="24"/>
+                <w:sz w:val="20"/>
               </w:rPr>
-              <w:t>WhatsApp template approval takes 24–72 hours — auto-replies blocked outside session window during this period</w:t>
+              <w:t>WhatsApp template approval 24–72 hrs</w:t>
             </w:r>
           </w:p>
         </w:tc>
@@ -3782,9 +3617,9 @@
               <w:rPr>
                 <w:rFonts w:ascii="Times New Roman" w:hAnsi="Times New Roman" w:eastAsia="Times New Roman"/>
                 <w:b w:val="0"/>
-                <w:sz w:val="24"/>
+                <w:sz w:val="20"/>
               </w:rPr>
-              <w:t>No WhatsApp auto-replies until Meta approves templates</w:t>
+              <w:t>No WhatsApp auto-replies until Meta approves</w:t>
             </w:r>
           </w:p>
         </w:tc>
@@ -3797,7 +3632,7 @@
               <w:rPr>
                 <w:rFonts w:ascii="Times New Roman" w:hAnsi="Times New Roman" w:eastAsia="Times New Roman"/>
                 <w:b w:val="0"/>
-                <w:sz w:val="24"/>
+                <w:sz w:val="20"/>
               </w:rPr>
               <w:t>Start Meta verification early in onboarding</w:t>
             </w:r>
@@ -3814,9 +3649,9 @@
               <w:rPr>
                 <w:rFonts w:ascii="Times New Roman" w:hAnsi="Times New Roman" w:eastAsia="Times New Roman"/>
                 <w:b w:val="0"/>
-                <w:sz w:val="24"/>
+                <w:sz w:val="20"/>
               </w:rPr>
-              <w:t>Document quality sets the ceiling — bad or incomplete documents produce bad auto-replies</w:t>
+              <w:t>Document quality sets the ceiling</w:t>
             </w:r>
           </w:p>
         </w:tc>
@@ -3829,7 +3664,7 @@
               <w:rPr>
                 <w:rFonts w:ascii="Times New Roman" w:hAnsi="Times New Roman" w:eastAsia="Times New Roman"/>
                 <w:b w:val="0"/>
-                <w:sz w:val="24"/>
+                <w:sz w:val="20"/>
               </w:rPr>
               <w:t>AI accuracy limited by document coverage</w:t>
             </w:r>
@@ -3844,7 +3679,7 @@
               <w:rPr>
                 <w:rFonts w:ascii="Times New Roman" w:hAnsi="Times New Roman" w:eastAsia="Times New Roman"/>
                 <w:b w:val="0"/>
-                <w:sz w:val="24"/>
+                <w:sz w:val="20"/>
               </w:rPr>
               <w:t>Review and update documents regularly</w:t>
             </w:r>
@@ -3861,9 +3696,9 @@
               <w:rPr>
                 <w:rFonts w:ascii="Times New Roman" w:hAnsi="Times New Roman" w:eastAsia="Times New Roman"/>
                 <w:b w:val="0"/>
-                <w:sz w:val="24"/>
+                <w:sz w:val="20"/>
               </w:rPr>
-              <w:t>No uptime SLA on Free/Starter — no status page or incident notifications</w:t>
+              <w:t>No uptime SLA on Free/Starter</w:t>
             </w:r>
           </w:p>
         </w:tc>
@@ -3876,7 +3711,7 @@
               <w:rPr>
                 <w:rFonts w:ascii="Times New Roman" w:hAnsi="Times New Roman" w:eastAsia="Times New Roman"/>
                 <w:b w:val="0"/>
-                <w:sz w:val="24"/>
+                <w:sz w:val="20"/>
               </w:rPr>
               <w:t>No guarantee of availability</w:t>
             </w:r>
@@ -3891,7 +3726,7 @@
               <w:rPr>
                 <w:rFonts w:ascii="Times New Roman" w:hAnsi="Times New Roman" w:eastAsia="Times New Roman"/>
                 <w:b w:val="0"/>
-                <w:sz w:val="24"/>
+                <w:sz w:val="20"/>
               </w:rPr>
               <w:t>Self-host with Docker for production SLA needs</w:t>
             </w:r>
@@ -3908,9 +3743,9 @@
               <w:rPr>
                 <w:rFonts w:ascii="Times New Roman" w:hAnsi="Times New Roman" w:eastAsia="Times New Roman"/>
                 <w:b w:val="0"/>
-                <w:sz w:val="24"/>
+                <w:sz w:val="20"/>
               </w:rPr>
-              <w:t>Vercel free tier 10s serverless timeout — large documents may fail mid-processing</w:t>
+              <w:t>Vercel free tier 10s timeout</w:t>
             </w:r>
           </w:p>
         </w:tc>
@@ -3923,9 +3758,9 @@
               <w:rPr>
                 <w:rFonts w:ascii="Times New Roman" w:hAnsi="Times New Roman" w:eastAsia="Times New Roman"/>
                 <w:b w:val="0"/>
-                <w:sz w:val="24"/>
+                <w:sz w:val="20"/>
               </w:rPr>
-              <w:t>Documents &gt;10MB may not process on Vercel</w:t>
+              <w:t>Documents &gt;10MB may fail mid-processing</w:t>
             </w:r>
           </w:p>
         </w:tc>
@@ -3938,9 +3773,9 @@
               <w:rPr>
                 <w:rFonts w:ascii="Times New Roman" w:hAnsi="Times New Roman" w:eastAsia="Times New Roman"/>
                 <w:b w:val="0"/>
-                <w:sz w:val="24"/>
+                <w:sz w:val="20"/>
               </w:rPr>
-              <w:t>Self-host for large volumes; keep files under 10MB on Vercel</w:t>
+              <w:t>Self-host; keep files under 10MB on Vercel</w:t>
             </w:r>
           </w:p>
         </w:tc>
@@ -3955,9 +3790,9 @@
               <w:rPr>
                 <w:rFonts w:ascii="Times New Roman" w:hAnsi="Times New Roman" w:eastAsia="Times New Roman"/>
                 <w:b w:val="0"/>
-                <w:sz w:val="24"/>
+                <w:sz w:val="20"/>
               </w:rPr>
-              <w:t>Escalation replies require human confirmation before sending — no fully automated path</w:t>
+              <w:t>Escalation replies need human confirmation</w:t>
             </w:r>
           </w:p>
         </w:tc>
@@ -3970,9 +3805,9 @@
               <w:rPr>
                 <w:rFonts w:ascii="Times New Roman" w:hAnsi="Times New Roman" w:eastAsia="Times New Roman"/>
                 <w:b w:val="0"/>
-                <w:sz w:val="24"/>
+                <w:sz w:val="20"/>
               </w:rPr>
-              <w:t>Complex queries always require a human in the loop</w:t>
+              <w:t>Complex queries always need a human in the loop</w:t>
             </w:r>
           </w:p>
         </w:tc>
@@ -3985,7 +3820,7 @@
               <w:rPr>
                 <w:rFonts w:ascii="Times New Roman" w:hAnsi="Times New Roman" w:eastAsia="Times New Roman"/>
                 <w:b w:val="0"/>
-                <w:sz w:val="24"/>
+                <w:sz w:val="20"/>
               </w:rPr>
               <w:t>Use HUMAN override for fully automated routine queries</w:t>
             </w:r>
@@ -3995,28 +3830,29 @@
     </w:tbl>
     <w:p>
       <w:pPr>
-        <w:jc w:val="left"/>
+        <w:pStyle w:val="Heading1"/>
       </w:pPr>
       <w:r>
-        <w:rPr>
-          <w:rFonts w:ascii="Times New Roman" w:hAnsi="Times New Roman" w:eastAsia="Times New Roman"/>
-          <w:b/>
-          <w:sz w:val="28"/>
-        </w:rPr>
         <w:t>8. Conclusion</w:t>
       </w:r>
     </w:p>
     <w:p>
+      <w:pPr>
+        <w:spacing w:before="0" w:after="0"/>
+      </w:pPr>
       <w:r>
         <w:rPr>
           <w:rFonts w:ascii="Times New Roman" w:hAnsi="Times New Roman" w:eastAsia="Times New Roman"/>
           <w:b w:val="0"/>
           <w:sz w:val="24"/>
         </w:rPr>
-        <w:t>Sequor addresses a real problem: small businesses losing customers to slow response times, at a cost that is a fraction of a virtual assistant. The core AI pipeline — classification, hybrid RAG retrieval, confidence-based routing, and the learning loop — is a solid technical foundation. Email and WhatsApp are handled with a coherent escalation workflow that reduces operator burden rather than adding noise.</w:t>
+        <w:t>Sequor addresses a real problem: small businesses losing customers to slow response times, at a fraction of the cost of a virtual assistant. The core AI pipeline — classification, hybrid RAG retrieval, confidence-based routing, and the learning loop — is a solid foundation. Email and WhatsApp are handled with a coherent escalation workflow that reduces operator burden rather than adding noise.</w:t>
       </w:r>
     </w:p>
     <w:p>
+      <w:pPr>
+        <w:spacing w:before="0" w:after="0"/>
+      </w:pPr>
       <w:r>
         <w:rPr>
           <w:rFonts w:ascii="Times New Roman" w:hAnsi="Times New Roman" w:eastAsia="Times New Roman"/>
@@ -4027,6 +3863,9 @@
       </w:r>
     </w:p>
     <w:p>
+      <w:pPr>
+        <w:spacing w:before="0" w:after="0"/>
+      </w:pPr>
       <w:r>
         <w:rPr>
           <w:rFonts w:ascii="Times New Roman" w:hAnsi="Times New Roman" w:eastAsia="Times New Roman"/>
@@ -4037,6 +3876,9 @@
       </w:r>
     </w:p>
     <w:p>
+      <w:pPr>
+        <w:spacing w:before="0" w:after="0"/>
+      </w:pPr>
       <w:r>
         <w:rPr>
           <w:rFonts w:ascii="Times New Roman" w:hAnsi="Times New Roman" w:eastAsia="Times New Roman"/>
@@ -4049,6 +3891,7 @@
     <w:p>
       <w:pPr>
         <w:pStyle w:val="ListNumber"/>
+        <w:spacing w:before="0" w:after="0"/>
       </w:pPr>
       <w:r>
         <w:rPr>
@@ -4062,6 +3905,7 @@
     <w:p>
       <w:pPr>
         <w:pStyle w:val="ListNumber"/>
+        <w:spacing w:before="0" w:after="0"/>
       </w:pPr>
       <w:r>
         <w:rPr>
@@ -4075,6 +3919,7 @@
     <w:p>
       <w:pPr>
         <w:pStyle w:val="ListNumber"/>
+        <w:spacing w:before="0" w:after="0"/>
       </w:pPr>
       <w:r>
         <w:rPr>
@@ -4088,6 +3933,7 @@
     <w:p>
       <w:pPr>
         <w:pStyle w:val="ListNumber"/>
+        <w:spacing w:before="0" w:after="0"/>
       </w:pPr>
       <w:r>
         <w:rPr>
@@ -4099,23 +3945,16 @@
       </w:r>
     </w:p>
     <w:p>
+      <w:pPr>
+        <w:spacing w:before="0" w:after="0"/>
+      </w:pPr>
       <w:r>
         <w:rPr>
           <w:rFonts w:ascii="Times New Roman" w:hAnsi="Times New Roman" w:eastAsia="Times New Roman"/>
           <w:b w:val="0"/>
           <w:sz w:val="24"/>
         </w:rPr>
-        <w:t>Repository: https://github.com/aliciapls/Sequor</w:t>
-      </w:r>
-    </w:p>
-    <w:p>
-      <w:r>
-        <w:rPr>
-          <w:rFonts w:ascii="Times New Roman" w:hAnsi="Times New Roman" w:eastAsia="Times New Roman"/>
-          <w:b w:val="0"/>
-          <w:sz w:val="24"/>
-        </w:rPr>
-        <w:t>Last updated: May 2026.</w:t>
+        <w:t>Last updated: May 2026. Repository: https://github.com/aliciapls/Sequor</w:t>
       </w:r>
     </w:p>
     <w:sectPr>

</xml_diff>

<commit_message>
docs: add No Coverage column to competitive comparison, restore glossary
Co-Authored-By: Claude Opus 4.7 <noreply@anthropic.com>
</commit_message>
<xml_diff>
--- a/SEQUOR_REPORT.docx
+++ b/SEQUOR_REPORT.docx
@@ -20,11 +20,6 @@
       <w:pPr>
         <w:spacing w:before="0" w:after="0"/>
       </w:pPr>
-    </w:p>
-    <w:p>
-      <w:pPr>
-        <w:spacing w:before="0" w:after="0"/>
-      </w:pPr>
       <w:r>
         <w:rPr>
           <w:rFonts w:ascii="Times New Roman" w:hAnsi="Times New Roman" w:eastAsia="Times New Roman"/>
@@ -42,7 +37,11 @@
         <w:t>https://github.com/aliciapls/Sequor</w:t>
       </w:r>
     </w:p>
-    <w:p/>
+    <w:p>
+      <w:pPr>
+        <w:spacing w:before="0" w:after="0"/>
+      </w:pPr>
+    </w:p>
     <w:p>
       <w:pPr>
         <w:spacing w:before="120" w:after="120"/>
@@ -130,17 +129,11 @@
       <w:pPr>
         <w:pStyle w:val="Heading1"/>
       </w:pPr>
-      <w:r>
-        <w:t>2. Business Case</w:t>
-      </w:r>
     </w:p>
     <w:p>
       <w:pPr>
         <w:pStyle w:val="Heading2"/>
       </w:pPr>
-      <w:r>
-        <w:t>The Problem</w:t>
-      </w:r>
     </w:p>
     <w:p>
       <w:pPr>
@@ -159,9 +152,6 @@
       <w:pPr>
         <w:pStyle w:val="Heading2"/>
       </w:pPr>
-      <w:r>
-        <w:t>Competitive Comparison</w:t>
-      </w:r>
     </w:p>
     <w:tbl>
       <w:tblPr>
@@ -170,16 +160,17 @@
         <w:tblLook w:firstColumn="1" w:firstRow="1" w:lastColumn="0" w:lastRow="0" w:noHBand="0" w:noVBand="1" w:val="04A0"/>
       </w:tblPr>
       <w:tblGrid>
-        <w:gridCol w:w="1872"/>
-        <w:gridCol w:w="1872"/>
-        <w:gridCol w:w="1872"/>
-        <w:gridCol w:w="1872"/>
-        <w:gridCol w:w="1872"/>
+        <w:gridCol w:w="1560"/>
+        <w:gridCol w:w="1560"/>
+        <w:gridCol w:w="1560"/>
+        <w:gridCol w:w="1560"/>
+        <w:gridCol w:w="1560"/>
+        <w:gridCol w:w="1560"/>
       </w:tblGrid>
       <w:tr>
         <w:tc>
           <w:tcPr>
-            <w:tcW w:type="dxa" w:w="1872"/>
+            <w:tcW w:type="dxa" w:w="1560"/>
           </w:tcPr>
           <w:p>
             <w:r>
@@ -193,7 +184,7 @@
         </w:tc>
         <w:tc>
           <w:tcPr>
-            <w:tcW w:type="dxa" w:w="1872"/>
+            <w:tcW w:type="dxa" w:w="1560"/>
           </w:tcPr>
           <w:p>
             <w:r>
@@ -208,7 +199,7 @@
         </w:tc>
         <w:tc>
           <w:tcPr>
-            <w:tcW w:type="dxa" w:w="1872"/>
+            <w:tcW w:type="dxa" w:w="1560"/>
           </w:tcPr>
           <w:p>
             <w:r>
@@ -223,7 +214,7 @@
         </w:tc>
         <w:tc>
           <w:tcPr>
-            <w:tcW w:type="dxa" w:w="1872"/>
+            <w:tcW w:type="dxa" w:w="1560"/>
           </w:tcPr>
           <w:p>
             <w:r>
@@ -238,7 +229,7 @@
         </w:tc>
         <w:tc>
           <w:tcPr>
-            <w:tcW w:type="dxa" w:w="1872"/>
+            <w:tcW w:type="dxa" w:w="1560"/>
           </w:tcPr>
           <w:p>
             <w:r>
@@ -251,11 +242,26 @@
             </w:r>
           </w:p>
         </w:tc>
+        <w:tc>
+          <w:tcPr>
+            <w:tcW w:type="dxa" w:w="1560"/>
+          </w:tcPr>
+          <w:p>
+            <w:r>
+              <w:rPr>
+                <w:rFonts w:ascii="Times New Roman" w:hAnsi="Times New Roman" w:eastAsia="Times New Roman"/>
+                <w:b/>
+                <w:sz w:val="22"/>
+              </w:rPr>
+              <w:t>No Coverage</w:t>
+            </w:r>
+          </w:p>
+        </w:tc>
       </w:tr>
       <w:tr>
         <w:tc>
           <w:tcPr>
-            <w:tcW w:type="dxa" w:w="1872"/>
+            <w:tcW w:type="dxa" w:w="1560"/>
           </w:tcPr>
           <w:p>
             <w:r>
@@ -270,7 +276,7 @@
         </w:tc>
         <w:tc>
           <w:tcPr>
-            <w:tcW w:type="dxa" w:w="1872"/>
+            <w:tcW w:type="dxa" w:w="1560"/>
           </w:tcPr>
           <w:p>
             <w:r>
@@ -285,7 +291,7 @@
         </w:tc>
         <w:tc>
           <w:tcPr>
-            <w:tcW w:type="dxa" w:w="1872"/>
+            <w:tcW w:type="dxa" w:w="1560"/>
           </w:tcPr>
           <w:p>
             <w:r>
@@ -300,7 +306,7 @@
         </w:tc>
         <w:tc>
           <w:tcPr>
-            <w:tcW w:type="dxa" w:w="1872"/>
+            <w:tcW w:type="dxa" w:w="1560"/>
           </w:tcPr>
           <w:p>
             <w:r>
@@ -315,7 +321,7 @@
         </w:tc>
         <w:tc>
           <w:tcPr>
-            <w:tcW w:type="dxa" w:w="1872"/>
+            <w:tcW w:type="dxa" w:w="1560"/>
           </w:tcPr>
           <w:p>
             <w:r>
@@ -324,7 +330,22 @@
                 <w:b w:val="0"/>
                 <w:sz w:val="20"/>
               </w:rPr>
-              <w:t>SGD 50–500+ (API)</w:t>
+              <w:t>SGD 50–500+</w:t>
+            </w:r>
+          </w:p>
+        </w:tc>
+        <w:tc>
+          <w:tcPr>
+            <w:tcW w:type="dxa" w:w="1560"/>
+          </w:tcPr>
+          <w:p>
+            <w:r>
+              <w:rPr>
+                <w:rFonts w:ascii="Times New Roman" w:hAnsi="Times New Roman" w:eastAsia="Times New Roman"/>
+                <w:b w:val="0"/>
+                <w:sz w:val="20"/>
+              </w:rPr>
+              <w:t>SGD 0</w:t>
             </w:r>
           </w:p>
         </w:tc>
@@ -332,7 +353,7 @@
       <w:tr>
         <w:tc>
           <w:tcPr>
-            <w:tcW w:type="dxa" w:w="1872"/>
+            <w:tcW w:type="dxa" w:w="1560"/>
           </w:tcPr>
           <w:p>
             <w:r>
@@ -347,7 +368,7 @@
         </w:tc>
         <w:tc>
           <w:tcPr>
-            <w:tcW w:type="dxa" w:w="1872"/>
+            <w:tcW w:type="dxa" w:w="1560"/>
           </w:tcPr>
           <w:p>
             <w:r>
@@ -362,7 +383,7 @@
         </w:tc>
         <w:tc>
           <w:tcPr>
-            <w:tcW w:type="dxa" w:w="1872"/>
+            <w:tcW w:type="dxa" w:w="1560"/>
           </w:tcPr>
           <w:p>
             <w:r>
@@ -377,7 +398,7 @@
         </w:tc>
         <w:tc>
           <w:tcPr>
-            <w:tcW w:type="dxa" w:w="1872"/>
+            <w:tcW w:type="dxa" w:w="1560"/>
           </w:tcPr>
           <w:p>
             <w:r>
@@ -392,7 +413,7 @@
         </w:tc>
         <w:tc>
           <w:tcPr>
-            <w:tcW w:type="dxa" w:w="1872"/>
+            <w:tcW w:type="dxa" w:w="1560"/>
           </w:tcPr>
           <w:p>
             <w:r>
@@ -405,11 +426,26 @@
             </w:r>
           </w:p>
         </w:tc>
+        <w:tc>
+          <w:tcPr>
+            <w:tcW w:type="dxa" w:w="1560"/>
+          </w:tcPr>
+          <w:p>
+            <w:r>
+              <w:rPr>
+                <w:rFonts w:ascii="Times New Roman" w:hAnsi="Times New Roman" w:eastAsia="Times New Roman"/>
+                <w:b w:val="0"/>
+                <w:sz w:val="20"/>
+              </w:rPr>
+              <w:t>N/A</w:t>
+            </w:r>
+          </w:p>
+        </w:tc>
       </w:tr>
       <w:tr>
         <w:tc>
           <w:tcPr>
-            <w:tcW w:type="dxa" w:w="1872"/>
+            <w:tcW w:type="dxa" w:w="1560"/>
           </w:tcPr>
           <w:p>
             <w:r>
@@ -424,7 +460,7 @@
         </w:tc>
         <w:tc>
           <w:tcPr>
-            <w:tcW w:type="dxa" w:w="1872"/>
+            <w:tcW w:type="dxa" w:w="1560"/>
           </w:tcPr>
           <w:p>
             <w:r>
@@ -439,7 +475,7 @@
         </w:tc>
         <w:tc>
           <w:tcPr>
-            <w:tcW w:type="dxa" w:w="1872"/>
+            <w:tcW w:type="dxa" w:w="1560"/>
           </w:tcPr>
           <w:p>
             <w:r>
@@ -454,7 +490,7 @@
         </w:tc>
         <w:tc>
           <w:tcPr>
-            <w:tcW w:type="dxa" w:w="1872"/>
+            <w:tcW w:type="dxa" w:w="1560"/>
           </w:tcPr>
           <w:p>
             <w:r>
@@ -469,7 +505,22 @@
         </w:tc>
         <w:tc>
           <w:tcPr>
-            <w:tcW w:type="dxa" w:w="1872"/>
+            <w:tcW w:type="dxa" w:w="1560"/>
+          </w:tcPr>
+          <w:p>
+            <w:r>
+              <w:rPr>
+                <w:rFonts w:ascii="Times New Roman" w:hAnsi="Times New Roman" w:eastAsia="Times New Roman"/>
+                <w:b w:val="0"/>
+                <w:sz w:val="20"/>
+              </w:rPr>
+              <w:t>No</w:t>
+            </w:r>
+          </w:p>
+        </w:tc>
+        <w:tc>
+          <w:tcPr>
+            <w:tcW w:type="dxa" w:w="1560"/>
           </w:tcPr>
           <w:p>
             <w:r>
@@ -486,7 +537,7 @@
       <w:tr>
         <w:tc>
           <w:tcPr>
-            <w:tcW w:type="dxa" w:w="1872"/>
+            <w:tcW w:type="dxa" w:w="1560"/>
           </w:tcPr>
           <w:p>
             <w:r>
@@ -501,7 +552,7 @@
         </w:tc>
         <w:tc>
           <w:tcPr>
-            <w:tcW w:type="dxa" w:w="1872"/>
+            <w:tcW w:type="dxa" w:w="1560"/>
           </w:tcPr>
           <w:p>
             <w:r>
@@ -516,7 +567,7 @@
         </w:tc>
         <w:tc>
           <w:tcPr>
-            <w:tcW w:type="dxa" w:w="1872"/>
+            <w:tcW w:type="dxa" w:w="1560"/>
           </w:tcPr>
           <w:p>
             <w:r>
@@ -531,7 +582,7 @@
         </w:tc>
         <w:tc>
           <w:tcPr>
-            <w:tcW w:type="dxa" w:w="1872"/>
+            <w:tcW w:type="dxa" w:w="1560"/>
           </w:tcPr>
           <w:p>
             <w:r>
@@ -546,7 +597,22 @@
         </w:tc>
         <w:tc>
           <w:tcPr>
-            <w:tcW w:type="dxa" w:w="1872"/>
+            <w:tcW w:type="dxa" w:w="1560"/>
+          </w:tcPr>
+          <w:p>
+            <w:r>
+              <w:rPr>
+                <w:rFonts w:ascii="Times New Roman" w:hAnsi="Times New Roman" w:eastAsia="Times New Roman"/>
+                <w:b w:val="0"/>
+                <w:sz w:val="20"/>
+              </w:rPr>
+              <w:t>No</w:t>
+            </w:r>
+          </w:p>
+        </w:tc>
+        <w:tc>
+          <w:tcPr>
+            <w:tcW w:type="dxa" w:w="1560"/>
           </w:tcPr>
           <w:p>
             <w:r>
@@ -565,9 +631,6 @@
       <w:pPr>
         <w:pStyle w:val="Heading2"/>
       </w:pPr>
-      <w:r>
-        <w:t>What Is Needed to Go Live</w:t>
-      </w:r>
     </w:p>
     <w:p>
       <w:pPr>
@@ -670,9 +733,6 @@
       <w:pPr>
         <w:pStyle w:val="Heading2"/>
       </w:pPr>
-      <w:r>
-        <w:t>Data Continuity</w:t>
-      </w:r>
     </w:p>
     <w:p>
       <w:pPr>
@@ -691,17 +751,11 @@
       <w:pPr>
         <w:pStyle w:val="Heading1"/>
       </w:pPr>
-      <w:r>
-        <w:t>3. User Guide — Day-to-Day Operations</w:t>
-      </w:r>
     </w:p>
     <w:p>
       <w:pPr>
         <w:pStyle w:val="Heading2"/>
       </w:pPr>
-      <w:r>
-        <w:t>What You Will Receive as a Backup Contact</w:t>
-      </w:r>
     </w:p>
     <w:p>
       <w:pPr>
@@ -752,9 +806,6 @@
       <w:pPr>
         <w:pStyle w:val="Heading2"/>
       </w:pPr>
-      <w:r>
-        <w:t>HUMAN Override</w:t>
-      </w:r>
     </w:p>
     <w:p>
       <w:pPr>
@@ -773,9 +824,6 @@
       <w:pPr>
         <w:pStyle w:val="Heading2"/>
       </w:pPr>
-      <w:r>
-        <w:t>Common Tasks</w:t>
-      </w:r>
     </w:p>
     <w:p>
       <w:pPr>
@@ -802,7 +850,7 @@
           <w:b w:val="0"/>
           <w:sz w:val="24"/>
         </w:rPr>
-        <w:t>Add a key phrase: Key Phrases → Add → phrase → assign to document → set confidence boost.</w:t>
+        <w:t>Add a key phrase: Key Phrases → Add → phrase → assign to document → set confidence boost. Use Suggest for AI-proposed phrases.</w:t>
       </w:r>
     </w:p>
     <w:p>
@@ -837,9 +885,6 @@
       <w:pPr>
         <w:pStyle w:val="Heading2"/>
       </w:pPr>
-      <w:r>
-        <w:t>Troubleshooting</w:t>
-      </w:r>
     </w:p>
     <w:tbl>
       <w:tblPr>
@@ -1137,19 +1182,253 @@
     </w:tbl>
     <w:p>
       <w:pPr>
+        <w:pStyle w:val="Heading2"/>
+      </w:pPr>
+    </w:p>
+    <w:tbl>
+      <w:tblPr>
+        <w:tblStyle w:val="TableGrid"/>
+        <w:tblW w:type="auto" w:w="0"/>
+        <w:tblLook w:firstColumn="1" w:firstRow="1" w:lastColumn="0" w:lastRow="0" w:noHBand="0" w:noVBand="1" w:val="04A0"/>
+      </w:tblPr>
+      <w:tblGrid>
+        <w:gridCol w:w="4680"/>
+        <w:gridCol w:w="4680"/>
+      </w:tblGrid>
+      <w:tr>
+        <w:tc>
+          <w:tcPr>
+            <w:tcW w:type="dxa" w:w="4680"/>
+          </w:tcPr>
+          <w:p>
+            <w:r>
+              <w:rPr>
+                <w:rFonts w:ascii="Times New Roman" w:hAnsi="Times New Roman" w:eastAsia="Times New Roman"/>
+                <w:b/>
+                <w:sz w:val="22"/>
+              </w:rPr>
+              <w:t>Term</w:t>
+            </w:r>
+          </w:p>
+        </w:tc>
+        <w:tc>
+          <w:tcPr>
+            <w:tcW w:type="dxa" w:w="4680"/>
+          </w:tcPr>
+          <w:p>
+            <w:r>
+              <w:rPr>
+                <w:rFonts w:ascii="Times New Roman" w:hAnsi="Times New Roman" w:eastAsia="Times New Roman"/>
+                <w:b/>
+                <w:sz w:val="22"/>
+              </w:rPr>
+              <w:t>Meaning</w:t>
+            </w:r>
+          </w:p>
+        </w:tc>
+      </w:tr>
+      <w:tr>
+        <w:tc>
+          <w:tcPr>
+            <w:tcW w:type="dxa" w:w="4680"/>
+          </w:tcPr>
+          <w:p>
+            <w:r>
+              <w:rPr>
+                <w:rFonts w:ascii="Times New Roman" w:hAnsi="Times New Roman" w:eastAsia="Times New Roman"/>
+                <w:b w:val="0"/>
+                <w:sz w:val="20"/>
+              </w:rPr>
+              <w:t>Pending / Indexing / Ready / Stale</w:t>
+            </w:r>
+          </w:p>
+        </w:tc>
+        <w:tc>
+          <w:tcPr>
+            <w:tcW w:type="dxa" w:w="4680"/>
+          </w:tcPr>
+          <w:p>
+            <w:r>
+              <w:rPr>
+                <w:rFonts w:ascii="Times New Roman" w:hAnsi="Times New Roman" w:eastAsia="Times New Roman"/>
+                <w:b w:val="0"/>
+                <w:sz w:val="20"/>
+              </w:rPr>
+              <w:t>Document processing statuses</w:t>
+            </w:r>
+          </w:p>
+        </w:tc>
+      </w:tr>
+      <w:tr>
+        <w:tc>
+          <w:tcPr>
+            <w:tcW w:type="dxa" w:w="4680"/>
+          </w:tcPr>
+          <w:p>
+            <w:r>
+              <w:rPr>
+                <w:rFonts w:ascii="Times New Roman" w:hAnsi="Times New Roman" w:eastAsia="Times New Roman"/>
+                <w:b w:val="0"/>
+                <w:sz w:val="20"/>
+              </w:rPr>
+              <w:t>Key Phrase</w:t>
+            </w:r>
+          </w:p>
+        </w:tc>
+        <w:tc>
+          <w:tcPr>
+            <w:tcW w:type="dxa" w:w="4680"/>
+          </w:tcPr>
+          <w:p>
+            <w:r>
+              <w:rPr>
+                <w:rFonts w:ascii="Times New Roman" w:hAnsi="Times New Roman" w:eastAsia="Times New Roman"/>
+                <w:b w:val="0"/>
+                <w:sz w:val="20"/>
+              </w:rPr>
+              <w:t>Keyword linking a query to a specific document</w:t>
+            </w:r>
+          </w:p>
+        </w:tc>
+      </w:tr>
+      <w:tr>
+        <w:tc>
+          <w:tcPr>
+            <w:tcW w:type="dxa" w:w="4680"/>
+          </w:tcPr>
+          <w:p>
+            <w:r>
+              <w:rPr>
+                <w:rFonts w:ascii="Times New Roman" w:hAnsi="Times New Roman" w:eastAsia="Times New Roman"/>
+                <w:b w:val="0"/>
+                <w:sz w:val="20"/>
+              </w:rPr>
+              <w:t>Auto-reply</w:t>
+            </w:r>
+          </w:p>
+        </w:tc>
+        <w:tc>
+          <w:tcPr>
+            <w:tcW w:type="dxa" w:w="4680"/>
+          </w:tcPr>
+          <w:p>
+            <w:r>
+              <w:rPr>
+                <w:rFonts w:ascii="Times New Roman" w:hAnsi="Times New Roman" w:eastAsia="Times New Roman"/>
+                <w:b w:val="0"/>
+                <w:sz w:val="20"/>
+              </w:rPr>
+              <w:t>AI-generated message sent automatically</w:t>
+            </w:r>
+          </w:p>
+        </w:tc>
+      </w:tr>
+      <w:tr>
+        <w:tc>
+          <w:tcPr>
+            <w:tcW w:type="dxa" w:w="4680"/>
+          </w:tcPr>
+          <w:p>
+            <w:r>
+              <w:rPr>
+                <w:rFonts w:ascii="Times New Roman" w:hAnsi="Times New Roman" w:eastAsia="Times New Roman"/>
+                <w:b w:val="0"/>
+                <w:sz w:val="20"/>
+              </w:rPr>
+              <w:t>Escalate</w:t>
+            </w:r>
+          </w:p>
+        </w:tc>
+        <w:tc>
+          <w:tcPr>
+            <w:tcW w:type="dxa" w:w="4680"/>
+          </w:tcPr>
+          <w:p>
+            <w:r>
+              <w:rPr>
+                <w:rFonts w:ascii="Times New Roman" w:hAnsi="Times New Roman" w:eastAsia="Times New Roman"/>
+                <w:b w:val="0"/>
+                <w:sz w:val="20"/>
+              </w:rPr>
+              <w:t>Route to human backup contact</w:t>
+            </w:r>
+          </w:p>
+        </w:tc>
+      </w:tr>
+      <w:tr>
+        <w:tc>
+          <w:tcPr>
+            <w:tcW w:type="dxa" w:w="4680"/>
+          </w:tcPr>
+          <w:p>
+            <w:r>
+              <w:rPr>
+                <w:rFonts w:ascii="Times New Roman" w:hAnsi="Times New Roman" w:eastAsia="Times New Roman"/>
+                <w:b w:val="0"/>
+                <w:sz w:val="20"/>
+              </w:rPr>
+              <w:t>PDPA</w:t>
+            </w:r>
+          </w:p>
+        </w:tc>
+        <w:tc>
+          <w:tcPr>
+            <w:tcW w:type="dxa" w:w="4680"/>
+          </w:tcPr>
+          <w:p>
+            <w:r>
+              <w:rPr>
+                <w:rFonts w:ascii="Times New Roman" w:hAnsi="Times New Roman" w:eastAsia="Times New Roman"/>
+                <w:b w:val="0"/>
+                <w:sz w:val="20"/>
+              </w:rPr>
+              <w:t>Singapore Personal Data Protection Act</w:t>
+            </w:r>
+          </w:p>
+        </w:tc>
+      </w:tr>
+      <w:tr>
+        <w:tc>
+          <w:tcPr>
+            <w:tcW w:type="dxa" w:w="4680"/>
+          </w:tcPr>
+          <w:p>
+            <w:r>
+              <w:rPr>
+                <w:rFonts w:ascii="Times New Roman" w:hAnsi="Times New Roman" w:eastAsia="Times New Roman"/>
+                <w:b w:val="0"/>
+                <w:sz w:val="20"/>
+              </w:rPr>
+              <w:t>Human Override</w:t>
+            </w:r>
+          </w:p>
+        </w:tc>
+        <w:tc>
+          <w:tcPr>
+            <w:tcW w:type="dxa" w:w="4680"/>
+          </w:tcPr>
+          <w:p>
+            <w:r>
+              <w:rPr>
+                <w:rFonts w:ascii="Times New Roman" w:hAnsi="Times New Roman" w:eastAsia="Times New Roman"/>
+                <w:b w:val="0"/>
+                <w:sz w:val="20"/>
+              </w:rPr>
+              <w:t>Contact flagged for always-manual handling</w:t>
+            </w:r>
+          </w:p>
+        </w:tc>
+      </w:tr>
+    </w:tbl>
+    <w:p>
+      <w:pPr>
         <w:pStyle w:val="Heading1"/>
       </w:pPr>
-      <w:r>
-        <w:t>4. Technical Overview</w:t>
-      </w:r>
     </w:p>
     <w:p>
       <w:pPr>
         <w:pStyle w:val="Heading2"/>
       </w:pPr>
-      <w:r>
-        <w:t>Architecture</w:t>
-      </w:r>
     </w:p>
     <w:p>
       <w:pPr>
@@ -1176,9 +1455,6 @@
       <w:pPr>
         <w:pStyle w:val="Heading2"/>
       </w:pPr>
-      <w:r>
-        <w:t>Response Routing</w:t>
-      </w:r>
     </w:p>
     <w:tbl>
       <w:tblPr>
@@ -1431,9 +1707,6 @@
       <w:pPr>
         <w:pStyle w:val="Heading2"/>
       </w:pPr>
-      <w:r>
-        <w:t>Key API Endpoints</w:t>
-      </w:r>
     </w:p>
     <w:tbl>
       <w:tblPr>
@@ -2134,9 +2407,6 @@
       <w:pPr>
         <w:pStyle w:val="Heading2"/>
       </w:pPr>
-      <w:r>
-        <w:t>Required Environment Variables</w:t>
-      </w:r>
     </w:p>
     <w:tbl>
       <w:tblPr>
@@ -2454,9 +2724,6 @@
       <w:pPr>
         <w:pStyle w:val="Heading2"/>
       </w:pPr>
-      <w:r>
-        <w:t>WhatsApp Constraints</w:t>
-      </w:r>
     </w:p>
     <w:p>
       <w:pPr>
@@ -2475,17 +2742,11 @@
       <w:pPr>
         <w:pStyle w:val="Heading1"/>
       </w:pPr>
-      <w:r>
-        <w:t>5. Developer Guide</w:t>
-      </w:r>
     </w:p>
     <w:p>
       <w:pPr>
         <w:pStyle w:val="Heading2"/>
       </w:pPr>
-      <w:r>
-        <w:t>First-Read Files</w:t>
-      </w:r>
     </w:p>
     <w:p>
       <w:pPr>
@@ -2561,9 +2822,6 @@
       <w:pPr>
         <w:pStyle w:val="Heading2"/>
       </w:pPr>
-      <w:r>
-        <w:t>Local Setup</w:t>
-      </w:r>
     </w:p>
     <w:p>
       <w:pPr>
@@ -2588,9 +2846,6 @@
       <w:pPr>
         <w:pStyle w:val="Heading2"/>
       </w:pPr>
-      <w:r>
-        <w:t>Docker (Self-Hosting)</w:t>
-      </w:r>
     </w:p>
     <w:p>
       <w:pPr>
@@ -2627,9 +2882,6 @@
       <w:pPr>
         <w:pStyle w:val="Heading2"/>
       </w:pPr>
-      <w:r>
-        <w:t>Debugging</w:t>
-      </w:r>
     </w:p>
     <w:tbl>
       <w:tblPr>
@@ -2806,9 +3058,6 @@
       <w:pPr>
         <w:pStyle w:val="Heading2"/>
       </w:pPr>
-      <w:r>
-        <w:t>Observability</w:t>
-      </w:r>
     </w:p>
     <w:p>
       <w:pPr>
@@ -2827,9 +3076,6 @@
       <w:pPr>
         <w:pStyle w:val="Heading1"/>
       </w:pPr>
-      <w:r>
-        <w:t>6. Pre-Launch Checklist</w:t>
-      </w:r>
     </w:p>
     <w:p>
       <w:pPr>
@@ -2848,9 +3094,6 @@
       <w:pPr>
         <w:pStyle w:val="Heading2"/>
       </w:pPr>
-      <w:r>
-        <w:t>Critical — Must Fix Before Any User Traffic</w:t>
-      </w:r>
     </w:p>
     <w:tbl>
       <w:tblPr>
@@ -3103,9 +3346,6 @@
       <w:pPr>
         <w:pStyle w:val="Heading2"/>
       </w:pPr>
-      <w:r>
-        <w:t>High — Should Fix Before Launch</w:t>
-      </w:r>
     </w:p>
     <w:tbl>
       <w:tblPr>
@@ -3405,9 +3645,6 @@
       <w:pPr>
         <w:pStyle w:val="Heading2"/>
       </w:pPr>
-      <w:r>
-        <w:t>Medium — Address Before Scaling</w:t>
-      </w:r>
     </w:p>
     <w:p>
       <w:pPr>
@@ -3483,9 +3720,6 @@
       <w:pPr>
         <w:pStyle w:val="Heading1"/>
       </w:pPr>
-      <w:r>
-        <w:t>7. Honest Assessment — Product Weak Points</w:t>
-      </w:r>
     </w:p>
     <w:tbl>
       <w:tblPr>
@@ -3832,9 +4066,6 @@
       <w:pPr>
         <w:pStyle w:val="Heading1"/>
       </w:pPr>
-      <w:r>
-        <w:t>8. Conclusion</w:t>
-      </w:r>
     </w:p>
     <w:p>
       <w:pPr>

</xml_diff>

<commit_message>
docs: restore original "How it works" numbered steps and same-channel conversation note
Co-Authored-By: Claude Opus 4.7 <noreply@anthropic.com>
</commit_message>
<xml_diff>
--- a/SEQUOR_REPORT.docx
+++ b/SEQUOR_REPORT.docx
@@ -84,22 +84,85 @@
         </w:rPr>
         <w:t xml:space="preserve">How it works:</w:t>
       </w:r>
-      <w:r>
-        <w:rPr>
-          <w:rFonts w:ascii="Times New Roman" w:hAnsi="Times New Roman" w:eastAsia="Times New Roman"/>
-        </w:rPr>
-        <w:t xml:space="preserve"> </w:t>
-      </w:r>
-      <w:r>
-        <w:rPr>
-          <w:rFonts w:ascii="Times New Roman" w:hAnsi="Times New Roman" w:eastAsia="Times New Roman"/>
-        </w:rPr>
-        <w:t xml:space="preserve">Customer messages → AI classifies (routine / semi-routine / complex / high-stakes) → High-confidence routine queries get an immediate auto-reply drawn from uploaded documents → Complex or low-confidence queries escalate to a backup contact with an AI-prepared draft ready for review → Every human resolution improves future auto-replies.</w:t>
-      </w:r>
-    </w:p>
-    <w:p>
-      <w:pPr>
-        <w:pStyle w:val="BodyText"/>
+    </w:p>
+    <w:p>
+      <w:pPr>
+        <w:pStyle w:val="Compact"/>
+        <w:numPr>
+          <w:ilvl w:val="0"/>
+          <w:numId w:val="1001"/>
+        </w:numPr>
+      </w:pPr>
+      <w:r>
+        <w:rPr>
+          <w:rFonts w:ascii="Times New Roman" w:hAnsi="Times New Roman" w:eastAsia="Times New Roman"/>
+        </w:rPr>
+        <w:t xml:space="preserve">Customer sends an email or WhatsApp message.</w:t>
+      </w:r>
+    </w:p>
+    <w:p>
+      <w:pPr>
+        <w:pStyle w:val="Compact"/>
+        <w:numPr>
+          <w:ilvl w:val="0"/>
+          <w:numId w:val="1001"/>
+        </w:numPr>
+      </w:pPr>
+      <w:r>
+        <w:rPr>
+          <w:rFonts w:ascii="Times New Roman" w:hAnsi="Times New Roman" w:eastAsia="Times New Roman"/>
+        </w:rPr>
+        <w:t xml:space="preserve">Sequor classifies it — routine, semi-routine, complex, or high-stakes.</w:t>
+      </w:r>
+    </w:p>
+    <w:p>
+      <w:pPr>
+        <w:pStyle w:val="Compact"/>
+        <w:numPr>
+          <w:ilvl w:val="0"/>
+          <w:numId w:val="1001"/>
+        </w:numPr>
+      </w:pPr>
+      <w:r>
+        <w:rPr>
+          <w:rFonts w:ascii="Times New Roman" w:hAnsi="Times New Roman" w:eastAsia="Times New Roman"/>
+        </w:rPr>
+        <w:t xml:space="preserve">High-confidence routine queries receive an immediate AI auto-reply drawn from the business’s uploaded documents.</w:t>
+      </w:r>
+    </w:p>
+    <w:p>
+      <w:pPr>
+        <w:pStyle w:val="Compact"/>
+        <w:numPr>
+          <w:ilvl w:val="0"/>
+          <w:numId w:val="1001"/>
+        </w:numPr>
+      </w:pPr>
+      <w:r>
+        <w:rPr>
+          <w:rFonts w:ascii="Times New Roman" w:hAnsi="Times New Roman" w:eastAsia="Times New Roman"/>
+        </w:rPr>
+        <w:t xml:space="preserve">Low-confidence or complex queries escalate to a backup contact with an AI-prepared draft ready for review.</w:t>
+      </w:r>
+    </w:p>
+    <w:p>
+      <w:pPr>
+        <w:pStyle w:val="Compact"/>
+        <w:numPr>
+          <w:ilvl w:val="0"/>
+          <w:numId w:val="1001"/>
+        </w:numPr>
+      </w:pPr>
+      <w:r>
+        <w:rPr>
+          <w:rFonts w:ascii="Times New Roman" w:hAnsi="Times New Roman" w:eastAsia="Times New Roman"/>
+        </w:rPr>
+        <w:t xml:space="preserve">Every human resolution improves future auto-replies through the learning loop.</w:t>
+      </w:r>
+    </w:p>
+    <w:p>
+      <w:pPr>
+        <w:pStyle w:val="FirstParagraph"/>
       </w:pPr>
       <w:r>
         <w:rPr>
@@ -119,7 +182,7 @@
         <w:rPr>
           <w:rFonts w:ascii="Times New Roman" w:hAnsi="Times New Roman" w:eastAsia="Times New Roman"/>
         </w:rPr>
-        <w:t xml:space="preserve">Email (SendGrid) and WhatsApp Business API (Meta Cloud API).</w:t>
+        <w:t xml:space="preserve">Email (SendGrid) and WhatsApp Business API (Meta Cloud API). Same-contact, same-topic messages across channels are recognized as one conversation.</w:t>
       </w:r>
     </w:p>
     <w:p>
@@ -717,7 +780,7 @@
         <w:pStyle w:val="Compact"/>
         <w:numPr>
           <w:ilvl w:val="0"/>
-          <w:numId w:val="1001"/>
+          <w:numId w:val="1002"/>
         </w:numPr>
       </w:pPr>
       <w:r>
@@ -739,467 +802,6 @@
           <w:rFonts w:ascii="Times New Roman" w:hAnsi="Times New Roman" w:eastAsia="Times New Roman"/>
         </w:rPr>
         <w:t xml:space="preserve">— MX/TXT records generated by Sequor. Takes 5–30 minutes.</w:t>
-      </w:r>
-    </w:p>
-    <w:p>
-      <w:pPr>
-        <w:pStyle w:val="Compact"/>
-        <w:numPr>
-          <w:ilvl w:val="0"/>
-          <w:numId w:val="1001"/>
-        </w:numPr>
-      </w:pPr>
-      <w:r>
-        <w:rPr>
-          <w:b/>
-          <w:bCs/>
-          <w:rFonts w:ascii="Times New Roman" w:hAnsi="Times New Roman" w:eastAsia="Times New Roman"/>
-        </w:rPr>
-        <w:t xml:space="preserve">WhatsApp Business Account</w:t>
-      </w:r>
-      <w:r>
-        <w:rPr>
-          <w:rFonts w:ascii="Times New Roman" w:hAnsi="Times New Roman" w:eastAsia="Times New Roman"/>
-        </w:rPr>
-        <w:t xml:space="preserve"> </w:t>
-      </w:r>
-      <w:r>
-        <w:rPr>
-          <w:rFonts w:ascii="Times New Roman" w:hAnsi="Times New Roman" w:eastAsia="Times New Roman"/>
-        </w:rPr>
-        <w:t xml:space="preserve">(if using WhatsApp) — Meta Business Account, verify phone number, approve Cloud API app. Takes 1–2 hours.</w:t>
-      </w:r>
-    </w:p>
-    <w:p>
-      <w:pPr>
-        <w:pStyle w:val="Compact"/>
-        <w:numPr>
-          <w:ilvl w:val="0"/>
-          <w:numId w:val="1001"/>
-        </w:numPr>
-      </w:pPr>
-      <w:r>
-        <w:rPr>
-          <w:b/>
-          <w:bCs/>
-          <w:rFonts w:ascii="Times New Roman" w:hAnsi="Times New Roman" w:eastAsia="Times New Roman"/>
-        </w:rPr>
-        <w:t xml:space="preserve">SendGrid account</w:t>
-      </w:r>
-      <w:r>
-        <w:rPr>
-          <w:rFonts w:ascii="Times New Roman" w:hAnsi="Times New Roman" w:eastAsia="Times New Roman"/>
-        </w:rPr>
-        <w:t xml:space="preserve"> </w:t>
-      </w:r>
-      <w:r>
-        <w:rPr>
-          <w:rFonts w:ascii="Times New Roman" w:hAnsi="Times New Roman" w:eastAsia="Times New Roman"/>
-        </w:rPr>
-        <w:t xml:space="preserve">(if using email) — Free tier sufficient for most.</w:t>
-      </w:r>
-    </w:p>
-    <w:p>
-      <w:pPr>
-        <w:pStyle w:val="Compact"/>
-        <w:numPr>
-          <w:ilvl w:val="0"/>
-          <w:numId w:val="1001"/>
-        </w:numPr>
-      </w:pPr>
-      <w:r>
-        <w:rPr>
-          <w:b/>
-          <w:bCs/>
-          <w:rFonts w:ascii="Times New Roman" w:hAnsi="Times New Roman" w:eastAsia="Times New Roman"/>
-        </w:rPr>
-        <w:t xml:space="preserve">Upload initial documents</w:t>
-      </w:r>
-      <w:r>
-        <w:rPr>
-          <w:rFonts w:ascii="Times New Roman" w:hAnsi="Times New Roman" w:eastAsia="Times New Roman"/>
-        </w:rPr>
-        <w:t xml:space="preserve"> </w:t>
-      </w:r>
-      <w:r>
-        <w:rPr>
-          <w:rFonts w:ascii="Times New Roman" w:hAnsi="Times New Roman" w:eastAsia="Times New Roman"/>
-        </w:rPr>
-        <w:t xml:space="preserve">— FAQ and policy documents minimum.</w:t>
-      </w:r>
-    </w:p>
-    <w:p>
-      <w:pPr>
-        <w:pStyle w:val="Compact"/>
-        <w:numPr>
-          <w:ilvl w:val="0"/>
-          <w:numId w:val="1001"/>
-        </w:numPr>
-      </w:pPr>
-      <w:r>
-        <w:rPr>
-          <w:b/>
-          <w:bCs/>
-          <w:rFonts w:ascii="Times New Roman" w:hAnsi="Times New Roman" w:eastAsia="Times New Roman"/>
-        </w:rPr>
-        <w:t xml:space="preserve">Set escalation contacts</w:t>
-      </w:r>
-      <w:r>
-        <w:rPr>
-          <w:rFonts w:ascii="Times New Roman" w:hAnsi="Times New Roman" w:eastAsia="Times New Roman"/>
-        </w:rPr>
-        <w:t xml:space="preserve"> </w:t>
-      </w:r>
-      <w:r>
-        <w:rPr>
-          <w:rFonts w:ascii="Times New Roman" w:hAnsi="Times New Roman" w:eastAsia="Times New Roman"/>
-        </w:rPr>
-        <w:t xml:space="preserve">— At least one human backup contact.</w:t>
-      </w:r>
-    </w:p>
-    <w:p>
-      <w:pPr>
-        <w:pStyle w:val="Compact"/>
-        <w:numPr>
-          <w:ilvl w:val="0"/>
-          <w:numId w:val="1001"/>
-        </w:numPr>
-      </w:pPr>
-      <w:r>
-        <w:rPr>
-          <w:b/>
-          <w:bCs/>
-          <w:rFonts w:ascii="Times New Roman" w:hAnsi="Times New Roman" w:eastAsia="Times New Roman"/>
-        </w:rPr>
-        <w:t xml:space="preserve">Configure SLA</w:t>
-      </w:r>
-      <w:r>
-        <w:rPr>
-          <w:rFonts w:ascii="Times New Roman" w:hAnsi="Times New Roman" w:eastAsia="Times New Roman"/>
-        </w:rPr>
-        <w:t xml:space="preserve"> </w:t>
-      </w:r>
-      <w:r>
-        <w:rPr>
-          <w:rFonts w:ascii="Times New Roman" w:hAnsi="Times New Roman" w:eastAsia="Times New Roman"/>
-        </w:rPr>
-        <w:t xml:space="preserve">— Hours before an unresolved query escalates.</w:t>
-      </w:r>
-    </w:p>
-    <w:p>
-      <w:pPr>
-        <w:pStyle w:val="FirstParagraph"/>
-      </w:pPr>
-      <w:r>
-        <w:rPr>
-          <w:rFonts w:ascii="Times New Roman" w:hAnsi="Times New Roman" w:eastAsia="Times New Roman"/>
-        </w:rPr>
-        <w:t xml:space="preserve">Total setup time for a non-technical owner:</w:t>
-      </w:r>
-      <w:r>
-        <w:rPr>
-          <w:rFonts w:ascii="Times New Roman" w:hAnsi="Times New Roman" w:eastAsia="Times New Roman"/>
-        </w:rPr>
-        <w:t xml:space="preserve"> </w:t>
-      </w:r>
-      <w:r>
-        <w:rPr>
-          <w:b/>
-          <w:bCs/>
-          <w:rFonts w:ascii="Times New Roman" w:hAnsi="Times New Roman" w:eastAsia="Times New Roman"/>
-        </w:rPr>
-        <w:t xml:space="preserve">2–4 hours</w:t>
-      </w:r>
-      <w:r>
-        <w:rPr>
-          <w:rFonts w:ascii="Times New Roman" w:hAnsi="Times New Roman" w:eastAsia="Times New Roman"/>
-        </w:rPr>
-        <w:t xml:space="preserve">.</w:t>
-      </w:r>
-    </w:p>
-    <w:bookmarkEnd w:id="12"/>
-    <w:bookmarkStart w:id="13" w:name="data-continuity"/>
-    <w:p>
-      <w:pPr>
-        <w:pStyle w:val="Heading3"/>
-      </w:pPr>
-      <w:r>
-        <w:rPr>
-          <w:rFonts w:ascii="Times New Roman" w:hAnsi="Times New Roman" w:eastAsia="Times New Roman"/>
-        </w:rPr>
-        <w:t xml:space="preserve">Data Continuity</w:t>
-      </w:r>
-    </w:p>
-    <w:p>
-      <w:pPr>
-        <w:pStyle w:val="FirstParagraph"/>
-      </w:pPr>
-      <w:r>
-        <w:rPr>
-          <w:rFonts w:ascii="Times New Roman" w:hAnsi="Times New Roman" w:eastAsia="Times New Roman"/>
-        </w:rPr>
-        <w:t xml:space="preserve">If Sequor ceases operation: all data exported in CSV/JSON on request; database self-hosted via Docker image; no proprietary lock-in.</w:t>
-      </w:r>
-    </w:p>
-    <w:p>
-      <w:r>
-        <w:rPr>
-          <w:rFonts w:ascii="Times New Roman" w:hAnsi="Times New Roman" w:eastAsia="Times New Roman"/>
-        </w:rPr>
-        <w:pict>
-          <v:rect style="width:0;height:1.5pt" o:hralign="center" o:hrstd="t" o:hr="t"/>
-        </w:pict>
-      </w:r>
-    </w:p>
-    <w:bookmarkEnd w:id="13"/>
-    <w:bookmarkEnd w:id="14"/>
-    <w:bookmarkStart w:id="20" w:name="user-guide-day-to-day-operations"/>
-    <w:p>
-      <w:pPr>
-        <w:pStyle w:val="Heading2"/>
-      </w:pPr>
-      <w:r>
-        <w:rPr>
-          <w:rFonts w:ascii="Times New Roman" w:hAnsi="Times New Roman" w:eastAsia="Times New Roman"/>
-        </w:rPr>
-        <w:t xml:space="preserve">3. User Guide — Day-to-Day Operations</w:t>
-      </w:r>
-    </w:p>
-    <w:bookmarkStart w:id="15" w:name="X465a4090bed950a913c8b361c782ea55f99375c"/>
-    <w:p>
-      <w:pPr>
-        <w:pStyle w:val="Heading3"/>
-      </w:pPr>
-      <w:r>
-        <w:rPr>
-          <w:rFonts w:ascii="Times New Roman" w:hAnsi="Times New Roman" w:eastAsia="Times New Roman"/>
-        </w:rPr>
-        <w:t xml:space="preserve">What You Will Receive as a Backup Contact</w:t>
-      </w:r>
-    </w:p>
-    <w:p>
-      <w:pPr>
-        <w:pStyle w:val="FirstParagraph"/>
-      </w:pPr>
-      <w:r>
-        <w:rPr>
-          <w:rFonts w:ascii="Times New Roman" w:hAnsi="Times New Roman" w:eastAsia="Times New Roman"/>
-        </w:rPr>
-        <w:t xml:space="preserve">When an escalation is created, you receive this email:</w:t>
-      </w:r>
-    </w:p>
-    <w:p>
-      <w:pPr>
-        <w:pStyle w:val="SourceCode"/>
-      </w:pPr>
-      <w:r>
-        <w:rPr>
-          <w:rStyle w:val="VerbatimChar"/>
-          <w:rFonts w:ascii="Times New Roman" w:hAnsi="Times New Roman" w:eastAsia="Times New Roman"/>
-        </w:rPr>
-        <w:t xml:space="preserve">Subject: [UNRESOLVED] Question about bulk order pricing (Ref: a1b2c3d4)</w:t>
-      </w:r>
-      <w:r>
-        <w:rPr>
-          <w:rFonts w:ascii="Times New Roman" w:hAnsi="Times New Roman" w:eastAsia="Times New Roman"/>
-        </w:rPr>
-        <w:br/>
-      </w:r>
-      <w:r>
-        <w:rPr>
-          <w:rFonts w:ascii="Times New Roman" w:hAnsi="Times New Roman" w:eastAsia="Times New Roman"/>
-        </w:rPr>
-        <w:br/>
-      </w:r>
-      <w:r>
-        <w:rPr>
-          <w:rStyle w:val="VerbatimChar"/>
-          <w:rFonts w:ascii="Times New Roman" w:hAnsi="Times New Roman" w:eastAsia="Times New Roman"/>
-        </w:rPr>
-        <w:t xml:space="preserve">Client: Sarah Tan (WhatsApp) · Received: 14 May 2026, 9:42 AM</w:t>
-      </w:r>
-      <w:r>
-        <w:rPr>
-          <w:rFonts w:ascii="Times New Roman" w:hAnsi="Times New Roman" w:eastAsia="Times New Roman"/>
-        </w:rPr>
-        <w:br/>
-      </w:r>
-      <w:r>
-        <w:rPr>
-          <w:rStyle w:val="VerbatimChar"/>
-          <w:rFonts w:ascii="Times New Roman" w:hAnsi="Times New Roman" w:eastAsia="Times New Roman"/>
-        </w:rPr>
-        <w:t xml:space="preserve">Confidence: Moderate (67%) — semi_routine</w:t>
-      </w:r>
-      <w:r>
-        <w:rPr>
-          <w:rFonts w:ascii="Times New Roman" w:hAnsi="Times New Roman" w:eastAsia="Times New Roman"/>
-        </w:rPr>
-        <w:br/>
-      </w:r>
-      <w:r>
-        <w:rPr>
-          <w:rFonts w:ascii="Times New Roman" w:hAnsi="Times New Roman" w:eastAsia="Times New Roman"/>
-        </w:rPr>
-        <w:br/>
-      </w:r>
-      <w:r>
-        <w:rPr>
-          <w:rStyle w:val="VerbatimChar"/>
-          <w:rFonts w:ascii="Times New Roman" w:hAnsi="Times New Roman" w:eastAsia="Times New Roman"/>
-        </w:rPr>
-        <w:t xml:space="preserve">Hi, do you offer discounts for bulk orders of 500+ units?</w:t>
-      </w:r>
-      <w:r>
-        <w:rPr>
-          <w:rFonts w:ascii="Times New Roman" w:hAnsi="Times New Roman" w:eastAsia="Times New Roman"/>
-        </w:rPr>
-        <w:br/>
-      </w:r>
-      <w:r>
-        <w:rPr>
-          <w:rFonts w:ascii="Times New Roman" w:hAnsi="Times New Roman" w:eastAsia="Times New Roman"/>
-        </w:rPr>
-        <w:br/>
-      </w:r>
-      <w:r>
-        <w:rPr>
-          <w:rStyle w:val="VerbatimChar"/>
-          <w:rFonts w:ascii="Times New Roman" w:hAnsi="Times New Roman" w:eastAsia="Times New Roman"/>
-        </w:rPr>
-        <w:t xml:space="preserve">→ Reply to this email to send your response to the client.</w:t>
-      </w:r>
-      <w:r>
-        <w:rPr>
-          <w:rFonts w:ascii="Times New Roman" w:hAnsi="Times New Roman" w:eastAsia="Times New Roman"/>
-        </w:rPr>
-        <w:br/>
-      </w:r>
-      <w:r>
-        <w:rPr>
-          <w:rStyle w:val="VerbatimChar"/>
-          <w:rFonts w:ascii="Times New Roman" w:hAnsi="Times New Roman" w:eastAsia="Times New Roman"/>
-        </w:rPr>
-        <w:t xml:space="preserve">→ If unresolved by 14 May 2026, 2:00 PM, this escalates to John Lim.</w:t>
-      </w:r>
-      <w:r>
-        <w:rPr>
-          <w:rFonts w:ascii="Times New Roman" w:hAnsi="Times New Roman" w:eastAsia="Times New Roman"/>
-        </w:rPr>
-        <w:br/>
-      </w:r>
-      <w:r>
-        <w:rPr>
-          <w:rFonts w:ascii="Times New Roman" w:hAnsi="Times New Roman" w:eastAsia="Times New Roman"/>
-        </w:rPr>
-        <w:br/>
-      </w:r>
-      <w:r>
-        <w:rPr>
-          <w:rStyle w:val="VerbatimChar"/>
-          <w:rFonts w:ascii="Times New Roman" w:hAnsi="Times New Roman" w:eastAsia="Times New Roman"/>
-        </w:rPr>
-        <w:t xml:space="preserve">AI suggested response:</w:t>
-      </w:r>
-      <w:r>
-        <w:rPr>
-          <w:rFonts w:ascii="Times New Roman" w:hAnsi="Times New Roman" w:eastAsia="Times New Roman"/>
-        </w:rPr>
-        <w:br/>
-      </w:r>
-      <w:r>
-        <w:rPr>
-          <w:rStyle w:val="VerbatimChar"/>
-          <w:rFonts w:ascii="Times New Roman" w:hAnsi="Times New Roman" w:eastAsia="Times New Roman"/>
-        </w:rPr>
-        <w:t xml:space="preserve">Yes, we offer bulk discounts. Orders of 500+ units qualify for our</w:t>
-      </w:r>
-      <w:r>
-        <w:rPr>
-          <w:rFonts w:ascii="Times New Roman" w:hAnsi="Times New Roman" w:eastAsia="Times New Roman"/>
-        </w:rPr>
-        <w:br/>
-      </w:r>
-      <w:r>
-        <w:rPr>
-          <w:rStyle w:val="VerbatimChar"/>
-          <w:rFonts w:ascii="Times New Roman" w:hAnsi="Times New Roman" w:eastAsia="Times New Roman"/>
-        </w:rPr>
-        <w:t xml:space="preserve">wholesale rate, 15% below standard pricing.</w:t>
-      </w:r>
-    </w:p>
-    <w:p>
-      <w:pPr>
-        <w:pStyle w:val="FirstParagraph"/>
-      </w:pPr>
-      <w:r>
-        <w:rPr>
-          <w:rFonts w:ascii="Times New Roman" w:hAnsi="Times New Roman" w:eastAsia="Times New Roman"/>
-        </w:rPr>
-        <w:t xml:space="preserve">Your options: reply directly, edit the AI draft, or compose your own. The draft is a starting point, not a constraint.</w:t>
-      </w:r>
-    </w:p>
-    <w:bookmarkEnd w:id="15"/>
-    <w:bookmarkStart w:id="16" w:name="human-override"/>
-    <w:p>
-      <w:pPr>
-        <w:pStyle w:val="Heading3"/>
-      </w:pPr>
-      <w:r>
-        <w:rPr>
-          <w:rFonts w:ascii="Times New Roman" w:hAnsi="Times New Roman" w:eastAsia="Times New Roman"/>
-        </w:rPr>
-        <w:t xml:space="preserve">HUMAN Override</w:t>
-      </w:r>
-    </w:p>
-    <w:p>
-      <w:pPr>
-        <w:pStyle w:val="FirstParagraph"/>
-      </w:pPr>
-      <w:r>
-        <w:rPr>
-          <w:rFonts w:ascii="Times New Roman" w:hAnsi="Times New Roman" w:eastAsia="Times New Roman"/>
-        </w:rPr>
-        <w:t xml:space="preserve">Customers type</w:t>
-      </w:r>
-      <w:r>
-        <w:rPr>
-          <w:rFonts w:ascii="Times New Roman" w:hAnsi="Times New Roman" w:eastAsia="Times New Roman"/>
-        </w:rPr>
-        <w:t xml:space="preserve"> </w:t>
-      </w:r>
-      <w:r>
-        <w:rPr>
-          <w:b/>
-          <w:bCs/>
-          <w:rFonts w:ascii="Times New Roman" w:hAnsi="Times New Roman" w:eastAsia="Times New Roman"/>
-        </w:rPr>
-        <w:t xml:space="preserve">HUMAN</w:t>
-      </w:r>
-      <w:r>
-        <w:rPr>
-          <w:rFonts w:ascii="Times New Roman" w:hAnsi="Times New Roman" w:eastAsia="Times New Roman"/>
-        </w:rPr>
-        <w:t xml:space="preserve"> </w:t>
-      </w:r>
-      <w:r>
-        <w:rPr>
-          <w:rFonts w:ascii="Times New Roman" w:hAnsi="Times New Roman" w:eastAsia="Times New Roman"/>
-        </w:rPr>
-        <w:t xml:space="preserve">(or HUMAN help) in any message to force immediate escalation. Their contact record is flagged so your team handles them manually going forward.</w:t>
-      </w:r>
-    </w:p>
-    <w:bookmarkEnd w:id="16"/>
-    <w:bookmarkStart w:id="17" w:name="common-tasks"/>
-    <w:p>
-      <w:pPr>
-        <w:pStyle w:val="Heading3"/>
-      </w:pPr>
-      <w:r>
-        <w:rPr>
-          <w:rFonts w:ascii="Times New Roman" w:hAnsi="Times New Roman" w:eastAsia="Times New Roman"/>
-        </w:rPr>
-        <w:t xml:space="preserve">Common Tasks</w:t>
       </w:r>
     </w:p>
     <w:p>
@@ -1216,7 +818,7 @@
           <w:bCs/>
           <w:rFonts w:ascii="Times New Roman" w:hAnsi="Times New Roman" w:eastAsia="Times New Roman"/>
         </w:rPr>
-        <w:t xml:space="preserve">Upload a document:</w:t>
+        <w:t xml:space="preserve">WhatsApp Business Account</w:t>
       </w:r>
       <w:r>
         <w:rPr>
@@ -1228,7 +830,7 @@
         <w:rPr>
           <w:rFonts w:ascii="Times New Roman" w:hAnsi="Times New Roman" w:eastAsia="Times New Roman"/>
         </w:rPr>
-        <w:t xml:space="preserve">Documents → Upload → PDF/DOCX/TXT (max 25MB) → assign type → wait for Ready status.</w:t>
+        <w:t xml:space="preserve">(if using WhatsApp) — Meta Business Account, verify phone number, approve Cloud API app. Takes 1–2 hours.</w:t>
       </w:r>
     </w:p>
     <w:p>
@@ -1245,7 +847,7 @@
           <w:bCs/>
           <w:rFonts w:ascii="Times New Roman" w:hAnsi="Times New Roman" w:eastAsia="Times New Roman"/>
         </w:rPr>
-        <w:t xml:space="preserve">Add a key phrase:</w:t>
+        <w:t xml:space="preserve">SendGrid account</w:t>
       </w:r>
       <w:r>
         <w:rPr>
@@ -1257,7 +859,7 @@
         <w:rPr>
           <w:rFonts w:ascii="Times New Roman" w:hAnsi="Times New Roman" w:eastAsia="Times New Roman"/>
         </w:rPr>
-        <w:t xml:space="preserve">Key Phrases → Add → phrase → assign to document → set confidence boost. Use Suggest for AI-proposed phrases.</w:t>
+        <w:t xml:space="preserve">(if using email) — Free tier sufficient for most.</w:t>
       </w:r>
     </w:p>
     <w:p>
@@ -1274,7 +876,7 @@
           <w:bCs/>
           <w:rFonts w:ascii="Times New Roman" w:hAnsi="Times New Roman" w:eastAsia="Times New Roman"/>
         </w:rPr>
-        <w:t xml:space="preserve">Handle a PDPA erasure request:</w:t>
+        <w:t xml:space="preserve">Upload initial documents</w:t>
       </w:r>
       <w:r>
         <w:rPr>
@@ -1286,7 +888,7 @@
         <w:rPr>
           <w:rFonts w:ascii="Times New Roman" w:hAnsi="Times New Roman" w:eastAsia="Times New Roman"/>
         </w:rPr>
-        <w:t xml:space="preserve">Settings → Compliance → Erase Contact Data → enter email. All personal data deleted within 30 days.</w:t>
+        <w:t xml:space="preserve">— FAQ and policy documents minimum.</w:t>
       </w:r>
     </w:p>
     <w:p>
@@ -1295,6 +897,467 @@
         <w:numPr>
           <w:ilvl w:val="0"/>
           <w:numId w:val="1002"/>
+        </w:numPr>
+      </w:pPr>
+      <w:r>
+        <w:rPr>
+          <w:b/>
+          <w:bCs/>
+          <w:rFonts w:ascii="Times New Roman" w:hAnsi="Times New Roman" w:eastAsia="Times New Roman"/>
+        </w:rPr>
+        <w:t xml:space="preserve">Set escalation contacts</w:t>
+      </w:r>
+      <w:r>
+        <w:rPr>
+          <w:rFonts w:ascii="Times New Roman" w:hAnsi="Times New Roman" w:eastAsia="Times New Roman"/>
+        </w:rPr>
+        <w:t xml:space="preserve"> </w:t>
+      </w:r>
+      <w:r>
+        <w:rPr>
+          <w:rFonts w:ascii="Times New Roman" w:hAnsi="Times New Roman" w:eastAsia="Times New Roman"/>
+        </w:rPr>
+        <w:t xml:space="preserve">— At least one human backup contact.</w:t>
+      </w:r>
+    </w:p>
+    <w:p>
+      <w:pPr>
+        <w:pStyle w:val="Compact"/>
+        <w:numPr>
+          <w:ilvl w:val="0"/>
+          <w:numId w:val="1002"/>
+        </w:numPr>
+      </w:pPr>
+      <w:r>
+        <w:rPr>
+          <w:b/>
+          <w:bCs/>
+          <w:rFonts w:ascii="Times New Roman" w:hAnsi="Times New Roman" w:eastAsia="Times New Roman"/>
+        </w:rPr>
+        <w:t xml:space="preserve">Configure SLA</w:t>
+      </w:r>
+      <w:r>
+        <w:rPr>
+          <w:rFonts w:ascii="Times New Roman" w:hAnsi="Times New Roman" w:eastAsia="Times New Roman"/>
+        </w:rPr>
+        <w:t xml:space="preserve"> </w:t>
+      </w:r>
+      <w:r>
+        <w:rPr>
+          <w:rFonts w:ascii="Times New Roman" w:hAnsi="Times New Roman" w:eastAsia="Times New Roman"/>
+        </w:rPr>
+        <w:t xml:space="preserve">— Hours before an unresolved query escalates.</w:t>
+      </w:r>
+    </w:p>
+    <w:p>
+      <w:pPr>
+        <w:pStyle w:val="FirstParagraph"/>
+      </w:pPr>
+      <w:r>
+        <w:rPr>
+          <w:rFonts w:ascii="Times New Roman" w:hAnsi="Times New Roman" w:eastAsia="Times New Roman"/>
+        </w:rPr>
+        <w:t xml:space="preserve">Total setup time for a non-technical owner:</w:t>
+      </w:r>
+      <w:r>
+        <w:rPr>
+          <w:rFonts w:ascii="Times New Roman" w:hAnsi="Times New Roman" w:eastAsia="Times New Roman"/>
+        </w:rPr>
+        <w:t xml:space="preserve"> </w:t>
+      </w:r>
+      <w:r>
+        <w:rPr>
+          <w:b/>
+          <w:bCs/>
+          <w:rFonts w:ascii="Times New Roman" w:hAnsi="Times New Roman" w:eastAsia="Times New Roman"/>
+        </w:rPr>
+        <w:t xml:space="preserve">2–4 hours</w:t>
+      </w:r>
+      <w:r>
+        <w:rPr>
+          <w:rFonts w:ascii="Times New Roman" w:hAnsi="Times New Roman" w:eastAsia="Times New Roman"/>
+        </w:rPr>
+        <w:t xml:space="preserve">.</w:t>
+      </w:r>
+    </w:p>
+    <w:bookmarkEnd w:id="12"/>
+    <w:bookmarkStart w:id="13" w:name="data-continuity"/>
+    <w:p>
+      <w:pPr>
+        <w:pStyle w:val="Heading3"/>
+      </w:pPr>
+      <w:r>
+        <w:rPr>
+          <w:rFonts w:ascii="Times New Roman" w:hAnsi="Times New Roman" w:eastAsia="Times New Roman"/>
+        </w:rPr>
+        <w:t xml:space="preserve">Data Continuity</w:t>
+      </w:r>
+    </w:p>
+    <w:p>
+      <w:pPr>
+        <w:pStyle w:val="FirstParagraph"/>
+      </w:pPr>
+      <w:r>
+        <w:rPr>
+          <w:rFonts w:ascii="Times New Roman" w:hAnsi="Times New Roman" w:eastAsia="Times New Roman"/>
+        </w:rPr>
+        <w:t xml:space="preserve">If Sequor ceases operation: all data exported in CSV/JSON on request; database self-hosted via Docker image; no proprietary lock-in.</w:t>
+      </w:r>
+    </w:p>
+    <w:p>
+      <w:r>
+        <w:rPr>
+          <w:rFonts w:ascii="Times New Roman" w:hAnsi="Times New Roman" w:eastAsia="Times New Roman"/>
+        </w:rPr>
+        <w:pict>
+          <v:rect style="width:0;height:1.5pt" o:hralign="center" o:hrstd="t" o:hr="t"/>
+        </w:pict>
+      </w:r>
+    </w:p>
+    <w:bookmarkEnd w:id="13"/>
+    <w:bookmarkEnd w:id="14"/>
+    <w:bookmarkStart w:id="20" w:name="user-guide-day-to-day-operations"/>
+    <w:p>
+      <w:pPr>
+        <w:pStyle w:val="Heading2"/>
+      </w:pPr>
+      <w:r>
+        <w:rPr>
+          <w:rFonts w:ascii="Times New Roman" w:hAnsi="Times New Roman" w:eastAsia="Times New Roman"/>
+        </w:rPr>
+        <w:t xml:space="preserve">3. User Guide — Day-to-Day Operations</w:t>
+      </w:r>
+    </w:p>
+    <w:bookmarkStart w:id="15" w:name="X465a4090bed950a913c8b361c782ea55f99375c"/>
+    <w:p>
+      <w:pPr>
+        <w:pStyle w:val="Heading3"/>
+      </w:pPr>
+      <w:r>
+        <w:rPr>
+          <w:rFonts w:ascii="Times New Roman" w:hAnsi="Times New Roman" w:eastAsia="Times New Roman"/>
+        </w:rPr>
+        <w:t xml:space="preserve">What You Will Receive as a Backup Contact</w:t>
+      </w:r>
+    </w:p>
+    <w:p>
+      <w:pPr>
+        <w:pStyle w:val="FirstParagraph"/>
+      </w:pPr>
+      <w:r>
+        <w:rPr>
+          <w:rFonts w:ascii="Times New Roman" w:hAnsi="Times New Roman" w:eastAsia="Times New Roman"/>
+        </w:rPr>
+        <w:t xml:space="preserve">When an escalation is created, you receive this email:</w:t>
+      </w:r>
+    </w:p>
+    <w:p>
+      <w:pPr>
+        <w:pStyle w:val="SourceCode"/>
+      </w:pPr>
+      <w:r>
+        <w:rPr>
+          <w:rStyle w:val="VerbatimChar"/>
+          <w:rFonts w:ascii="Times New Roman" w:hAnsi="Times New Roman" w:eastAsia="Times New Roman"/>
+        </w:rPr>
+        <w:t xml:space="preserve">Subject: [UNRESOLVED] Question about bulk order pricing (Ref: a1b2c3d4)</w:t>
+      </w:r>
+      <w:r>
+        <w:rPr>
+          <w:rFonts w:ascii="Times New Roman" w:hAnsi="Times New Roman" w:eastAsia="Times New Roman"/>
+        </w:rPr>
+        <w:br/>
+      </w:r>
+      <w:r>
+        <w:rPr>
+          <w:rFonts w:ascii="Times New Roman" w:hAnsi="Times New Roman" w:eastAsia="Times New Roman"/>
+        </w:rPr>
+        <w:br/>
+      </w:r>
+      <w:r>
+        <w:rPr>
+          <w:rStyle w:val="VerbatimChar"/>
+          <w:rFonts w:ascii="Times New Roman" w:hAnsi="Times New Roman" w:eastAsia="Times New Roman"/>
+        </w:rPr>
+        <w:t xml:space="preserve">Client: Sarah Tan (WhatsApp) · Received: 14 May 2026, 9:42 AM</w:t>
+      </w:r>
+      <w:r>
+        <w:rPr>
+          <w:rFonts w:ascii="Times New Roman" w:hAnsi="Times New Roman" w:eastAsia="Times New Roman"/>
+        </w:rPr>
+        <w:br/>
+      </w:r>
+      <w:r>
+        <w:rPr>
+          <w:rStyle w:val="VerbatimChar"/>
+          <w:rFonts w:ascii="Times New Roman" w:hAnsi="Times New Roman" w:eastAsia="Times New Roman"/>
+        </w:rPr>
+        <w:t xml:space="preserve">Confidence: Moderate (67%) — semi_routine</w:t>
+      </w:r>
+      <w:r>
+        <w:rPr>
+          <w:rFonts w:ascii="Times New Roman" w:hAnsi="Times New Roman" w:eastAsia="Times New Roman"/>
+        </w:rPr>
+        <w:br/>
+      </w:r>
+      <w:r>
+        <w:rPr>
+          <w:rFonts w:ascii="Times New Roman" w:hAnsi="Times New Roman" w:eastAsia="Times New Roman"/>
+        </w:rPr>
+        <w:br/>
+      </w:r>
+      <w:r>
+        <w:rPr>
+          <w:rStyle w:val="VerbatimChar"/>
+          <w:rFonts w:ascii="Times New Roman" w:hAnsi="Times New Roman" w:eastAsia="Times New Roman"/>
+        </w:rPr>
+        <w:t xml:space="preserve">Hi, do you offer discounts for bulk orders of 500+ units?</w:t>
+      </w:r>
+      <w:r>
+        <w:rPr>
+          <w:rFonts w:ascii="Times New Roman" w:hAnsi="Times New Roman" w:eastAsia="Times New Roman"/>
+        </w:rPr>
+        <w:br/>
+      </w:r>
+      <w:r>
+        <w:rPr>
+          <w:rFonts w:ascii="Times New Roman" w:hAnsi="Times New Roman" w:eastAsia="Times New Roman"/>
+        </w:rPr>
+        <w:br/>
+      </w:r>
+      <w:r>
+        <w:rPr>
+          <w:rStyle w:val="VerbatimChar"/>
+          <w:rFonts w:ascii="Times New Roman" w:hAnsi="Times New Roman" w:eastAsia="Times New Roman"/>
+        </w:rPr>
+        <w:t xml:space="preserve">→ Reply to this email to send your response to the client.</w:t>
+      </w:r>
+      <w:r>
+        <w:rPr>
+          <w:rFonts w:ascii="Times New Roman" w:hAnsi="Times New Roman" w:eastAsia="Times New Roman"/>
+        </w:rPr>
+        <w:br/>
+      </w:r>
+      <w:r>
+        <w:rPr>
+          <w:rStyle w:val="VerbatimChar"/>
+          <w:rFonts w:ascii="Times New Roman" w:hAnsi="Times New Roman" w:eastAsia="Times New Roman"/>
+        </w:rPr>
+        <w:t xml:space="preserve">→ If unresolved by 14 May 2026, 2:00 PM, this escalates to John Lim.</w:t>
+      </w:r>
+      <w:r>
+        <w:rPr>
+          <w:rFonts w:ascii="Times New Roman" w:hAnsi="Times New Roman" w:eastAsia="Times New Roman"/>
+        </w:rPr>
+        <w:br/>
+      </w:r>
+      <w:r>
+        <w:rPr>
+          <w:rFonts w:ascii="Times New Roman" w:hAnsi="Times New Roman" w:eastAsia="Times New Roman"/>
+        </w:rPr>
+        <w:br/>
+      </w:r>
+      <w:r>
+        <w:rPr>
+          <w:rStyle w:val="VerbatimChar"/>
+          <w:rFonts w:ascii="Times New Roman" w:hAnsi="Times New Roman" w:eastAsia="Times New Roman"/>
+        </w:rPr>
+        <w:t xml:space="preserve">AI suggested response:</w:t>
+      </w:r>
+      <w:r>
+        <w:rPr>
+          <w:rFonts w:ascii="Times New Roman" w:hAnsi="Times New Roman" w:eastAsia="Times New Roman"/>
+        </w:rPr>
+        <w:br/>
+      </w:r>
+      <w:r>
+        <w:rPr>
+          <w:rStyle w:val="VerbatimChar"/>
+          <w:rFonts w:ascii="Times New Roman" w:hAnsi="Times New Roman" w:eastAsia="Times New Roman"/>
+        </w:rPr>
+        <w:t xml:space="preserve">Yes, we offer bulk discounts. Orders of 500+ units qualify for our</w:t>
+      </w:r>
+      <w:r>
+        <w:rPr>
+          <w:rFonts w:ascii="Times New Roman" w:hAnsi="Times New Roman" w:eastAsia="Times New Roman"/>
+        </w:rPr>
+        <w:br/>
+      </w:r>
+      <w:r>
+        <w:rPr>
+          <w:rStyle w:val="VerbatimChar"/>
+          <w:rFonts w:ascii="Times New Roman" w:hAnsi="Times New Roman" w:eastAsia="Times New Roman"/>
+        </w:rPr>
+        <w:t xml:space="preserve">wholesale rate, 15% below standard pricing.</w:t>
+      </w:r>
+    </w:p>
+    <w:p>
+      <w:pPr>
+        <w:pStyle w:val="FirstParagraph"/>
+      </w:pPr>
+      <w:r>
+        <w:rPr>
+          <w:rFonts w:ascii="Times New Roman" w:hAnsi="Times New Roman" w:eastAsia="Times New Roman"/>
+        </w:rPr>
+        <w:t xml:space="preserve">Your options: reply directly, edit the AI draft, or compose your own. The draft is a starting point, not a constraint.</w:t>
+      </w:r>
+    </w:p>
+    <w:bookmarkEnd w:id="15"/>
+    <w:bookmarkStart w:id="16" w:name="human-override"/>
+    <w:p>
+      <w:pPr>
+        <w:pStyle w:val="Heading3"/>
+      </w:pPr>
+      <w:r>
+        <w:rPr>
+          <w:rFonts w:ascii="Times New Roman" w:hAnsi="Times New Roman" w:eastAsia="Times New Roman"/>
+        </w:rPr>
+        <w:t xml:space="preserve">HUMAN Override</w:t>
+      </w:r>
+    </w:p>
+    <w:p>
+      <w:pPr>
+        <w:pStyle w:val="FirstParagraph"/>
+      </w:pPr>
+      <w:r>
+        <w:rPr>
+          <w:rFonts w:ascii="Times New Roman" w:hAnsi="Times New Roman" w:eastAsia="Times New Roman"/>
+        </w:rPr>
+        <w:t xml:space="preserve">Customers type</w:t>
+      </w:r>
+      <w:r>
+        <w:rPr>
+          <w:rFonts w:ascii="Times New Roman" w:hAnsi="Times New Roman" w:eastAsia="Times New Roman"/>
+        </w:rPr>
+        <w:t xml:space="preserve"> </w:t>
+      </w:r>
+      <w:r>
+        <w:rPr>
+          <w:b/>
+          <w:bCs/>
+          <w:rFonts w:ascii="Times New Roman" w:hAnsi="Times New Roman" w:eastAsia="Times New Roman"/>
+        </w:rPr>
+        <w:t xml:space="preserve">HUMAN</w:t>
+      </w:r>
+      <w:r>
+        <w:rPr>
+          <w:rFonts w:ascii="Times New Roman" w:hAnsi="Times New Roman" w:eastAsia="Times New Roman"/>
+        </w:rPr>
+        <w:t xml:space="preserve"> </w:t>
+      </w:r>
+      <w:r>
+        <w:rPr>
+          <w:rFonts w:ascii="Times New Roman" w:hAnsi="Times New Roman" w:eastAsia="Times New Roman"/>
+        </w:rPr>
+        <w:t xml:space="preserve">(or HUMAN help) in any message to force immediate escalation. Their contact record is flagged so your team handles them manually going forward.</w:t>
+      </w:r>
+    </w:p>
+    <w:bookmarkEnd w:id="16"/>
+    <w:bookmarkStart w:id="17" w:name="common-tasks"/>
+    <w:p>
+      <w:pPr>
+        <w:pStyle w:val="Heading3"/>
+      </w:pPr>
+      <w:r>
+        <w:rPr>
+          <w:rFonts w:ascii="Times New Roman" w:hAnsi="Times New Roman" w:eastAsia="Times New Roman"/>
+        </w:rPr>
+        <w:t xml:space="preserve">Common Tasks</w:t>
+      </w:r>
+    </w:p>
+    <w:p>
+      <w:pPr>
+        <w:pStyle w:val="Compact"/>
+        <w:numPr>
+          <w:ilvl w:val="0"/>
+          <w:numId w:val="1003"/>
+        </w:numPr>
+      </w:pPr>
+      <w:r>
+        <w:rPr>
+          <w:b/>
+          <w:bCs/>
+          <w:rFonts w:ascii="Times New Roman" w:hAnsi="Times New Roman" w:eastAsia="Times New Roman"/>
+        </w:rPr>
+        <w:t xml:space="preserve">Upload a document:</w:t>
+      </w:r>
+      <w:r>
+        <w:rPr>
+          <w:rFonts w:ascii="Times New Roman" w:hAnsi="Times New Roman" w:eastAsia="Times New Roman"/>
+        </w:rPr>
+        <w:t xml:space="preserve"> </w:t>
+      </w:r>
+      <w:r>
+        <w:rPr>
+          <w:rFonts w:ascii="Times New Roman" w:hAnsi="Times New Roman" w:eastAsia="Times New Roman"/>
+        </w:rPr>
+        <w:t xml:space="preserve">Documents → Upload → PDF/DOCX/TXT (max 25MB) → assign type → wait for Ready status.</w:t>
+      </w:r>
+    </w:p>
+    <w:p>
+      <w:pPr>
+        <w:pStyle w:val="Compact"/>
+        <w:numPr>
+          <w:ilvl w:val="0"/>
+          <w:numId w:val="1003"/>
+        </w:numPr>
+      </w:pPr>
+      <w:r>
+        <w:rPr>
+          <w:b/>
+          <w:bCs/>
+          <w:rFonts w:ascii="Times New Roman" w:hAnsi="Times New Roman" w:eastAsia="Times New Roman"/>
+        </w:rPr>
+        <w:t xml:space="preserve">Add a key phrase:</w:t>
+      </w:r>
+      <w:r>
+        <w:rPr>
+          <w:rFonts w:ascii="Times New Roman" w:hAnsi="Times New Roman" w:eastAsia="Times New Roman"/>
+        </w:rPr>
+        <w:t xml:space="preserve"> </w:t>
+      </w:r>
+      <w:r>
+        <w:rPr>
+          <w:rFonts w:ascii="Times New Roman" w:hAnsi="Times New Roman" w:eastAsia="Times New Roman"/>
+        </w:rPr>
+        <w:t xml:space="preserve">Key Phrases → Add → phrase → assign to document → set confidence boost. Use Suggest for AI-proposed phrases.</w:t>
+      </w:r>
+    </w:p>
+    <w:p>
+      <w:pPr>
+        <w:pStyle w:val="Compact"/>
+        <w:numPr>
+          <w:ilvl w:val="0"/>
+          <w:numId w:val="1003"/>
+        </w:numPr>
+      </w:pPr>
+      <w:r>
+        <w:rPr>
+          <w:b/>
+          <w:bCs/>
+          <w:rFonts w:ascii="Times New Roman" w:hAnsi="Times New Roman" w:eastAsia="Times New Roman"/>
+        </w:rPr>
+        <w:t xml:space="preserve">Handle a PDPA erasure request:</w:t>
+      </w:r>
+      <w:r>
+        <w:rPr>
+          <w:rFonts w:ascii="Times New Roman" w:hAnsi="Times New Roman" w:eastAsia="Times New Roman"/>
+        </w:rPr>
+        <w:t xml:space="preserve"> </w:t>
+      </w:r>
+      <w:r>
+        <w:rPr>
+          <w:rFonts w:ascii="Times New Roman" w:hAnsi="Times New Roman" w:eastAsia="Times New Roman"/>
+        </w:rPr>
+        <w:t xml:space="preserve">Settings → Compliance → Erase Contact Data → enter email. All personal data deleted within 30 days.</w:t>
+      </w:r>
+    </w:p>
+    <w:p>
+      <w:pPr>
+        <w:pStyle w:val="Compact"/>
+        <w:numPr>
+          <w:ilvl w:val="0"/>
+          <w:numId w:val="1003"/>
         </w:numPr>
       </w:pPr>
       <w:r>
@@ -3472,7 +3535,7 @@
         <w:pStyle w:val="Compact"/>
         <w:numPr>
           <w:ilvl w:val="0"/>
-          <w:numId w:val="1003"/>
+          <w:numId w:val="1004"/>
         </w:numPr>
       </w:pPr>
       <w:r>
@@ -3500,7 +3563,7 @@
         <w:pStyle w:val="Compact"/>
         <w:numPr>
           <w:ilvl w:val="0"/>
-          <w:numId w:val="1003"/>
+          <w:numId w:val="1004"/>
         </w:numPr>
       </w:pPr>
       <w:r>
@@ -3528,7 +3591,7 @@
         <w:pStyle w:val="Compact"/>
         <w:numPr>
           <w:ilvl w:val="0"/>
-          <w:numId w:val="1003"/>
+          <w:numId w:val="1004"/>
         </w:numPr>
       </w:pPr>
       <w:r>
@@ -3556,7 +3619,7 @@
         <w:pStyle w:val="Compact"/>
         <w:numPr>
           <w:ilvl w:val="0"/>
-          <w:numId w:val="1003"/>
+          <w:numId w:val="1004"/>
         </w:numPr>
       </w:pPr>
       <w:r>
@@ -3584,7 +3647,7 @@
         <w:pStyle w:val="Compact"/>
         <w:numPr>
           <w:ilvl w:val="0"/>
-          <w:numId w:val="1003"/>
+          <w:numId w:val="1004"/>
         </w:numPr>
       </w:pPr>
       <w:r>
@@ -6311,7 +6374,7 @@
         <w:pStyle w:val="Compact"/>
         <w:numPr>
           <w:ilvl w:val="0"/>
-          <w:numId w:val="1004"/>
+          <w:numId w:val="1005"/>
         </w:numPr>
       </w:pPr>
       <w:r>
@@ -6326,7 +6389,7 @@
         <w:pStyle w:val="Compact"/>
         <w:numPr>
           <w:ilvl w:val="0"/>
-          <w:numId w:val="1004"/>
+          <w:numId w:val="1005"/>
         </w:numPr>
       </w:pPr>
       <w:r>
@@ -6341,7 +6404,7 @@
         <w:pStyle w:val="Compact"/>
         <w:numPr>
           <w:ilvl w:val="0"/>
-          <w:numId w:val="1004"/>
+          <w:numId w:val="1005"/>
         </w:numPr>
       </w:pPr>
       <w:r>
@@ -6356,7 +6419,7 @@
         <w:pStyle w:val="Compact"/>
         <w:numPr>
           <w:ilvl w:val="0"/>
-          <w:numId w:val="1004"/>
+          <w:numId w:val="1005"/>
         </w:numPr>
       </w:pPr>
       <w:r>
@@ -6371,7 +6434,7 @@
         <w:pStyle w:val="Compact"/>
         <w:numPr>
           <w:ilvl w:val="0"/>
-          <w:numId w:val="1004"/>
+          <w:numId w:val="1005"/>
         </w:numPr>
       </w:pPr>
       <w:r>
@@ -6828,7 +6891,7 @@
         <w:pStyle w:val="Compact"/>
         <w:numPr>
           <w:ilvl w:val="0"/>
-          <w:numId w:val="1005"/>
+          <w:numId w:val="1006"/>
         </w:numPr>
       </w:pPr>
       <w:r>
@@ -6843,7 +6906,7 @@
         <w:pStyle w:val="Compact"/>
         <w:numPr>
           <w:ilvl w:val="0"/>
-          <w:numId w:val="1005"/>
+          <w:numId w:val="1006"/>
         </w:numPr>
       </w:pPr>
       <w:r>
@@ -6858,7 +6921,7 @@
         <w:pStyle w:val="Compact"/>
         <w:numPr>
           <w:ilvl w:val="0"/>
-          <w:numId w:val="1005"/>
+          <w:numId w:val="1006"/>
         </w:numPr>
       </w:pPr>
       <w:r>
@@ -6873,7 +6936,7 @@
         <w:pStyle w:val="Compact"/>
         <w:numPr>
           <w:ilvl w:val="0"/>
-          <w:numId w:val="1005"/>
+          <w:numId w:val="1006"/>
         </w:numPr>
       </w:pPr>
       <w:r>
@@ -7230,9 +7293,6 @@
     </w:lvlOverride>
   </w:num>
   <w:num w:numId="1002">
-    <w:abstractNumId w:val="991"/>
-  </w:num>
-  <w:num w:numId="1003">
     <w:abstractNumId w:val="99411"/>
     <w:lvlOverride w:ilvl="0">
       <w:startOverride w:val="1"/>
@@ -7262,10 +7322,43 @@
       <w:startOverride w:val="1"/>
     </w:lvlOverride>
   </w:num>
-  <w:num w:numId="1004">
+  <w:num w:numId="1003">
     <w:abstractNumId w:val="991"/>
   </w:num>
+  <w:num w:numId="1004">
+    <w:abstractNumId w:val="99411"/>
+    <w:lvlOverride w:ilvl="0">
+      <w:startOverride w:val="1"/>
+    </w:lvlOverride>
+    <w:lvlOverride w:ilvl="1">
+      <w:startOverride w:val="1"/>
+    </w:lvlOverride>
+    <w:lvlOverride w:ilvl="2">
+      <w:startOverride w:val="1"/>
+    </w:lvlOverride>
+    <w:lvlOverride w:ilvl="3">
+      <w:startOverride w:val="1"/>
+    </w:lvlOverride>
+    <w:lvlOverride w:ilvl="4">
+      <w:startOverride w:val="1"/>
+    </w:lvlOverride>
+    <w:lvlOverride w:ilvl="5">
+      <w:startOverride w:val="1"/>
+    </w:lvlOverride>
+    <w:lvlOverride w:ilvl="6">
+      <w:startOverride w:val="1"/>
+    </w:lvlOverride>
+    <w:lvlOverride w:ilvl="7">
+      <w:startOverride w:val="1"/>
+    </w:lvlOverride>
+    <w:lvlOverride w:ilvl="8">
+      <w:startOverride w:val="1"/>
+    </w:lvlOverride>
+  </w:num>
   <w:num w:numId="1005">
+    <w:abstractNumId w:val="991"/>
+  </w:num>
+  <w:num w:numId="1006">
     <w:abstractNumId w:val="99411"/>
     <w:lvlOverride w:ilvl="0">
       <w:startOverride w:val="1"/>

</xml_diff>